<commit_message>
Volumes audit: star map, Three Doors intro, mud samples, 3 statblock upgrades
Co-Authored-By: Claude Opus 4.8 <noreply@anthropic.com>
</commit_message>
<xml_diff>
--- a/compendium/custom_compendium.docx
+++ b/compendium/custom_compendium.docx
@@ -230,6 +230,59 @@
           <w:sz w:val="21"/>
         </w:rPr>
         <w:t>8. Potent Spellcasting rides the kindled staff once per turn (Ursa, from level 7).</w:t>
+      </w:r>
+    </w:p>
+    <w:p>
+      <w:pPr>
+        <w:keepNext/>
+        <w:spacing w:before="400" w:after="120"/>
+        <w:pBdr>
+          <w:bottom w:val="single" w:sz="6" w:space="4" w:color="B8860B"/>
+        </w:pBdr>
+      </w:pPr>
+      <w:r>
+        <w:rPr>
+          <w:rFonts w:ascii="Georgia" w:hAnsi="Georgia" w:cs="Georgia"/>
+          <w:b/>
+          <w:color w:val="B8860B"/>
+          <w:sz w:val="32"/>
+        </w:rPr>
+        <w:t>The Three Doors</w:t>
+      </w:r>
+    </w:p>
+    <w:p>
+      <w:pPr>
+        <w:pBdr>
+          <w:left w:val="single" w:sz="18" w:space="12" w:color="B8860B"/>
+        </w:pBdr>
+        <w:shd w:val="clear" w:color="auto" w:fill="FBF6EA"/>
+        <w:spacing w:before="30" w:after="70"/>
+        <w:ind w:left="340" w:right="340"/>
+      </w:pPr>
+      <w:r>
+        <w:rPr>
+          <w:rFonts w:ascii="Georgia" w:hAnsi="Georgia" w:cs="Georgia"/>
+          <w:b w:val="0"/>
+          <w:i w:val="0"/>
+          <w:color w:val="222222"/>
+          <w:sz w:val="21"/>
+        </w:rPr>
+        <w:t>At the close of the Gearhaven chapter the Guardians parted for a year: a year of workshops and roads and night skies, each hero following their own heart home. Before each of them stand three doors, three ways that year apart might be spent, and behind every door waits a different gift.</w:t>
+      </w:r>
+    </w:p>
+    <w:p>
+      <w:pPr>
+        <w:spacing w:after="80"/>
+      </w:pPr>
+      <w:r>
+        <w:rPr>
+          <w:rFonts w:ascii="Georgia" w:hAnsi="Georgia" w:cs="Georgia"/>
+          <w:b w:val="0"/>
+          <w:i w:val="0"/>
+          <w:color w:val="222222"/>
+          <w:sz w:val="21"/>
+        </w:rPr>
+        <w:t>The chapters that follow set down what waits behind all nine: Stabby's three breathing styles, Ursa's three paths of the stars, and Lilly's three artifacts. Each Guardian will choose exactly one door, and none of the three has chosen yet. When they do, the doors not taken will remain in these pages, roads not walked, ready for other heroes in other tellings.</w:t>
       </w:r>
     </w:p>
     <w:p>

</xml_diff>

<commit_message>
Compendium complete: full path-reward texts (62 features) + S7-style bestiary
Part III now carries the complete rules wording from all three path
reward PDFs, verified word-for-word; merged volume rebuilt with the
restyled bestiary; 10_The_Compendium.pdf republished.

Co-Authored-By: Claude Opus 4.8 <noreply@anthropic.com>
</commit_message>
<xml_diff>
--- a/compendium/custom_compendium.docx
+++ b/compendium/custom_compendium.docx
@@ -305,6 +305,141 @@
     </w:p>
     <w:p>
       <w:pPr>
+        <w:spacing w:after="80"/>
+      </w:pPr>
+      <w:r>
+        <w:rPr>
+          <w:rFonts w:ascii="Georgia" w:hAnsi="Georgia" w:cs="Georgia"/>
+          <w:b w:val="0"/>
+          <w:i w:val="0"/>
+          <w:color w:val="222222"/>
+          <w:sz w:val="21"/>
+        </w:rPr>
+        <w:t xml:space="preserve">A homebrew monk subclass taken at level 7 in place of Kensei. A Warrior of Breathing kindles an inner style, a visible breath that wreathes the blade. Three doors, three breathing styles; every road grants the </w:t>
+      </w:r>
+      <w:r>
+        <w:rPr>
+          <w:rFonts w:ascii="Georgia" w:hAnsi="Georgia" w:cs="Georgia"/>
+          <w:b/>
+          <w:i w:val="0"/>
+          <w:color w:val="222222"/>
+          <w:sz w:val="21"/>
+        </w:rPr>
+        <w:t>Nichirin Katana</w:t>
+      </w:r>
+      <w:r>
+        <w:rPr>
+          <w:rFonts w:ascii="Georgia" w:hAnsi="Georgia" w:cs="Georgia"/>
+          <w:b w:val="0"/>
+          <w:i w:val="0"/>
+          <w:color w:val="222222"/>
+          <w:sz w:val="21"/>
+        </w:rPr>
+        <w:t>, and every First Form replaces Flurry of Blows. The full text of all three follows.</w:t>
+      </w:r>
+    </w:p>
+    <w:p>
+      <w:pPr>
+        <w:keepNext/>
+        <w:spacing w:before="220" w:after="60"/>
+      </w:pPr>
+      <w:r>
+        <w:rPr>
+          <w:rFonts w:ascii="Georgia" w:hAnsi="Georgia" w:cs="Georgia"/>
+          <w:b/>
+          <w:color w:val="A0522D"/>
+          <w:sz w:val="26"/>
+        </w:rPr>
+        <w:t>Beast Breathing: the Bloodfang Form</w:t>
+      </w:r>
+    </w:p>
+    <w:p>
+      <w:pPr>
+        <w:pBdr>
+          <w:left w:val="single" w:sz="18" w:space="12" w:color="B8860B"/>
+        </w:pBdr>
+        <w:shd w:val="clear" w:color="auto" w:fill="FBF6EA"/>
+        <w:spacing w:before="30" w:after="70"/>
+        <w:ind w:left="340" w:right="340"/>
+      </w:pPr>
+      <w:r>
+        <w:rPr>
+          <w:rFonts w:ascii="Georgia" w:hAnsi="Georgia" w:cs="Georgia"/>
+          <w:b w:val="0"/>
+          <w:i/>
+          <w:color w:val="222222"/>
+          <w:sz w:val="21"/>
+        </w:rPr>
+        <w:t>“You think too much, little storm. The beast does not think. The beast moves, and the beast is already behind you.”</w:t>
+      </w:r>
+      <w:r>
+        <w:rPr>
+          <w:rFonts w:ascii="Georgia" w:hAnsi="Georgia" w:cs="Georgia"/>
+          <w:b w:val="0"/>
+          <w:i w:val="0"/>
+          <w:color w:val="222222"/>
+          <w:sz w:val="21"/>
+        </w:rPr>
+        <w:t xml:space="preserve"> (the lesson Stabby finally understood)</w:t>
+      </w:r>
+    </w:p>
+    <w:p>
+      <w:pPr>
+        <w:spacing w:after="80"/>
+      </w:pPr>
+      <w:r>
+        <w:rPr>
+          <w:rFonts w:ascii="Georgia" w:hAnsi="Georgia" w:cs="Georgia"/>
+          <w:b w:val="0"/>
+          <w:i w:val="0"/>
+          <w:color w:val="222222"/>
+          <w:sz w:val="21"/>
+        </w:rPr>
+        <w:t>Some warriors learn to still the storm inside them. The Warrior of Beast Breathing learns to ride it. Where other monks seek calm, this form reaches into the wild, animal heart of the fighter: the part that does not hesitate, does not flinch, and does not stop. Practitioners breathe in time with a racing heartbeat rather than a slow one, and when they ignite their breath, their blade glows blood-red and their body moves with the loping, unstoppable grace of a hunting beast.</w:t>
+      </w:r>
+    </w:p>
+    <w:p>
+      <w:pPr>
+        <w:spacing w:after="80"/>
+      </w:pPr>
+      <w:r>
+        <w:rPr>
+          <w:rFonts w:ascii="Georgia" w:hAnsi="Georgia" w:cs="Georgia"/>
+          <w:b w:val="0"/>
+          <w:i w:val="0"/>
+          <w:color w:val="222222"/>
+          <w:sz w:val="21"/>
+        </w:rPr>
+        <w:t>It is a form born of survival rather than discipline, favored by those who grew up where the strong eat and the slow are eaten. To master it is not to tame the beast, but to become it on command, and to remember how to set it down again afterward.</w:t>
+      </w:r>
+    </w:p>
+    <w:p>
+      <w:pPr>
+        <w:spacing w:after="80"/>
+      </w:pPr>
+      <w:r>
+        <w:rPr>
+          <w:rFonts w:ascii="Georgia" w:hAnsi="Georgia" w:cs="Georgia"/>
+          <w:b/>
+          <w:i w:val="0"/>
+          <w:color w:val="222222"/>
+          <w:sz w:val="21"/>
+        </w:rPr>
+        <w:t>Features by monk level:</w:t>
+      </w:r>
+      <w:r>
+        <w:rPr>
+          <w:rFonts w:ascii="Georgia" w:hAnsi="Georgia" w:cs="Georgia"/>
+          <w:b w:val="0"/>
+          <w:i w:val="0"/>
+          <w:color w:val="222222"/>
+          <w:sz w:val="21"/>
+        </w:rPr>
+        <w:t xml:space="preserve"> 3rd, Beast Breathing; 6th, First Form: Devour; 11th, Advanced Beast Breathing; 17th, Third Form: Apex Predator.</w:t>
+      </w:r>
+    </w:p>
+    <w:p>
+      <w:pPr>
         <w:keepNext/>
         <w:spacing w:before="120" w:after="40"/>
         <w:jc w:val="center"/>
@@ -312,7 +447,7 @@
       <w:r>
         <w:drawing>
           <wp:inline xmlns:a="http://schemas.openxmlformats.org/drawingml/2006/main" xmlns:pic="http://schemas.openxmlformats.org/drawingml/2006/picture">
-            <wp:extent cx="3657600" cy="3657600"/>
+            <wp:extent cx="3291840" cy="3291840"/>
             <wp:docPr id="1" name="Picture 1"/>
             <wp:cNvGraphicFramePr>
               <a:graphicFrameLocks noChangeAspect="1"/>
@@ -333,7 +468,7 @@
                   <pic:spPr>
                     <a:xfrm>
                       <a:off x="0" y="0"/>
-                      <a:ext cx="3657600" cy="3657600"/>
+                      <a:ext cx="3291840" cy="3291840"/>
                     </a:xfrm>
                     <a:prstGeom prst="rect"/>
                   </pic:spPr>
@@ -356,23 +491,333 @@
           <w:color w:val="888888"/>
           <w:sz w:val="18"/>
         </w:rPr>
-        <w:t>Water Breathing: the flowing style.</w:t>
+        <w:t>Stabby, Bloodfang ignited.</w:t>
       </w:r>
     </w:p>
     <w:p>
       <w:pPr>
-        <w:spacing w:after="80"/>
-      </w:pPr>
+        <w:keepNext/>
+        <w:pBdr>
+          <w:left w:val="single" w:sz="18" w:space="12" w:color="8B2020"/>
+        </w:pBdr>
+        <w:shd w:val="clear" w:color="auto" w:fill="FCF6F6"/>
+        <w:spacing w:before="30" w:after="70"/>
+        <w:ind w:left="340" w:right="340"/>
+      </w:pPr>
+      <w:r>
+        <w:rPr>
+          <w:rFonts w:ascii="Georgia" w:hAnsi="Georgia" w:cs="Georgia"/>
+          <w:b/>
+          <w:color w:val="8B2020"/>
+          <w:sz w:val="22"/>
+        </w:rPr>
+        <w:t>Level 3: Beast Breathing</w:t>
+      </w:r>
+    </w:p>
+    <w:p>
+      <w:pPr>
+        <w:pBdr>
+          <w:left w:val="single" w:sz="18" w:space="12" w:color="8B2020"/>
+        </w:pBdr>
+        <w:shd w:val="clear" w:color="auto" w:fill="FCF6F6"/>
+        <w:spacing w:before="30" w:after="70"/>
+        <w:ind w:left="340" w:right="340"/>
+      </w:pPr>
+      <w:r>
+        <w:rPr>
+          <w:rFonts w:ascii="Georgia" w:hAnsi="Georgia" w:cs="Georgia"/>
+          <w:b/>
+          <w:i w:val="0"/>
+          <w:color w:val="222222"/>
+          <w:sz w:val="18"/>
+        </w:rPr>
+        <w:t>Monk Weapons.</w:t>
+      </w:r>
       <w:r>
         <w:rPr>
           <w:rFonts w:ascii="Georgia" w:hAnsi="Georgia" w:cs="Georgia"/>
           <w:b w:val="0"/>
           <w:i w:val="0"/>
           <w:color w:val="222222"/>
-          <w:sz w:val="21"/>
+          <w:sz w:val="18"/>
         </w:rPr>
-        <w:t xml:space="preserve">A homebrew monk subclass taken at level 7 in place of Kensei (full document: characters/path_rewards/warrior_of_breathing_v2.pdf). A Warrior of Breathing kindles an inner style, a visible breath that wreathes the blade. All roads grant the </w:t>
+        <w:t xml:space="preserve"> A katana (and any sword you take up as your signature blade) counts as a Monk weapon for you. You can use your Martial Arts die with it, make your Bonus Action Unarmed Strikes alongside it, and use this subclass's features through it.</w:t>
       </w:r>
+    </w:p>
+    <w:p>
+      <w:pPr>
+        <w:pBdr>
+          <w:left w:val="single" w:sz="18" w:space="12" w:color="8B2020"/>
+        </w:pBdr>
+        <w:shd w:val="clear" w:color="auto" w:fill="FCF6F6"/>
+        <w:spacing w:before="30" w:after="70"/>
+        <w:ind w:left="340" w:right="340"/>
+      </w:pPr>
+      <w:r>
+        <w:rPr>
+          <w:rFonts w:ascii="Georgia" w:hAnsi="Georgia" w:cs="Georgia"/>
+          <w:b/>
+          <w:i w:val="0"/>
+          <w:color w:val="222222"/>
+          <w:sz w:val="18"/>
+        </w:rPr>
+        <w:t>Beast Sense.</w:t>
+      </w:r>
+      <w:r>
+        <w:rPr>
+          <w:rFonts w:ascii="Georgia" w:hAnsi="Georgia" w:cs="Georgia"/>
+          <w:b w:val="0"/>
+          <w:i w:val="0"/>
+          <w:color w:val="222222"/>
+          <w:sz w:val="18"/>
+        </w:rPr>
+        <w:t xml:space="preserve"> Your senses are sharp as a hunting animal's, even out of combat. You have Advantage on Wisdom (Survival) checks made to track creatures, on Wisdom (Perception) checks that rely on smell or hearing, and on Charisma (Intimidation) checks.</w:t>
+      </w:r>
+    </w:p>
+    <w:p>
+      <w:pPr>
+        <w:pBdr>
+          <w:left w:val="single" w:sz="18" w:space="12" w:color="8B2020"/>
+        </w:pBdr>
+        <w:shd w:val="clear" w:color="auto" w:fill="FCF6F6"/>
+        <w:spacing w:before="30" w:after="70"/>
+        <w:ind w:left="340" w:right="340"/>
+      </w:pPr>
+      <w:r>
+        <w:rPr>
+          <w:rFonts w:ascii="Georgia" w:hAnsi="Georgia" w:cs="Georgia"/>
+          <w:b/>
+          <w:i w:val="0"/>
+          <w:color w:val="222222"/>
+          <w:sz w:val="18"/>
+        </w:rPr>
+        <w:t>Igniting the Breath.</w:t>
+      </w:r>
+      <w:r>
+        <w:rPr>
+          <w:rFonts w:ascii="Georgia" w:hAnsi="Georgia" w:cs="Georgia"/>
+          <w:b w:val="0"/>
+          <w:i w:val="0"/>
+          <w:color w:val="222222"/>
+          <w:sz w:val="18"/>
+        </w:rPr>
+        <w:t xml:space="preserve"> When you roll Initiative, you can expend 1 Focus Point to ignite your breath for the rest of the combat. It lasts until the combat ends, you have the Incapacitated condition, or you end it (no action required). While your breath is ignited, your weapon glows blood-red and deals an extra 2 Force damage on every hit.</w:t>
+      </w:r>
+    </w:p>
+    <w:p>
+      <w:pPr>
+        <w:pBdr>
+          <w:left w:val="single" w:sz="18" w:space="12" w:color="8B2020"/>
+        </w:pBdr>
+        <w:shd w:val="clear" w:color="auto" w:fill="FCF6F6"/>
+        <w:spacing w:before="30" w:after="70"/>
+        <w:ind w:left="340" w:right="340"/>
+      </w:pPr>
+      <w:r>
+        <w:rPr>
+          <w:rFonts w:ascii="Georgia" w:hAnsi="Georgia" w:cs="Georgia"/>
+          <w:b/>
+          <w:i w:val="0"/>
+          <w:color w:val="222222"/>
+          <w:sz w:val="18"/>
+        </w:rPr>
+        <w:t>Beast's Vigor.</w:t>
+      </w:r>
+      <w:r>
+        <w:rPr>
+          <w:rFonts w:ascii="Georgia" w:hAnsi="Georgia" w:cs="Georgia"/>
+          <w:b w:val="0"/>
+          <w:i w:val="0"/>
+          <w:color w:val="222222"/>
+          <w:sz w:val="18"/>
+        </w:rPr>
+        <w:t xml:space="preserve"> While your breath is ignited, your Speed increases by 10 feet and you have Advantage on Dexterity saving throws: the wild reflexes of a cornered animal.</w:t>
+      </w:r>
+    </w:p>
+    <w:p>
+      <w:pPr>
+        <w:keepNext/>
+        <w:pBdr>
+          <w:left w:val="single" w:sz="18" w:space="12" w:color="8B2020"/>
+        </w:pBdr>
+        <w:shd w:val="clear" w:color="auto" w:fill="FCF6F6"/>
+        <w:spacing w:before="30" w:after="70"/>
+        <w:ind w:left="340" w:right="340"/>
+      </w:pPr>
+      <w:r>
+        <w:rPr>
+          <w:rFonts w:ascii="Georgia" w:hAnsi="Georgia" w:cs="Georgia"/>
+          <w:b/>
+          <w:color w:val="8B2020"/>
+          <w:sz w:val="22"/>
+        </w:rPr>
+        <w:t>Level 6: First Form: Devour</w:t>
+      </w:r>
+    </w:p>
+    <w:p>
+      <w:pPr>
+        <w:pBdr>
+          <w:left w:val="single" w:sz="18" w:space="12" w:color="8B2020"/>
+        </w:pBdr>
+        <w:shd w:val="clear" w:color="auto" w:fill="FCF6F6"/>
+        <w:spacing w:before="30" w:after="70"/>
+        <w:ind w:left="340" w:right="340"/>
+      </w:pPr>
+      <w:r>
+        <w:rPr>
+          <w:rFonts w:ascii="Georgia" w:hAnsi="Georgia" w:cs="Georgia"/>
+          <w:b/>
+          <w:i w:val="0"/>
+          <w:color w:val="222222"/>
+          <w:sz w:val="18"/>
+        </w:rPr>
+        <w:t>First Form: Devour.</w:t>
+      </w:r>
+      <w:r>
+        <w:rPr>
+          <w:rFonts w:ascii="Georgia" w:hAnsi="Georgia" w:cs="Georgia"/>
+          <w:b w:val="0"/>
+          <w:i w:val="0"/>
+          <w:color w:val="222222"/>
+          <w:sz w:val="18"/>
+        </w:rPr>
+        <w:t xml:space="preserve"> As a Bonus Action, you can expend 1 Focus Point to move up to 15 feet without provoking Opportunity Attacks and make one attack with your Monk weapon. On a hit, the attack deals 3d8 plus your Dexterity modifier Force damage. If this attack reduces the target to 0 Hit Points, you regain the expended Focus Point. This feature replaces Flurry of Blows for you.</w:t>
+      </w:r>
+    </w:p>
+    <w:p>
+      <w:pPr>
+        <w:keepNext/>
+        <w:pBdr>
+          <w:left w:val="single" w:sz="18" w:space="12" w:color="8B2020"/>
+        </w:pBdr>
+        <w:shd w:val="clear" w:color="auto" w:fill="FCF6F6"/>
+        <w:spacing w:before="30" w:after="70"/>
+        <w:ind w:left="340" w:right="340"/>
+      </w:pPr>
+      <w:r>
+        <w:rPr>
+          <w:rFonts w:ascii="Georgia" w:hAnsi="Georgia" w:cs="Georgia"/>
+          <w:b/>
+          <w:color w:val="8B2020"/>
+          <w:sz w:val="22"/>
+        </w:rPr>
+        <w:t>Level 11: Advanced Beast Breathing</w:t>
+      </w:r>
+    </w:p>
+    <w:p>
+      <w:pPr>
+        <w:pBdr>
+          <w:left w:val="single" w:sz="18" w:space="12" w:color="8B2020"/>
+        </w:pBdr>
+        <w:shd w:val="clear" w:color="auto" w:fill="FCF6F6"/>
+        <w:spacing w:before="30" w:after="70"/>
+        <w:ind w:left="340" w:right="340"/>
+      </w:pPr>
+      <w:r>
+        <w:rPr>
+          <w:rFonts w:ascii="Georgia" w:hAnsi="Georgia" w:cs="Georgia"/>
+          <w:b/>
+          <w:i w:val="0"/>
+          <w:color w:val="222222"/>
+          <w:sz w:val="18"/>
+        </w:rPr>
+        <w:t>Advanced Breathing.</w:t>
+      </w:r>
+      <w:r>
+        <w:rPr>
+          <w:rFonts w:ascii="Georgia" w:hAnsi="Georgia" w:cs="Georgia"/>
+          <w:b w:val="0"/>
+          <w:i w:val="0"/>
+          <w:color w:val="222222"/>
+          <w:sz w:val="18"/>
+        </w:rPr>
+        <w:t xml:space="preserve"> Your ignited breath grows fiercer. While it is active you gain all its original benefits, and you also have Resistance to Bludgeoning, Piercing, and Slashing damage. In addition, your weapon's bonus damage increases from 2 to 3.</w:t>
+      </w:r>
+    </w:p>
+    <w:p>
+      <w:pPr>
+        <w:pBdr>
+          <w:left w:val="single" w:sz="18" w:space="12" w:color="8B2020"/>
+        </w:pBdr>
+        <w:shd w:val="clear" w:color="auto" w:fill="FCF6F6"/>
+        <w:spacing w:before="30" w:after="70"/>
+        <w:ind w:left="340" w:right="340"/>
+      </w:pPr>
+      <w:r>
+        <w:rPr>
+          <w:rFonts w:ascii="Georgia" w:hAnsi="Georgia" w:cs="Georgia"/>
+          <w:b/>
+          <w:i w:val="0"/>
+          <w:color w:val="222222"/>
+          <w:sz w:val="18"/>
+        </w:rPr>
+        <w:t>Sharpened Fang.</w:t>
+      </w:r>
+      <w:r>
+        <w:rPr>
+          <w:rFonts w:ascii="Georgia" w:hAnsi="Georgia" w:cs="Georgia"/>
+          <w:b w:val="0"/>
+          <w:i w:val="0"/>
+          <w:color w:val="222222"/>
+          <w:sz w:val="18"/>
+        </w:rPr>
+        <w:t xml:space="preserve"> The damage of your First Form: Devour increases to 5d10 plus your Dexterity modifier.</w:t>
+      </w:r>
+    </w:p>
+    <w:p>
+      <w:pPr>
+        <w:keepNext/>
+        <w:pBdr>
+          <w:left w:val="single" w:sz="18" w:space="12" w:color="8B2020"/>
+        </w:pBdr>
+        <w:shd w:val="clear" w:color="auto" w:fill="FCF6F6"/>
+        <w:spacing w:before="30" w:after="70"/>
+        <w:ind w:left="340" w:right="340"/>
+      </w:pPr>
+      <w:r>
+        <w:rPr>
+          <w:rFonts w:ascii="Georgia" w:hAnsi="Georgia" w:cs="Georgia"/>
+          <w:b/>
+          <w:color w:val="8B2020"/>
+          <w:sz w:val="22"/>
+        </w:rPr>
+        <w:t>Level 17: Third Form: Apex Predator</w:t>
+      </w:r>
+    </w:p>
+    <w:p>
+      <w:pPr>
+        <w:pBdr>
+          <w:left w:val="single" w:sz="18" w:space="12" w:color="8B2020"/>
+        </w:pBdr>
+        <w:shd w:val="clear" w:color="auto" w:fill="FCF6F6"/>
+        <w:spacing w:before="30" w:after="70"/>
+        <w:ind w:left="340" w:right="340"/>
+      </w:pPr>
+      <w:r>
+        <w:rPr>
+          <w:rFonts w:ascii="Georgia" w:hAnsi="Georgia" w:cs="Georgia"/>
+          <w:b/>
+          <w:i w:val="0"/>
+          <w:color w:val="222222"/>
+          <w:sz w:val="18"/>
+        </w:rPr>
+        <w:t>Third Form: Apex Predator.</w:t>
+      </w:r>
+      <w:r>
+        <w:rPr>
+          <w:rFonts w:ascii="Georgia" w:hAnsi="Georgia" w:cs="Georgia"/>
+          <w:b w:val="0"/>
+          <w:i w:val="0"/>
+          <w:color w:val="222222"/>
+          <w:sz w:val="18"/>
+        </w:rPr>
+        <w:t xml:space="preserve"> As a Bonus Action, you can expend 3 Focus Points to become a blur of fang and steel. Move up to your Speed without provoking Opportunity Attacks and make one attack with your Monk weapon against each of up to three different creatures you move within reach of. Each attack deals 5d10 plus your Dexterity modifier Force damage on a hit, and each creature hit must succeed on a Strength saving throw or have the Prone condition. For each creature reduced to 0 Hit Points, you regain 1 expended Focus Point.</w:t>
+      </w:r>
+    </w:p>
+    <w:p>
+      <w:pPr>
+        <w:spacing w:after="80"/>
+      </w:pPr>
       <w:r>
         <w:rPr>
           <w:rFonts w:ascii="Georgia" w:hAnsi="Georgia" w:cs="Georgia"/>
@@ -381,7 +826,7 @@
           <w:color w:val="222222"/>
           <w:sz w:val="21"/>
         </w:rPr>
-        <w:t>Nichirin Katana</w:t>
+        <w:t>At Level 7, Stabby has:</w:t>
       </w:r>
       <w:r>
         <w:rPr>
@@ -391,22 +836,42 @@
           <w:color w:val="222222"/>
           <w:sz w:val="21"/>
         </w:rPr>
-        <w:t xml:space="preserve"> (+2, finesse, monk weapon, glows when breath is kindled, Cleansing Edge against corrupted creatures), and the First Form replaces Flurry of Blows.</w:t>
+        <w:t xml:space="preserve"> Beast Breathing (the Level 3 stance) + First Form: Devour (Level 6, 3d8 + Dex). The Level 11 and 17 features unlock as he grows.</w:t>
       </w:r>
     </w:p>
     <w:p>
       <w:pPr>
-        <w:spacing w:after="80"/>
+        <w:keepNext/>
+        <w:spacing w:before="220" w:after="60"/>
       </w:pPr>
       <w:r>
         <w:rPr>
           <w:rFonts w:ascii="Georgia" w:hAnsi="Georgia" w:cs="Georgia"/>
           <w:b/>
-          <w:i w:val="0"/>
+          <w:color w:val="A0522D"/>
+          <w:sz w:val="26"/>
+        </w:rPr>
+        <w:t>Water Breathing: the Monastery Form</w:t>
+      </w:r>
+    </w:p>
+    <w:p>
+      <w:pPr>
+        <w:pBdr>
+          <w:left w:val="single" w:sz="18" w:space="12" w:color="B8860B"/>
+        </w:pBdr>
+        <w:shd w:val="clear" w:color="auto" w:fill="FBF6EA"/>
+        <w:spacing w:before="30" w:after="70"/>
+        <w:ind w:left="340" w:right="340"/>
+      </w:pPr>
+      <w:r>
+        <w:rPr>
+          <w:rFonts w:ascii="Georgia" w:hAnsi="Georgia" w:cs="Georgia"/>
+          <w:b w:val="0"/>
+          <w:i/>
           <w:color w:val="222222"/>
           <w:sz w:val="21"/>
         </w:rPr>
-        <w:t>Water Breathing</w:t>
+        <w:t>“Be water. Water does not strike; it flows, and the rock is cut all the same. Now breathe, and begin again.”</w:t>
       </w:r>
       <w:r>
         <w:rPr>
@@ -416,7 +881,37 @@
           <w:color w:val="222222"/>
           <w:sz w:val="21"/>
         </w:rPr>
-        <w:t xml:space="preserve"> (the Whispering Breeze Monastery road): pale blue breath, +2 cold damage, Flowing Guard (+2 AC against the first attack each round), First Form: Flowing Strike (3d8 + Dex cold, knocks prone).</w:t>
+        <w:t xml:space="preserve"> (Master Kaelon Windstep)</w:t>
+      </w:r>
+    </w:p>
+    <w:p>
+      <w:pPr>
+        <w:spacing w:after="80"/>
+      </w:pPr>
+      <w:r>
+        <w:rPr>
+          <w:rFonts w:ascii="Georgia" w:hAnsi="Georgia" w:cs="Georgia"/>
+          <w:b w:val="0"/>
+          <w:i w:val="0"/>
+          <w:color w:val="222222"/>
+          <w:sz w:val="21"/>
+        </w:rPr>
+        <w:t>The Warrior of Water Breathing is the form of the patient master, the discipline that other monks spend their whole lives chasing. Its practitioners learn to move like a river: never rigid, never still, every strike flowing into the next, every blow turned aside by giving way rather than resisting. When they ignite their breath, their blade runs pale blue and cold, and their guard becomes as fluid and unbroken as a current that cannot be grasped.</w:t>
+      </w:r>
+    </w:p>
+    <w:p>
+      <w:pPr>
+        <w:spacing w:after="80"/>
+      </w:pPr>
+      <w:r>
+        <w:rPr>
+          <w:rFonts w:ascii="Georgia" w:hAnsi="Georgia" w:cs="Georgia"/>
+          <w:b w:val="0"/>
+          <w:i w:val="0"/>
+          <w:color w:val="222222"/>
+          <w:sz w:val="21"/>
+        </w:rPr>
+        <w:t>It is the most traditional of the breathing forms, and the hardest to truly master, for it asks the warrior to be calm in the middle of chaos. Those who walk this path are as often menders as fighters, for the same stillness that turns a blade can also close a wound, and the same patience that wins a duel can sit a long vigil at a friend's side.</w:t>
       </w:r>
     </w:p>
     <w:p>
@@ -431,7 +926,7 @@
           <w:color w:val="222222"/>
           <w:sz w:val="21"/>
         </w:rPr>
-        <w:t>Beast Breathing</w:t>
+        <w:t>Features by monk level:</w:t>
       </w:r>
       <w:r>
         <w:rPr>
@@ -441,7 +936,7 @@
           <w:color w:val="222222"/>
           <w:sz w:val="21"/>
         </w:rPr>
-        <w:t xml:space="preserve"> (the reform-the-Bloodfang road): blood-red breath, +2 force damage, Beast Sense, advantage on Dexterity saves and +10 speed while ignited, First Form: Devour (3d8 + Dex force; a felling blow refunds the Focus).</w:t>
+        <w:t xml:space="preserve"> 3rd, Water Breathing; 6th, First Form: Flowing Strike; 11th, Advanced Water Breathing and Healing Spring; 17th, Third Form: Tidal Crash.</w:t>
       </w:r>
     </w:p>
     <w:p>
@@ -497,7 +992,327 @@
           <w:color w:val="888888"/>
           <w:sz w:val="18"/>
         </w:rPr>
-        <w:t>Beast Breathing: the blood-red style.</w:t>
+        <w:t>Stabby, the Flowing Guard.</w:t>
+      </w:r>
+    </w:p>
+    <w:p>
+      <w:pPr>
+        <w:keepNext/>
+        <w:pBdr>
+          <w:left w:val="single" w:sz="18" w:space="12" w:color="8B2020"/>
+        </w:pBdr>
+        <w:shd w:val="clear" w:color="auto" w:fill="FCF6F6"/>
+        <w:spacing w:before="30" w:after="70"/>
+        <w:ind w:left="340" w:right="340"/>
+      </w:pPr>
+      <w:r>
+        <w:rPr>
+          <w:rFonts w:ascii="Georgia" w:hAnsi="Georgia" w:cs="Georgia"/>
+          <w:b/>
+          <w:color w:val="8B2020"/>
+          <w:sz w:val="22"/>
+        </w:rPr>
+        <w:t>Level 3: Water Breathing</w:t>
+      </w:r>
+    </w:p>
+    <w:p>
+      <w:pPr>
+        <w:pBdr>
+          <w:left w:val="single" w:sz="18" w:space="12" w:color="8B2020"/>
+        </w:pBdr>
+        <w:shd w:val="clear" w:color="auto" w:fill="FCF6F6"/>
+        <w:spacing w:before="30" w:after="70"/>
+        <w:ind w:left="340" w:right="340"/>
+      </w:pPr>
+      <w:r>
+        <w:rPr>
+          <w:rFonts w:ascii="Georgia" w:hAnsi="Georgia" w:cs="Georgia"/>
+          <w:b/>
+          <w:i w:val="0"/>
+          <w:color w:val="222222"/>
+          <w:sz w:val="18"/>
+        </w:rPr>
+        <w:t>Monk Weapons.</w:t>
+      </w:r>
+      <w:r>
+        <w:rPr>
+          <w:rFonts w:ascii="Georgia" w:hAnsi="Georgia" w:cs="Georgia"/>
+          <w:b w:val="0"/>
+          <w:i w:val="0"/>
+          <w:color w:val="222222"/>
+          <w:sz w:val="18"/>
+        </w:rPr>
+        <w:t xml:space="preserve"> A katana (and any sword you take up as your signature blade) counts as a Monk weapon for you. You can use your Martial Arts die with it, make your Bonus Action Unarmed Strikes alongside it, and use this subclass's features through it.</w:t>
+      </w:r>
+    </w:p>
+    <w:p>
+      <w:pPr>
+        <w:pBdr>
+          <w:left w:val="single" w:sz="18" w:space="12" w:color="8B2020"/>
+        </w:pBdr>
+        <w:shd w:val="clear" w:color="auto" w:fill="FCF6F6"/>
+        <w:spacing w:before="30" w:after="70"/>
+        <w:ind w:left="340" w:right="340"/>
+      </w:pPr>
+      <w:r>
+        <w:rPr>
+          <w:rFonts w:ascii="Georgia" w:hAnsi="Georgia" w:cs="Georgia"/>
+          <w:b/>
+          <w:i w:val="0"/>
+          <w:color w:val="222222"/>
+          <w:sz w:val="18"/>
+        </w:rPr>
+        <w:t>Igniting the Breath.</w:t>
+      </w:r>
+      <w:r>
+        <w:rPr>
+          <w:rFonts w:ascii="Georgia" w:hAnsi="Georgia" w:cs="Georgia"/>
+          <w:b w:val="0"/>
+          <w:i w:val="0"/>
+          <w:color w:val="222222"/>
+          <w:sz w:val="18"/>
+        </w:rPr>
+        <w:t xml:space="preserve"> When you roll Initiative, you can expend 1 Focus Point to ignite your breath for the rest of the combat. It lasts until the combat ends, you have the Incapacitated condition, or you end it (no action required). While your breath is ignited, your weapon glows pale blue and deals an extra 2 Cold damage on every hit.</w:t>
+      </w:r>
+    </w:p>
+    <w:p>
+      <w:pPr>
+        <w:pBdr>
+          <w:left w:val="single" w:sz="18" w:space="12" w:color="8B2020"/>
+        </w:pBdr>
+        <w:shd w:val="clear" w:color="auto" w:fill="FCF6F6"/>
+        <w:spacing w:before="30" w:after="70"/>
+        <w:ind w:left="340" w:right="340"/>
+      </w:pPr>
+      <w:r>
+        <w:rPr>
+          <w:rFonts w:ascii="Georgia" w:hAnsi="Georgia" w:cs="Georgia"/>
+          <w:b/>
+          <w:i w:val="0"/>
+          <w:color w:val="222222"/>
+          <w:sz w:val="18"/>
+        </w:rPr>
+        <w:t>Flowing Guard.</w:t>
+      </w:r>
+      <w:r>
+        <w:rPr>
+          <w:rFonts w:ascii="Georgia" w:hAnsi="Georgia" w:cs="Georgia"/>
+          <w:b w:val="0"/>
+          <w:i w:val="0"/>
+          <w:color w:val="222222"/>
+          <w:sz w:val="18"/>
+        </w:rPr>
+        <w:t xml:space="preserve"> While your breath is ignited, you gain a +2 bonus to Armor Class against the first attack roll made against you before the start of each of your turns: an ever-moving guard that turns the first blow aside.</w:t>
+      </w:r>
+    </w:p>
+    <w:p>
+      <w:pPr>
+        <w:keepNext/>
+        <w:pBdr>
+          <w:left w:val="single" w:sz="18" w:space="12" w:color="8B2020"/>
+        </w:pBdr>
+        <w:shd w:val="clear" w:color="auto" w:fill="FCF6F6"/>
+        <w:spacing w:before="30" w:after="70"/>
+        <w:ind w:left="340" w:right="340"/>
+      </w:pPr>
+      <w:r>
+        <w:rPr>
+          <w:rFonts w:ascii="Georgia" w:hAnsi="Georgia" w:cs="Georgia"/>
+          <w:b/>
+          <w:color w:val="8B2020"/>
+          <w:sz w:val="22"/>
+        </w:rPr>
+        <w:t>Level 6: First Form: Flowing Strike</w:t>
+      </w:r>
+    </w:p>
+    <w:p>
+      <w:pPr>
+        <w:pBdr>
+          <w:left w:val="single" w:sz="18" w:space="12" w:color="8B2020"/>
+        </w:pBdr>
+        <w:shd w:val="clear" w:color="auto" w:fill="FCF6F6"/>
+        <w:spacing w:before="30" w:after="70"/>
+        <w:ind w:left="340" w:right="340"/>
+      </w:pPr>
+      <w:r>
+        <w:rPr>
+          <w:rFonts w:ascii="Georgia" w:hAnsi="Georgia" w:cs="Georgia"/>
+          <w:b/>
+          <w:i w:val="0"/>
+          <w:color w:val="222222"/>
+          <w:sz w:val="18"/>
+        </w:rPr>
+        <w:t>First Form: Flowing Strike.</w:t>
+      </w:r>
+      <w:r>
+        <w:rPr>
+          <w:rFonts w:ascii="Georgia" w:hAnsi="Georgia" w:cs="Georgia"/>
+          <w:b w:val="0"/>
+          <w:i w:val="0"/>
+          <w:color w:val="222222"/>
+          <w:sz w:val="18"/>
+        </w:rPr>
+        <w:t xml:space="preserve"> As a Bonus Action, you can expend 1 Focus Point to shift up to 15 feet without provoking Opportunity Attacks and make one attack with your Monk weapon. On a hit, the attack deals 3d8 plus your Dexterity modifier Cold damage, and the target must succeed on a Dexterity saving throw or have the Prone condition as the current sweeps its feet. This feature replaces Flurry of Blows for you.</w:t>
+      </w:r>
+    </w:p>
+    <w:p>
+      <w:pPr>
+        <w:keepNext/>
+        <w:pBdr>
+          <w:left w:val="single" w:sz="18" w:space="12" w:color="8B2020"/>
+        </w:pBdr>
+        <w:shd w:val="clear" w:color="auto" w:fill="FCF6F6"/>
+        <w:spacing w:before="30" w:after="70"/>
+        <w:ind w:left="340" w:right="340"/>
+      </w:pPr>
+      <w:r>
+        <w:rPr>
+          <w:rFonts w:ascii="Georgia" w:hAnsi="Georgia" w:cs="Georgia"/>
+          <w:b/>
+          <w:color w:val="8B2020"/>
+          <w:sz w:val="22"/>
+        </w:rPr>
+        <w:t>Level 11: Advanced Water Breathing</w:t>
+      </w:r>
+    </w:p>
+    <w:p>
+      <w:pPr>
+        <w:pBdr>
+          <w:left w:val="single" w:sz="18" w:space="12" w:color="8B2020"/>
+        </w:pBdr>
+        <w:shd w:val="clear" w:color="auto" w:fill="FCF6F6"/>
+        <w:spacing w:before="30" w:after="70"/>
+        <w:ind w:left="340" w:right="340"/>
+      </w:pPr>
+      <w:r>
+        <w:rPr>
+          <w:rFonts w:ascii="Georgia" w:hAnsi="Georgia" w:cs="Georgia"/>
+          <w:b/>
+          <w:i w:val="0"/>
+          <w:color w:val="222222"/>
+          <w:sz w:val="18"/>
+        </w:rPr>
+        <w:t>Advanced Breathing.</w:t>
+      </w:r>
+      <w:r>
+        <w:rPr>
+          <w:rFonts w:ascii="Georgia" w:hAnsi="Georgia" w:cs="Georgia"/>
+          <w:b w:val="0"/>
+          <w:i w:val="0"/>
+          <w:color w:val="222222"/>
+          <w:sz w:val="18"/>
+        </w:rPr>
+        <w:t xml:space="preserve"> Your ignited breath deepens. While it is active you gain all its original benefits, and also: whenever you hit a creature with your Monk weapon, that creature's Speed is reduced by 10 feet until the start of your next turn as the cold seeps into its limbs.</w:t>
+      </w:r>
+    </w:p>
+    <w:p>
+      <w:pPr>
+        <w:pBdr>
+          <w:left w:val="single" w:sz="18" w:space="12" w:color="8B2020"/>
+        </w:pBdr>
+        <w:shd w:val="clear" w:color="auto" w:fill="FCF6F6"/>
+        <w:spacing w:before="30" w:after="70"/>
+        <w:ind w:left="340" w:right="340"/>
+      </w:pPr>
+      <w:r>
+        <w:rPr>
+          <w:rFonts w:ascii="Georgia" w:hAnsi="Georgia" w:cs="Georgia"/>
+          <w:b/>
+          <w:i w:val="0"/>
+          <w:color w:val="222222"/>
+          <w:sz w:val="18"/>
+        </w:rPr>
+        <w:t>Sharpened Flow.</w:t>
+      </w:r>
+      <w:r>
+        <w:rPr>
+          <w:rFonts w:ascii="Georgia" w:hAnsi="Georgia" w:cs="Georgia"/>
+          <w:b w:val="0"/>
+          <w:i w:val="0"/>
+          <w:color w:val="222222"/>
+          <w:sz w:val="18"/>
+        </w:rPr>
+        <w:t xml:space="preserve"> The damage of your First Form: Flowing Strike increases to 5d10 plus your Dexterity modifier.</w:t>
+      </w:r>
+    </w:p>
+    <w:p>
+      <w:pPr>
+        <w:pBdr>
+          <w:left w:val="single" w:sz="18" w:space="12" w:color="8B2020"/>
+        </w:pBdr>
+        <w:shd w:val="clear" w:color="auto" w:fill="FCF6F6"/>
+        <w:spacing w:before="30" w:after="70"/>
+        <w:ind w:left="340" w:right="340"/>
+      </w:pPr>
+      <w:r>
+        <w:rPr>
+          <w:rFonts w:ascii="Georgia" w:hAnsi="Georgia" w:cs="Georgia"/>
+          <w:b/>
+          <w:i w:val="0"/>
+          <w:color w:val="222222"/>
+          <w:sz w:val="18"/>
+        </w:rPr>
+        <w:t>Healing Spring.</w:t>
+      </w:r>
+      <w:r>
+        <w:rPr>
+          <w:rFonts w:ascii="Georgia" w:hAnsi="Georgia" w:cs="Georgia"/>
+          <w:b w:val="0"/>
+          <w:i w:val="0"/>
+          <w:color w:val="222222"/>
+          <w:sz w:val="18"/>
+        </w:rPr>
+        <w:t xml:space="preserve"> Once per Long Rest, you can take a Bonus Action to touch a creature (or yourself) and channel the still water's mending. The target regains 4d8 plus your Wisdom modifier Hit Points.</w:t>
+      </w:r>
+    </w:p>
+    <w:p>
+      <w:pPr>
+        <w:keepNext/>
+        <w:pBdr>
+          <w:left w:val="single" w:sz="18" w:space="12" w:color="8B2020"/>
+        </w:pBdr>
+        <w:shd w:val="clear" w:color="auto" w:fill="FCF6F6"/>
+        <w:spacing w:before="30" w:after="70"/>
+        <w:ind w:left="340" w:right="340"/>
+      </w:pPr>
+      <w:r>
+        <w:rPr>
+          <w:rFonts w:ascii="Georgia" w:hAnsi="Georgia" w:cs="Georgia"/>
+          <w:b/>
+          <w:color w:val="8B2020"/>
+          <w:sz w:val="22"/>
+        </w:rPr>
+        <w:t>Level 17: Third Form: Tidal Crash</w:t>
+      </w:r>
+    </w:p>
+    <w:p>
+      <w:pPr>
+        <w:pBdr>
+          <w:left w:val="single" w:sz="18" w:space="12" w:color="8B2020"/>
+        </w:pBdr>
+        <w:shd w:val="clear" w:color="auto" w:fill="FCF6F6"/>
+        <w:spacing w:before="30" w:after="70"/>
+        <w:ind w:left="340" w:right="340"/>
+      </w:pPr>
+      <w:r>
+        <w:rPr>
+          <w:rFonts w:ascii="Georgia" w:hAnsi="Georgia" w:cs="Georgia"/>
+          <w:b/>
+          <w:i w:val="0"/>
+          <w:color w:val="222222"/>
+          <w:sz w:val="18"/>
+        </w:rPr>
+        <w:t>Third Form: Tidal Crash.</w:t>
+      </w:r>
+      <w:r>
+        <w:rPr>
+          <w:rFonts w:ascii="Georgia" w:hAnsi="Georgia" w:cs="Georgia"/>
+          <w:b w:val="0"/>
+          <w:i w:val="0"/>
+          <w:color w:val="222222"/>
+          <w:sz w:val="18"/>
+        </w:rPr>
+        <w:t xml:space="preserve"> As a Bonus Action, you can expend 3 Focus Points to shift up to 20 feet and make one attack with your Monk weapon against each of up to three different creatures within your reach as you flow among them. Each attack deals 5d10 plus your Dexterity modifier Cold damage on a hit, and each creature hit must succeed on a Dexterity saving throw or have the Prone condition and its Speed becomes 0 until the end of its next turn, frozen in place by the flood.</w:t>
       </w:r>
     </w:p>
     <w:p>
@@ -512,7 +1327,7 @@
           <w:color w:val="222222"/>
           <w:sz w:val="21"/>
         </w:rPr>
-        <w:t>Shadow Breathing</w:t>
+        <w:t>At Level 7, Stabby has:</w:t>
       </w:r>
       <w:r>
         <w:rPr>
@@ -522,7 +1337,107 @@
           <w:color w:val="222222"/>
           <w:sz w:val="21"/>
         </w:rPr>
-        <w:t xml:space="preserve"> (the Idol's Dreams road): violet-black breath, +2 necrotic damage, permanent darkvision 60 ft. and Stealth advantage, half cover against ranged attacks while ignited, First Form: Umbral Slash (teleport, a cube of darkness, 3d8 + Dex necrotic with advantage).</w:t>
+        <w:t xml:space="preserve"> Water Breathing (the Level 3 stance) + First Form: Flowing Strike (Level 6, 3d8 + Dex). The Level 11 and 17 features unlock as he grows.</w:t>
+      </w:r>
+    </w:p>
+    <w:p>
+      <w:pPr>
+        <w:keepNext/>
+        <w:spacing w:before="220" w:after="60"/>
+      </w:pPr>
+      <w:r>
+        <w:rPr>
+          <w:rFonts w:ascii="Georgia" w:hAnsi="Georgia" w:cs="Georgia"/>
+          <w:b/>
+          <w:color w:val="A0522D"/>
+          <w:sz w:val="26"/>
+        </w:rPr>
+        <w:t>Shadow Breathing: the Idol Form</w:t>
+      </w:r>
+    </w:p>
+    <w:p>
+      <w:pPr>
+        <w:pBdr>
+          <w:left w:val="single" w:sz="18" w:space="12" w:color="B8860B"/>
+        </w:pBdr>
+        <w:shd w:val="clear" w:color="auto" w:fill="FBF6EA"/>
+        <w:spacing w:before="30" w:after="70"/>
+        <w:ind w:left="340" w:right="340"/>
+      </w:pPr>
+      <w:r>
+        <w:rPr>
+          <w:rFonts w:ascii="Georgia" w:hAnsi="Georgia" w:cs="Georgia"/>
+          <w:b w:val="0"/>
+          <w:i/>
+          <w:color w:val="222222"/>
+          <w:sz w:val="21"/>
+        </w:rPr>
+        <w:t>“Do not fear the dark. Breathe it in. Let it fill you, and then there is nothing left in the dark to fear you.”</w:t>
+      </w:r>
+      <w:r>
+        <w:rPr>
+          <w:rFonts w:ascii="Georgia" w:hAnsi="Georgia" w:cs="Georgia"/>
+          <w:b w:val="0"/>
+          <w:i w:val="0"/>
+          <w:color w:val="222222"/>
+          <w:sz w:val="21"/>
+        </w:rPr>
+        <w:t xml:space="preserve"> (a whisper from the idol)</w:t>
+      </w:r>
+    </w:p>
+    <w:p>
+      <w:pPr>
+        <w:spacing w:after="80"/>
+      </w:pPr>
+      <w:r>
+        <w:rPr>
+          <w:rFonts w:ascii="Georgia" w:hAnsi="Georgia" w:cs="Georgia"/>
+          <w:b w:val="0"/>
+          <w:i w:val="0"/>
+          <w:color w:val="222222"/>
+          <w:sz w:val="21"/>
+        </w:rPr>
+        <w:t>The Warrior of Shadow Breathing is the strangest and most secretive of the forms, a discipline touched by something older than any monastery. Its practitioners breathe in the gloom itself, drawing the dark into their lungs until it answers to them. When they ignite their breath, their blade runs violet-black, the shadows fold around them like a cloak, and they see clearly in darkness that blinds everyone else.</w:t>
+      </w:r>
+    </w:p>
+    <w:p>
+      <w:pPr>
+        <w:spacing w:after="80"/>
+      </w:pPr>
+      <w:r>
+        <w:rPr>
+          <w:rFonts w:ascii="Georgia" w:hAnsi="Georgia" w:cs="Georgia"/>
+          <w:b w:val="0"/>
+          <w:i w:val="0"/>
+          <w:color w:val="222222"/>
+          <w:sz w:val="21"/>
+        </w:rPr>
+        <w:t>Few teach this form openly, for it walks close to powers most monks are warned away from. Those who carry it often carry a question they cannot yet answer: why the dark heeds them, where the breath truly comes from, and what waits at the end of the path they have started down. Mastered well, it makes a warrior into something the night itself seems to bend around.</w:t>
+      </w:r>
+    </w:p>
+    <w:p>
+      <w:pPr>
+        <w:spacing w:after="80"/>
+      </w:pPr>
+      <w:r>
+        <w:rPr>
+          <w:rFonts w:ascii="Georgia" w:hAnsi="Georgia" w:cs="Georgia"/>
+          <w:b/>
+          <w:i w:val="0"/>
+          <w:color w:val="222222"/>
+          <w:sz w:val="21"/>
+        </w:rPr>
+        <w:t>Features by monk level:</w:t>
+      </w:r>
+      <w:r>
+        <w:rPr>
+          <w:rFonts w:ascii="Georgia" w:hAnsi="Georgia" w:cs="Georgia"/>
+          <w:b w:val="0"/>
+          <w:i w:val="0"/>
+          <w:color w:val="222222"/>
+          <w:sz w:val="21"/>
+        </w:rPr>
+        <w:t xml:space="preserve"> 3rd, Shadow Breathing; 6th, First Form: Umbral Slash; 11th, Advanced Shadow Breathing; 17th, Third Form: Eclipse.</w:t>
       </w:r>
     </w:p>
     <w:p>
@@ -578,7 +1493,697 @@
           <w:color w:val="888888"/>
           <w:sz w:val="18"/>
         </w:rPr>
-        <w:t>Shadow Breathing: the violet-black style.</w:t>
+        <w:t>Stabby, wreathed in the Idol's gloom.</w:t>
+      </w:r>
+    </w:p>
+    <w:p>
+      <w:pPr>
+        <w:keepNext/>
+        <w:pBdr>
+          <w:left w:val="single" w:sz="18" w:space="12" w:color="8B2020"/>
+        </w:pBdr>
+        <w:shd w:val="clear" w:color="auto" w:fill="FCF6F6"/>
+        <w:spacing w:before="30" w:after="70"/>
+        <w:ind w:left="340" w:right="340"/>
+      </w:pPr>
+      <w:r>
+        <w:rPr>
+          <w:rFonts w:ascii="Georgia" w:hAnsi="Georgia" w:cs="Georgia"/>
+          <w:b/>
+          <w:color w:val="8B2020"/>
+          <w:sz w:val="22"/>
+        </w:rPr>
+        <w:t>Level 3: Shadow Breathing</w:t>
+      </w:r>
+    </w:p>
+    <w:p>
+      <w:pPr>
+        <w:pBdr>
+          <w:left w:val="single" w:sz="18" w:space="12" w:color="8B2020"/>
+        </w:pBdr>
+        <w:shd w:val="clear" w:color="auto" w:fill="FCF6F6"/>
+        <w:spacing w:before="30" w:after="70"/>
+        <w:ind w:left="340" w:right="340"/>
+      </w:pPr>
+      <w:r>
+        <w:rPr>
+          <w:rFonts w:ascii="Georgia" w:hAnsi="Georgia" w:cs="Georgia"/>
+          <w:b/>
+          <w:i w:val="0"/>
+          <w:color w:val="222222"/>
+          <w:sz w:val="18"/>
+        </w:rPr>
+        <w:t>Monk Weapons.</w:t>
+      </w:r>
+      <w:r>
+        <w:rPr>
+          <w:rFonts w:ascii="Georgia" w:hAnsi="Georgia" w:cs="Georgia"/>
+          <w:b w:val="0"/>
+          <w:i w:val="0"/>
+          <w:color w:val="222222"/>
+          <w:sz w:val="18"/>
+        </w:rPr>
+        <w:t xml:space="preserve"> A katana (and any sword you take up as your signature blade) counts as a Monk weapon for you. You can use your Martial Arts die with it, make your Bonus Action Unarmed Strikes alongside it, and use this subclass's features through it.</w:t>
+      </w:r>
+    </w:p>
+    <w:p>
+      <w:pPr>
+        <w:pBdr>
+          <w:left w:val="single" w:sz="18" w:space="12" w:color="8B2020"/>
+        </w:pBdr>
+        <w:shd w:val="clear" w:color="auto" w:fill="FCF6F6"/>
+        <w:spacing w:before="30" w:after="70"/>
+        <w:ind w:left="340" w:right="340"/>
+      </w:pPr>
+      <w:r>
+        <w:rPr>
+          <w:rFonts w:ascii="Georgia" w:hAnsi="Georgia" w:cs="Georgia"/>
+          <w:b/>
+          <w:i w:val="0"/>
+          <w:color w:val="222222"/>
+          <w:sz w:val="18"/>
+        </w:rPr>
+        <w:t>Eyes of the Idol.</w:t>
+      </w:r>
+      <w:r>
+        <w:rPr>
+          <w:rFonts w:ascii="Georgia" w:hAnsi="Georgia" w:cs="Georgia"/>
+          <w:b w:val="0"/>
+          <w:i w:val="0"/>
+          <w:color w:val="222222"/>
+          <w:sz w:val="18"/>
+        </w:rPr>
+        <w:t xml:space="preserve"> The idol's gift never fully leaves you. You have Darkvision with a range of 60 feet (if you already have Darkvision, its range increases by 60 feet), and you have Advantage on Dexterity (Stealth) checks; the gloom favors you.</w:t>
+      </w:r>
+    </w:p>
+    <w:p>
+      <w:pPr>
+        <w:pBdr>
+          <w:left w:val="single" w:sz="18" w:space="12" w:color="8B2020"/>
+        </w:pBdr>
+        <w:shd w:val="clear" w:color="auto" w:fill="FCF6F6"/>
+        <w:spacing w:before="30" w:after="70"/>
+        <w:ind w:left="340" w:right="340"/>
+      </w:pPr>
+      <w:r>
+        <w:rPr>
+          <w:rFonts w:ascii="Georgia" w:hAnsi="Georgia" w:cs="Georgia"/>
+          <w:b/>
+          <w:i w:val="0"/>
+          <w:color w:val="222222"/>
+          <w:sz w:val="18"/>
+        </w:rPr>
+        <w:t>Igniting the Breath.</w:t>
+      </w:r>
+      <w:r>
+        <w:rPr>
+          <w:rFonts w:ascii="Georgia" w:hAnsi="Georgia" w:cs="Georgia"/>
+          <w:b w:val="0"/>
+          <w:i w:val="0"/>
+          <w:color w:val="222222"/>
+          <w:sz w:val="18"/>
+        </w:rPr>
+        <w:t xml:space="preserve"> When you roll Initiative, you can expend 1 Focus Point to ignite your breath for the rest of the combat. It lasts until the combat ends, you have the Incapacitated condition, or you end it (no action required). While your breath is ignited, your weapon glows violet-black and deals an extra 2 Necrotic damage on every hit.</w:t>
+      </w:r>
+    </w:p>
+    <w:p>
+      <w:pPr>
+        <w:pBdr>
+          <w:left w:val="single" w:sz="18" w:space="12" w:color="8B2020"/>
+        </w:pBdr>
+        <w:shd w:val="clear" w:color="auto" w:fill="FCF6F6"/>
+        <w:spacing w:before="30" w:after="70"/>
+        <w:ind w:left="340" w:right="340"/>
+      </w:pPr>
+      <w:r>
+        <w:rPr>
+          <w:rFonts w:ascii="Georgia" w:hAnsi="Georgia" w:cs="Georgia"/>
+          <w:b/>
+          <w:i w:val="0"/>
+          <w:color w:val="222222"/>
+          <w:sz w:val="18"/>
+        </w:rPr>
+        <w:t>One With the Gloom.</w:t>
+      </w:r>
+      <w:r>
+        <w:rPr>
+          <w:rFonts w:ascii="Georgia" w:hAnsi="Georgia" w:cs="Georgia"/>
+          <w:b w:val="0"/>
+          <w:i w:val="0"/>
+          <w:color w:val="222222"/>
+          <w:sz w:val="18"/>
+        </w:rPr>
+        <w:t xml:space="preserve"> While your breath is ignited, the dark wraps around you: you have Half Cover (a +2 bonus to AC) against ranged attacks (anywhere, not just in shadow), and you can see normally in magical Darkness.</w:t>
+      </w:r>
+    </w:p>
+    <w:p>
+      <w:pPr>
+        <w:keepNext/>
+        <w:pBdr>
+          <w:left w:val="single" w:sz="18" w:space="12" w:color="8B2020"/>
+        </w:pBdr>
+        <w:shd w:val="clear" w:color="auto" w:fill="FCF6F6"/>
+        <w:spacing w:before="30" w:after="70"/>
+        <w:ind w:left="340" w:right="340"/>
+      </w:pPr>
+      <w:r>
+        <w:rPr>
+          <w:rFonts w:ascii="Georgia" w:hAnsi="Georgia" w:cs="Georgia"/>
+          <w:b/>
+          <w:color w:val="8B2020"/>
+          <w:sz w:val="22"/>
+        </w:rPr>
+        <w:t>Level 6: First Form: Umbral Slash</w:t>
+      </w:r>
+    </w:p>
+    <w:p>
+      <w:pPr>
+        <w:pBdr>
+          <w:left w:val="single" w:sz="18" w:space="12" w:color="8B2020"/>
+        </w:pBdr>
+        <w:shd w:val="clear" w:color="auto" w:fill="FCF6F6"/>
+        <w:spacing w:before="30" w:after="70"/>
+        <w:ind w:left="340" w:right="340"/>
+      </w:pPr>
+      <w:r>
+        <w:rPr>
+          <w:rFonts w:ascii="Georgia" w:hAnsi="Georgia" w:cs="Georgia"/>
+          <w:b/>
+          <w:i w:val="0"/>
+          <w:color w:val="222222"/>
+          <w:sz w:val="18"/>
+        </w:rPr>
+        <w:t>First Form: Umbral Slash.</w:t>
+      </w:r>
+      <w:r>
+        <w:rPr>
+          <w:rFonts w:ascii="Georgia" w:hAnsi="Georgia" w:cs="Georgia"/>
+          <w:b w:val="0"/>
+          <w:i w:val="0"/>
+          <w:color w:val="222222"/>
+          <w:sz w:val="18"/>
+        </w:rPr>
+        <w:t xml:space="preserve"> As a Bonus Action, you can expend 1 Focus Point to teleport up to 15 feet to an unoccupied space you can see next to a creature, engulf that creature in a 10-foot Cube of magical Darkness, and make one attack with your Monk weapon against it, with Advantage. On a hit, the attack deals 3d8 plus your Dexterity modifier Necrotic damage. The Darkness lasts until the end of your next turn. This feature replaces Flurry of Blows for you.</w:t>
+      </w:r>
+    </w:p>
+    <w:p>
+      <w:pPr>
+        <w:keepNext/>
+        <w:pBdr>
+          <w:left w:val="single" w:sz="18" w:space="12" w:color="8B2020"/>
+        </w:pBdr>
+        <w:shd w:val="clear" w:color="auto" w:fill="FCF6F6"/>
+        <w:spacing w:before="30" w:after="70"/>
+        <w:ind w:left="340" w:right="340"/>
+      </w:pPr>
+      <w:r>
+        <w:rPr>
+          <w:rFonts w:ascii="Georgia" w:hAnsi="Georgia" w:cs="Georgia"/>
+          <w:b/>
+          <w:color w:val="8B2020"/>
+          <w:sz w:val="22"/>
+        </w:rPr>
+        <w:t>Level 11: Advanced Shadow Breathing</w:t>
+      </w:r>
+    </w:p>
+    <w:p>
+      <w:pPr>
+        <w:pBdr>
+          <w:left w:val="single" w:sz="18" w:space="12" w:color="8B2020"/>
+        </w:pBdr>
+        <w:shd w:val="clear" w:color="auto" w:fill="FCF6F6"/>
+        <w:spacing w:before="30" w:after="70"/>
+        <w:ind w:left="340" w:right="340"/>
+      </w:pPr>
+      <w:r>
+        <w:rPr>
+          <w:rFonts w:ascii="Georgia" w:hAnsi="Georgia" w:cs="Georgia"/>
+          <w:b/>
+          <w:i w:val="0"/>
+          <w:color w:val="222222"/>
+          <w:sz w:val="18"/>
+        </w:rPr>
+        <w:t>Advanced Breathing.</w:t>
+      </w:r>
+      <w:r>
+        <w:rPr>
+          <w:rFonts w:ascii="Georgia" w:hAnsi="Georgia" w:cs="Georgia"/>
+          <w:b w:val="0"/>
+          <w:i w:val="0"/>
+          <w:color w:val="222222"/>
+          <w:sz w:val="18"/>
+        </w:rPr>
+        <w:t xml:space="preserve"> Your ignited breath drinks deeper of the dark. While it is active you gain all its original benefits, and also: once per turn, when you hit a creature with an attack roll you made with Advantage, the attack deals an extra 2d6 Necrotic damage.</w:t>
+      </w:r>
+    </w:p>
+    <w:p>
+      <w:pPr>
+        <w:pBdr>
+          <w:left w:val="single" w:sz="18" w:space="12" w:color="8B2020"/>
+        </w:pBdr>
+        <w:shd w:val="clear" w:color="auto" w:fill="FCF6F6"/>
+        <w:spacing w:before="30" w:after="70"/>
+        <w:ind w:left="340" w:right="340"/>
+      </w:pPr>
+      <w:r>
+        <w:rPr>
+          <w:rFonts w:ascii="Georgia" w:hAnsi="Georgia" w:cs="Georgia"/>
+          <w:b/>
+          <w:i w:val="0"/>
+          <w:color w:val="222222"/>
+          <w:sz w:val="18"/>
+        </w:rPr>
+        <w:t>Sharpened Gloom.</w:t>
+      </w:r>
+      <w:r>
+        <w:rPr>
+          <w:rFonts w:ascii="Georgia" w:hAnsi="Georgia" w:cs="Georgia"/>
+          <w:b w:val="0"/>
+          <w:i w:val="0"/>
+          <w:color w:val="222222"/>
+          <w:sz w:val="18"/>
+        </w:rPr>
+        <w:t xml:space="preserve"> The damage of your First Form: Umbral Slash increases to 5d10 plus your Dexterity modifier.</w:t>
+      </w:r>
+    </w:p>
+    <w:p>
+      <w:pPr>
+        <w:pBdr>
+          <w:left w:val="single" w:sz="18" w:space="12" w:color="5B2A86"/>
+        </w:pBdr>
+        <w:shd w:val="clear" w:color="auto" w:fill="F4F0FA"/>
+        <w:spacing w:before="30" w:after="70"/>
+        <w:ind w:left="340" w:right="340"/>
+      </w:pPr>
+      <w:r>
+        <w:rPr>
+          <w:rFonts w:ascii="Georgia" w:hAnsi="Georgia" w:cs="Georgia"/>
+          <w:b w:val="0"/>
+          <w:i w:val="0"/>
+          <w:color w:val="222222"/>
+          <w:sz w:val="19"/>
+        </w:rPr>
+        <w:t>▶ The gloom is his alone. Stabby sees through his own Darkness; his allies can't. Creatures wrapped in his gloom are hidden from Ursa's bolts and Lilly's cannon until the dark lifts, so the party learns to pick different targets while the shadow does its work.</w:t>
+      </w:r>
+    </w:p>
+    <w:p>
+      <w:pPr>
+        <w:keepNext/>
+        <w:pBdr>
+          <w:left w:val="single" w:sz="18" w:space="12" w:color="8B2020"/>
+        </w:pBdr>
+        <w:shd w:val="clear" w:color="auto" w:fill="FCF6F6"/>
+        <w:spacing w:before="30" w:after="70"/>
+        <w:ind w:left="340" w:right="340"/>
+      </w:pPr>
+      <w:r>
+        <w:rPr>
+          <w:rFonts w:ascii="Georgia" w:hAnsi="Georgia" w:cs="Georgia"/>
+          <w:b/>
+          <w:color w:val="8B2020"/>
+          <w:sz w:val="22"/>
+        </w:rPr>
+        <w:t>Level 17: Third Form: Eclipse</w:t>
+      </w:r>
+    </w:p>
+    <w:p>
+      <w:pPr>
+        <w:pBdr>
+          <w:left w:val="single" w:sz="18" w:space="12" w:color="8B2020"/>
+        </w:pBdr>
+        <w:shd w:val="clear" w:color="auto" w:fill="FCF6F6"/>
+        <w:spacing w:before="30" w:after="70"/>
+        <w:ind w:left="340" w:right="340"/>
+      </w:pPr>
+      <w:r>
+        <w:rPr>
+          <w:rFonts w:ascii="Georgia" w:hAnsi="Georgia" w:cs="Georgia"/>
+          <w:b/>
+          <w:i w:val="0"/>
+          <w:color w:val="222222"/>
+          <w:sz w:val="18"/>
+        </w:rPr>
+        <w:t>Third Form: Eclipse.</w:t>
+      </w:r>
+      <w:r>
+        <w:rPr>
+          <w:rFonts w:ascii="Georgia" w:hAnsi="Georgia" w:cs="Georgia"/>
+          <w:b w:val="0"/>
+          <w:i w:val="0"/>
+          <w:color w:val="222222"/>
+          <w:sz w:val="18"/>
+        </w:rPr>
+        <w:t xml:space="preserve"> As a Bonus Action, you can expend 3 Focus Points to vanish into the gloom and strike from everywhere at once. Create a 20-foot Cube of magical Darkness centered on yourself (you can see through it), then teleport to and make one attack with your Monk weapon against each of up to three different creatures within it, with Advantage. Each attack deals 5d10 plus your Dexterity modifier Necrotic damage on a hit. Each creature hit has the Blinded condition until the end of your next turn, and you remain effectively unseen by everyone but yourself until the Darkness ends.</w:t>
+      </w:r>
+    </w:p>
+    <w:p>
+      <w:pPr>
+        <w:spacing w:after="80"/>
+      </w:pPr>
+      <w:r>
+        <w:rPr>
+          <w:rFonts w:ascii="Georgia" w:hAnsi="Georgia" w:cs="Georgia"/>
+          <w:b/>
+          <w:i w:val="0"/>
+          <w:color w:val="222222"/>
+          <w:sz w:val="21"/>
+        </w:rPr>
+        <w:t>At Level 7, Stabby has:</w:t>
+      </w:r>
+      <w:r>
+        <w:rPr>
+          <w:rFonts w:ascii="Georgia" w:hAnsi="Georgia" w:cs="Georgia"/>
+          <w:b w:val="0"/>
+          <w:i w:val="0"/>
+          <w:color w:val="222222"/>
+          <w:sz w:val="21"/>
+        </w:rPr>
+        <w:t xml:space="preserve"> Shadow Breathing (the Level 3 stance) + First Form: Umbral Slash (Level 6, 3d8 + Dex). The Level 11 and 17 features unlock as he grows.</w:t>
+      </w:r>
+    </w:p>
+    <w:p>
+      <w:pPr>
+        <w:keepNext/>
+        <w:spacing w:before="220" w:after="60"/>
+      </w:pPr>
+      <w:r>
+        <w:rPr>
+          <w:rFonts w:ascii="Georgia" w:hAnsi="Georgia" w:cs="Georgia"/>
+          <w:b/>
+          <w:color w:val="A0522D"/>
+          <w:sz w:val="26"/>
+        </w:rPr>
+        <w:t>The Demon-Slayer's Blade: the Nichirin Katana</w:t>
+      </w:r>
+    </w:p>
+    <w:p>
+      <w:pPr>
+        <w:spacing w:after="80"/>
+      </w:pPr>
+      <w:r>
+        <w:rPr>
+          <w:rFonts w:ascii="Georgia" w:hAnsi="Georgia" w:cs="Georgia"/>
+          <w:b w:val="0"/>
+          <w:i w:val="0"/>
+          <w:color w:val="222222"/>
+          <w:sz w:val="21"/>
+        </w:rPr>
+        <w:t>This sun-forged demon-slayer blade was made from crimson ore that drinks in dawnlight. While sheathed, the steel looks dark and almost ordinary, but when Stabby ignites his breathing, the blade catches that breath and burns with the color of his chosen form.</w:t>
+      </w:r>
+    </w:p>
+    <w:p>
+      <w:pPr>
+        <w:keepNext/>
+        <w:pBdr>
+          <w:left w:val="single" w:sz="18" w:space="12" w:color="8B2020"/>
+        </w:pBdr>
+        <w:shd w:val="clear" w:color="auto" w:fill="FCF6F6"/>
+        <w:spacing w:before="30" w:after="70"/>
+        <w:ind w:left="340" w:right="340"/>
+      </w:pPr>
+      <w:r>
+        <w:rPr>
+          <w:rFonts w:ascii="Georgia" w:hAnsi="Georgia" w:cs="Georgia"/>
+          <w:b/>
+          <w:color w:val="8B2020"/>
+          <w:sz w:val="22"/>
+        </w:rPr>
+        <w:t>Nichirin Katana</w:t>
+      </w:r>
+    </w:p>
+    <w:p>
+      <w:pPr>
+        <w:pBdr>
+          <w:left w:val="single" w:sz="18" w:space="12" w:color="8B2020"/>
+        </w:pBdr>
+        <w:shd w:val="clear" w:color="auto" w:fill="FCF6F6"/>
+        <w:spacing w:before="30" w:after="70"/>
+        <w:ind w:left="340" w:right="340"/>
+      </w:pPr>
+      <w:r>
+        <w:rPr>
+          <w:rFonts w:ascii="Georgia" w:hAnsi="Georgia" w:cs="Georgia"/>
+          <w:b w:val="0"/>
+          <w:i/>
+          <w:color w:val="222222"/>
+          <w:sz w:val="18"/>
+        </w:rPr>
+        <w:t>Weapon (Katana), Rare (Requires Attunement by Stabby)</w:t>
+      </w:r>
+    </w:p>
+    <w:p>
+      <w:pPr>
+        <w:pBdr>
+          <w:left w:val="single" w:sz="18" w:space="12" w:color="8B2020"/>
+        </w:pBdr>
+        <w:shd w:val="clear" w:color="auto" w:fill="FCF6F6"/>
+        <w:spacing w:before="30" w:after="70"/>
+        <w:ind w:left="340" w:right="340"/>
+      </w:pPr>
+      <w:r>
+        <w:rPr>
+          <w:rFonts w:ascii="Georgia" w:hAnsi="Georgia" w:cs="Georgia"/>
+          <w:b/>
+          <w:i w:val="0"/>
+          <w:color w:val="222222"/>
+          <w:sz w:val="18"/>
+        </w:rPr>
+        <w:t>Weapon Statistics.</w:t>
+      </w:r>
+      <w:r>
+        <w:rPr>
+          <w:rFonts w:ascii="Georgia" w:hAnsi="Georgia" w:cs="Georgia"/>
+          <w:b w:val="0"/>
+          <w:i w:val="0"/>
+          <w:color w:val="222222"/>
+          <w:sz w:val="18"/>
+        </w:rPr>
+        <w:t xml:space="preserve"> The Nichirin katana uses the statistics of a Longsword (1d8 Slashing damage) with the Finesse and Versatile (1d10) properties, and it counts as a Monk weapon for Stabby. Because it has Finesse and is a Monk weapon, Stabby uses his Dexterity for its attack and damage rolls.</w:t>
+      </w:r>
+    </w:p>
+    <w:p>
+      <w:pPr>
+        <w:pBdr>
+          <w:left w:val="single" w:sz="18" w:space="12" w:color="8B2020"/>
+        </w:pBdr>
+        <w:shd w:val="clear" w:color="auto" w:fill="FCF6F6"/>
+        <w:spacing w:before="30" w:after="70"/>
+        <w:ind w:left="340" w:right="340"/>
+      </w:pPr>
+      <w:r>
+        <w:rPr>
+          <w:rFonts w:ascii="Georgia" w:hAnsi="Georgia" w:cs="Georgia"/>
+          <w:b/>
+          <w:i w:val="0"/>
+          <w:color w:val="222222"/>
+          <w:sz w:val="18"/>
+        </w:rPr>
+        <w:t>Magic Weapon.</w:t>
+      </w:r>
+      <w:r>
+        <w:rPr>
+          <w:rFonts w:ascii="Georgia" w:hAnsi="Georgia" w:cs="Georgia"/>
+          <w:b w:val="0"/>
+          <w:i w:val="0"/>
+          <w:color w:val="222222"/>
+          <w:sz w:val="18"/>
+        </w:rPr>
+        <w:t xml:space="preserve"> You gain a +2 bonus to attack and damage rolls made with this magic weapon.</w:t>
+      </w:r>
+    </w:p>
+    <w:p>
+      <w:pPr>
+        <w:pBdr>
+          <w:left w:val="single" w:sz="18" w:space="12" w:color="8B2020"/>
+        </w:pBdr>
+        <w:shd w:val="clear" w:color="auto" w:fill="FCF6F6"/>
+        <w:spacing w:before="30" w:after="70"/>
+        <w:ind w:left="340" w:right="340"/>
+      </w:pPr>
+      <w:r>
+        <w:rPr>
+          <w:rFonts w:ascii="Georgia" w:hAnsi="Georgia" w:cs="Georgia"/>
+          <w:b/>
+          <w:i w:val="0"/>
+          <w:color w:val="222222"/>
+          <w:sz w:val="18"/>
+        </w:rPr>
+        <w:t>Breath-Kindled Steel.</w:t>
+      </w:r>
+      <w:r>
+        <w:rPr>
+          <w:rFonts w:ascii="Georgia" w:hAnsi="Georgia" w:cs="Georgia"/>
+          <w:b w:val="0"/>
+          <w:i w:val="0"/>
+          <w:color w:val="222222"/>
+          <w:sz w:val="18"/>
+        </w:rPr>
+        <w:t xml:space="preserve"> When Stabby ignites his breathing, the blade glows with the color and nature of that form: blood-red for Beast Breathing, pale blue for Water Breathing, or violet-black for Shadow Breathing. This glow is magical but sheds only dim light unless Stabby chooses otherwise.</w:t>
+      </w:r>
+    </w:p>
+    <w:p>
+      <w:pPr>
+        <w:pBdr>
+          <w:left w:val="single" w:sz="18" w:space="12" w:color="8B2020"/>
+        </w:pBdr>
+        <w:shd w:val="clear" w:color="auto" w:fill="FCF6F6"/>
+        <w:spacing w:before="30" w:after="70"/>
+        <w:ind w:left="340" w:right="340"/>
+      </w:pPr>
+      <w:r>
+        <w:rPr>
+          <w:rFonts w:ascii="Georgia" w:hAnsi="Georgia" w:cs="Georgia"/>
+          <w:b/>
+          <w:i w:val="0"/>
+          <w:color w:val="222222"/>
+          <w:sz w:val="18"/>
+        </w:rPr>
+        <w:t>Cleansing Edge.</w:t>
+      </w:r>
+      <w:r>
+        <w:rPr>
+          <w:rFonts w:ascii="Georgia" w:hAnsi="Georgia" w:cs="Georgia"/>
+          <w:b w:val="0"/>
+          <w:i w:val="0"/>
+          <w:color w:val="222222"/>
+          <w:sz w:val="18"/>
+        </w:rPr>
+        <w:t xml:space="preserve"> Once on each of your turns when you hit a Fiend, Undead, shadow creature, or creature empowered by planar corruption with this katana, the blade burns away corruption until the start of your next turn. While affected, the creature can't regain Hit Points, can't benefit from magical Darkness or shadowy concealment against Stabby, and any visible corruption around the wound briefly burns, cracks, or peels away in sparks of purified light.</w:t>
+      </w:r>
+    </w:p>
+    <w:p>
+      <w:pPr>
+        <w:pBdr>
+          <w:left w:val="single" w:sz="18" w:space="12" w:color="8B2020"/>
+        </w:pBdr>
+        <w:shd w:val="clear" w:color="auto" w:fill="FCF6F6"/>
+        <w:spacing w:before="30" w:after="70"/>
+        <w:ind w:left="340" w:right="340"/>
+      </w:pPr>
+      <w:r>
+        <w:rPr>
+          <w:rFonts w:ascii="Georgia" w:hAnsi="Georgia" w:cs="Georgia"/>
+          <w:b/>
+          <w:i w:val="0"/>
+          <w:color w:val="222222"/>
+          <w:sz w:val="18"/>
+        </w:rPr>
+        <w:t>Demon-Slayer's Mark.</w:t>
+      </w:r>
+      <w:r>
+        <w:rPr>
+          <w:rFonts w:ascii="Georgia" w:hAnsi="Georgia" w:cs="Georgia"/>
+          <w:b w:val="0"/>
+          <w:i w:val="0"/>
+          <w:color w:val="222222"/>
+          <w:sz w:val="18"/>
+        </w:rPr>
+        <w:t xml:space="preserve"> The katana is especially dangerous to creatures twisted by darkness, undeath, or planar corruption. It leaves wounds that glow faintly like banked embers, revealing that the creature has been marked by cleansing sunlight. The blade wounds the corruption, not the creature beneath. When a corrupted guardian falls to it, what breaks is the darkness.</w:t>
+      </w:r>
+    </w:p>
+    <w:p>
+      <w:pPr>
+        <w:keepNext/>
+        <w:spacing w:before="220" w:after="60"/>
+      </w:pPr>
+      <w:r>
+        <w:rPr>
+          <w:rFonts w:ascii="Georgia" w:hAnsi="Georgia" w:cs="Georgia"/>
+          <w:b/>
+          <w:color w:val="A0522D"/>
+          <w:sz w:val="26"/>
+        </w:rPr>
+        <w:t>Lore of the Blade</w:t>
+      </w:r>
+    </w:p>
+    <w:p>
+      <w:pPr>
+        <w:spacing w:after="80"/>
+      </w:pPr>
+      <w:r>
+        <w:rPr>
+          <w:rFonts w:ascii="Georgia" w:hAnsi="Georgia" w:cs="Georgia"/>
+          <w:b w:val="0"/>
+          <w:i w:val="0"/>
+          <w:color w:val="222222"/>
+          <w:sz w:val="21"/>
+        </w:rPr>
+        <w:t>They say the first Nichirin blades were quenched not in water or oil but in the light of dawn itself, folded by smiths who worked only in the hour before sunrise. The ore came from a single mountain that caught the morning sun before anywhere else in the world, and steel drawn from it never forgot that first warmth. A finished blade looks plain and dark in an idle hand; it is waiting. Only a warrior who can kindle their own breath can wake the colour sleeping in the metal.</w:t>
+      </w:r>
+    </w:p>
+    <w:p>
+      <w:pPr>
+        <w:spacing w:after="80"/>
+      </w:pPr>
+      <w:r>
+        <w:rPr>
+          <w:rFonts w:ascii="Georgia" w:hAnsi="Georgia" w:cs="Georgia"/>
+          <w:b w:val="0"/>
+          <w:i w:val="0"/>
+          <w:color w:val="222222"/>
+          <w:sz w:val="21"/>
+        </w:rPr>
+        <w:t>For a creature of corruption, that waking light is a death sentence. Where an ordinary sword cuts flesh, a Nichirin blade cuts the rot itself: the shadow that hides a fiend, the dark magic that knits an undead back together, the planar taint that lets a horror shrug off honest steel. Stabby's blade chose its colours from his own breathing forms, and now it burns red, blue, or violet to match whichever beast, river, or shadow he calls upon.</w:t>
+      </w:r>
+    </w:p>
+    <w:p>
+      <w:pPr>
+        <w:pBdr>
+          <w:left w:val="single" w:sz="18" w:space="12" w:color="B8860B"/>
+        </w:pBdr>
+        <w:shd w:val="clear" w:color="auto" w:fill="FBF6EA"/>
+        <w:spacing w:before="30" w:after="70"/>
+        <w:ind w:left="340" w:right="340"/>
+      </w:pPr>
+      <w:r>
+        <w:rPr>
+          <w:rFonts w:ascii="Georgia" w:hAnsi="Georgia" w:cs="Georgia"/>
+          <w:b/>
+          <w:i w:val="0"/>
+          <w:color w:val="222222"/>
+          <w:sz w:val="21"/>
+        </w:rPr>
+        <w:t>A whispered rumor.</w:t>
+      </w:r>
+      <w:r>
+        <w:rPr>
+          <w:rFonts w:ascii="Georgia" w:hAnsi="Georgia" w:cs="Georgia"/>
+          <w:b w:val="0"/>
+          <w:i w:val="0"/>
+          <w:color w:val="222222"/>
+          <w:sz w:val="21"/>
+        </w:rPr>
+        <w:t xml:space="preserve"> Old hunters claim a Nichirin blade can never be truly stolen: carried by the wrong hand, the steel stays cold and dull and will not take an edge. Whether that is true, or simply a story told to keep thieves honest, no one in living memory has dared find out.</w:t>
+      </w:r>
+    </w:p>
+    <w:p>
+      <w:pPr>
+        <w:keepNext/>
+        <w:spacing w:before="220" w:after="60"/>
+      </w:pPr>
+      <w:r>
+        <w:rPr>
+          <w:rFonts w:ascii="Georgia" w:hAnsi="Georgia" w:cs="Georgia"/>
+          <w:b/>
+          <w:color w:val="A0522D"/>
+          <w:sz w:val="26"/>
+        </w:rPr>
+        <w:t>Setting Down the Kensei's Way</w:t>
+      </w:r>
+    </w:p>
+    <w:p>
+      <w:pPr>
+        <w:spacing w:after="80"/>
+      </w:pPr>
+      <w:r>
+        <w:rPr>
+          <w:rFonts w:ascii="Georgia" w:hAnsi="Georgia" w:cs="Georgia"/>
+          <w:b w:val="0"/>
+          <w:i w:val="0"/>
+          <w:color w:val="222222"/>
+          <w:sz w:val="21"/>
+        </w:rPr>
+        <w:t>When Stabby takes up a breathing form at Level 7, the Kensei's tricks retire with his old teacher's lessons. He loses Kensei's Shot (the bow's bonus-action +1d4) and Agile Parry (his +2 AC after blade-and-fist turns), and the Repeating Longbow becomes simply a very good bow, no longer a Monk weapon. In exchange he gains a stance he can ignite every single fight, a First Form that turns his bonus action into a 3d8 + 5 strike with 15 feet of free movement, form gifts that work all day, and a road that grows with him to Level 17. He is trading a parry for a predator's gait, and he gains far more than he gives up. (And Candyfang, outshone by the Nichirin blade, needn't vanish: an heirloom at his belt, or one day, a gift worthy of a Bloodfang.)</w:t>
       </w:r>
     </w:p>
     <w:p>
@@ -601,32 +2206,22 @@
     </w:p>
     <w:p>
       <w:pPr>
-        <w:spacing w:after="80"/>
+        <w:pBdr>
+          <w:left w:val="single" w:sz="18" w:space="12" w:color="B8860B"/>
+        </w:pBdr>
+        <w:shd w:val="clear" w:color="auto" w:fill="FBF6EA"/>
+        <w:spacing w:before="30" w:after="70"/>
+        <w:ind w:left="340" w:right="340"/>
       </w:pPr>
       <w:r>
         <w:rPr>
           <w:rFonts w:ascii="Georgia" w:hAnsi="Georgia" w:cs="Georgia"/>
           <w:b w:val="0"/>
-          <w:i w:val="0"/>
+          <w:i/>
           <w:color w:val="222222"/>
           <w:sz w:val="21"/>
         </w:rPr>
-        <w:t>Chosen at level 7 (full document: characters/path_rewards/ursa_path_rewards_v2.pdf).</w:t>
-      </w:r>
-    </w:p>
-    <w:p>
-      <w:pPr>
-        <w:spacing w:after="80"/>
-      </w:pPr>
-      <w:r>
-        <w:rPr>
-          <w:rFonts w:ascii="Georgia" w:hAnsi="Georgia" w:cs="Georgia"/>
-          <w:b/>
-          <w:i w:val="0"/>
-          <w:color w:val="222222"/>
-          <w:sz w:val="21"/>
-        </w:rPr>
-        <w:t>Starlit Channeler</w:t>
+        <w:t>For Ursa Catchum, Circle of the Stars Druid: the year apart, Level 5 to 7.</w:t>
       </w:r>
       <w:r>
         <w:rPr>
@@ -636,18 +2231,588 @@
           <w:color w:val="222222"/>
           <w:sz w:val="21"/>
         </w:rPr>
-        <w:t xml:space="preserve"> (the Circle road): learns Shillelagh; the Starry Form gains a FOURTH constellation, the </w:t>
+        <w:t xml:space="preserve"> Ursa walked one of three roads during the year apart, and came back changed. Each road grants a feat (what he sought) and a keepsake (what found him): he gains the pair matching his road. Special story feats: no ability score increase.</w:t>
       </w:r>
+    </w:p>
+    <w:p>
+      <w:pPr>
+        <w:keepNext/>
+        <w:spacing w:before="220" w:after="60"/>
+      </w:pPr>
+      <w:r>
+        <w:rPr>
+          <w:rFonts w:ascii="Georgia" w:hAnsi="Georgia" w:cs="Georgia"/>
+          <w:b/>
+          <w:color w:val="A0522D"/>
+          <w:sz w:val="26"/>
+        </w:rPr>
+        <w:t>Beast Handler: The Living World (the road into the wild)</w:t>
+      </w:r>
+    </w:p>
+    <w:p>
+      <w:pPr>
+        <w:pBdr>
+          <w:left w:val="single" w:sz="18" w:space="12" w:color="B8860B"/>
+        </w:pBdr>
+        <w:shd w:val="clear" w:color="auto" w:fill="FBF6EA"/>
+        <w:spacing w:before="30" w:after="70"/>
+        <w:ind w:left="340" w:right="340"/>
+      </w:pPr>
+      <w:r>
+        <w:rPr>
+          <w:rFonts w:ascii="Georgia" w:hAnsi="Georgia" w:cs="Georgia"/>
+          <w:b w:val="0"/>
+          <w:i/>
+          <w:color w:val="222222"/>
+          <w:sz w:val="21"/>
+        </w:rPr>
+        <w:t>“You went out to learn the speech of wild things. You came back, and the wild things follow you home.”</w:t>
+      </w:r>
+    </w:p>
+    <w:p>
+      <w:pPr>
+        <w:keepNext/>
+        <w:pBdr>
+          <w:left w:val="single" w:sz="18" w:space="12" w:color="8B2020"/>
+        </w:pBdr>
+        <w:shd w:val="clear" w:color="auto" w:fill="FCF6F6"/>
+        <w:spacing w:before="30" w:after="70"/>
+        <w:ind w:left="340" w:right="340"/>
+      </w:pPr>
+      <w:r>
+        <w:rPr>
+          <w:rFonts w:ascii="Georgia" w:hAnsi="Georgia" w:cs="Georgia"/>
+          <w:b/>
+          <w:color w:val="8B2020"/>
+          <w:sz w:val="22"/>
+        </w:rPr>
+        <w:t>Beast Handler (feat)</w:t>
+      </w:r>
+    </w:p>
+    <w:p>
+      <w:pPr>
+        <w:pBdr>
+          <w:left w:val="single" w:sz="18" w:space="12" w:color="8B2020"/>
+        </w:pBdr>
+        <w:shd w:val="clear" w:color="auto" w:fill="FCF6F6"/>
+        <w:spacing w:before="30" w:after="70"/>
+        <w:ind w:left="340" w:right="340"/>
+      </w:pPr>
       <w:r>
         <w:rPr>
           <w:rFonts w:ascii="Georgia" w:hAnsi="Georgia" w:cs="Georgia"/>
           <w:b/>
           <w:i w:val="0"/>
           <w:color w:val="222222"/>
+          <w:sz w:val="18"/>
+        </w:rPr>
+        <w:t>Mightier Summons.</w:t>
+      </w:r>
+      <w:r>
+        <w:rPr>
+          <w:rFonts w:ascii="Georgia" w:hAnsi="Georgia" w:cs="Georgia"/>
+          <w:b w:val="0"/>
+          <w:i w:val="0"/>
+          <w:color w:val="222222"/>
+          <w:sz w:val="18"/>
+        </w:rPr>
+        <w:t xml:space="preserve"> Whenever you cast the Summon Beast spell, you cast it as though using a spell slot of the highest level you can cast, without expending a higher-level slot. (The spell's effects scale to that level, 4th now, and growing as Ursa does, but it still uses only a 2nd-level slot.)</w:t>
+      </w:r>
+    </w:p>
+    <w:p>
+      <w:pPr>
+        <w:pBdr>
+          <w:left w:val="single" w:sz="18" w:space="12" w:color="8B2020"/>
+        </w:pBdr>
+        <w:shd w:val="clear" w:color="auto" w:fill="FCF6F6"/>
+        <w:spacing w:before="30" w:after="70"/>
+        <w:ind w:left="340" w:right="340"/>
+      </w:pPr>
+      <w:r>
+        <w:rPr>
+          <w:rFonts w:ascii="Georgia" w:hAnsi="Georgia" w:cs="Georgia"/>
+          <w:b/>
+          <w:i w:val="0"/>
+          <w:color w:val="222222"/>
+          <w:sz w:val="18"/>
+        </w:rPr>
+        <w:t>Wild Speech.</w:t>
+      </w:r>
+      <w:r>
+        <w:rPr>
+          <w:rFonts w:ascii="Georgia" w:hAnsi="Georgia" w:cs="Georgia"/>
+          <w:b w:val="0"/>
+          <w:i w:val="0"/>
+          <w:color w:val="222222"/>
+          <w:sz w:val="18"/>
+        </w:rPr>
+        <w:t xml:space="preserve"> You and your summoned creatures share simple thoughts freely, no words needed. With ordinary Beasts, you understand their sounds and gestures even without your Mark's magic, and they understand yours.</w:t>
+      </w:r>
+    </w:p>
+    <w:p>
+      <w:pPr>
+        <w:keepNext/>
+        <w:pBdr>
+          <w:left w:val="single" w:sz="18" w:space="12" w:color="8B2020"/>
+        </w:pBdr>
+        <w:shd w:val="clear" w:color="auto" w:fill="FCF6F6"/>
+        <w:spacing w:before="30" w:after="70"/>
+        <w:ind w:left="340" w:right="340"/>
+      </w:pPr>
+      <w:r>
+        <w:rPr>
+          <w:rFonts w:ascii="Georgia" w:hAnsi="Georgia" w:cs="Georgia"/>
+          <w:b/>
+          <w:color w:val="8B2020"/>
+          <w:sz w:val="22"/>
+        </w:rPr>
+        <w:t>The Wildheart Token</w:t>
+      </w:r>
+    </w:p>
+    <w:p>
+      <w:pPr>
+        <w:pBdr>
+          <w:left w:val="single" w:sz="18" w:space="12" w:color="8B2020"/>
+        </w:pBdr>
+        <w:shd w:val="clear" w:color="auto" w:fill="FCF6F6"/>
+        <w:spacing w:before="30" w:after="70"/>
+        <w:ind w:left="340" w:right="340"/>
+      </w:pPr>
+      <w:r>
+        <w:rPr>
+          <w:rFonts w:ascii="Georgia" w:hAnsi="Georgia" w:cs="Georgia"/>
+          <w:b w:val="0"/>
+          <w:i/>
+          <w:color w:val="222222"/>
+          <w:sz w:val="18"/>
+        </w:rPr>
+        <w:t>Carved by his own hand.</w:t>
+      </w:r>
+    </w:p>
+    <w:p>
+      <w:pPr>
+        <w:pBdr>
+          <w:left w:val="single" w:sz="18" w:space="12" w:color="8B2020"/>
+        </w:pBdr>
+        <w:shd w:val="clear" w:color="auto" w:fill="FCF6F6"/>
+        <w:spacing w:before="30" w:after="70"/>
+        <w:ind w:left="340" w:right="340"/>
+      </w:pPr>
+      <w:r>
+        <w:rPr>
+          <w:rFonts w:ascii="Georgia" w:hAnsi="Georgia" w:cs="Georgia"/>
+          <w:b w:val="0"/>
+          <w:i w:val="0"/>
+          <w:color w:val="222222"/>
+          <w:sz w:val="18"/>
+        </w:rPr>
+        <w:t>A totem of a beast Ursa befriended in the wild year: the player names it, and names the friend. His Bestial Spirit now always takes that companion's shape. Once per day, when the spirit would drop to 0 hit points, it drops to 1 instead: it refuses to leave him.</w:t>
+      </w:r>
+    </w:p>
+    <w:p>
+      <w:pPr>
+        <w:keepNext/>
+        <w:spacing w:before="220" w:after="60"/>
+      </w:pPr>
+      <w:r>
+        <w:rPr>
+          <w:rFonts w:ascii="Georgia" w:hAnsi="Georgia" w:cs="Georgia"/>
+          <w:b/>
+          <w:color w:val="A0522D"/>
+          <w:sz w:val="26"/>
+        </w:rPr>
+        <w:t>Starlit Channeler: The Circle of Stars (the road into the sky)</w:t>
+      </w:r>
+    </w:p>
+    <w:p>
+      <w:pPr>
+        <w:pBdr>
+          <w:left w:val="single" w:sz="18" w:space="12" w:color="B8860B"/>
+        </w:pBdr>
+        <w:shd w:val="clear" w:color="auto" w:fill="FBF6EA"/>
+        <w:spacing w:before="30" w:after="70"/>
+        <w:ind w:left="340" w:right="340"/>
+      </w:pPr>
+      <w:r>
+        <w:rPr>
+          <w:rFonts w:ascii="Georgia" w:hAnsi="Georgia" w:cs="Georgia"/>
+          <w:b w:val="0"/>
+          <w:i/>
+          <w:color w:val="222222"/>
           <w:sz w:val="21"/>
         </w:rPr>
-        <w:t>Warden</w:t>
+        <w:t>“You returned to the Circle, and the constellations answered: their light now runs down your arm and out through the staff.”</w:t>
       </w:r>
+    </w:p>
+    <w:p>
+      <w:pPr>
+        <w:keepNext/>
+        <w:pBdr>
+          <w:left w:val="single" w:sz="18" w:space="12" w:color="8B2020"/>
+        </w:pBdr>
+        <w:shd w:val="clear" w:color="auto" w:fill="FCF6F6"/>
+        <w:spacing w:before="30" w:after="70"/>
+        <w:ind w:left="340" w:right="340"/>
+      </w:pPr>
+      <w:r>
+        <w:rPr>
+          <w:rFonts w:ascii="Georgia" w:hAnsi="Georgia" w:cs="Georgia"/>
+          <w:b/>
+          <w:color w:val="8B2020"/>
+          <w:sz w:val="22"/>
+        </w:rPr>
+        <w:t>Starlit Channeler (feat)</w:t>
+      </w:r>
+    </w:p>
+    <w:p>
+      <w:pPr>
+        <w:pBdr>
+          <w:left w:val="single" w:sz="18" w:space="12" w:color="8B2020"/>
+        </w:pBdr>
+        <w:shd w:val="clear" w:color="auto" w:fill="FCF6F6"/>
+        <w:spacing w:before="30" w:after="70"/>
+        <w:ind w:left="340" w:right="340"/>
+      </w:pPr>
+      <w:r>
+        <w:rPr>
+          <w:rFonts w:ascii="Georgia" w:hAnsi="Georgia" w:cs="Georgia"/>
+          <w:b/>
+          <w:i w:val="0"/>
+          <w:color w:val="222222"/>
+          <w:sz w:val="18"/>
+        </w:rPr>
+        <w:t>The Warden.</w:t>
+      </w:r>
+      <w:r>
+        <w:rPr>
+          <w:rFonts w:ascii="Georgia" w:hAnsi="Georgia" w:cs="Georgia"/>
+          <w:b w:val="0"/>
+          <w:i w:val="0"/>
+          <w:color w:val="222222"/>
+          <w:sz w:val="18"/>
+        </w:rPr>
+        <w:t xml:space="preserve"> You learn the Shillelagh cantrip (Wisdom is your spellcasting ability for it), and your Starry Form gains a fourth constellation: the Warden, a spear-bearing figure of starlight. When you assume your form, you can choose it. As part of the same Bonus Action, you cast Shillelagh through your staff, and the spell lasts as long as the form does (instead of 1 minute). While the Warden shines: the kindled staff's damage becomes Radiant, its strikes deal an extra 1d6 Radiant damage (2d6 at 11th level, 3d6 at 17th), and as a Bonus Action on each of your later turns, you can make one strike with the kindled staff.</w:t>
+      </w:r>
+    </w:p>
+    <w:p>
+      <w:pPr>
+        <w:pBdr>
+          <w:left w:val="single" w:sz="18" w:space="12" w:color="5B2A86"/>
+        </w:pBdr>
+        <w:shd w:val="clear" w:color="auto" w:fill="F4F0FA"/>
+        <w:spacing w:before="30" w:after="70"/>
+        <w:ind w:left="340" w:right="340"/>
+      </w:pPr>
+      <w:r>
+        <w:rPr>
+          <w:rFonts w:ascii="Georgia" w:hAnsi="Georgia" w:cs="Georgia"/>
+          <w:b w:val="0"/>
+          <w:i w:val="0"/>
+          <w:color w:val="222222"/>
+          <w:sz w:val="19"/>
+        </w:rPr>
+        <w:t>▶ The kindled staff IS the Shillelagh spell: Starseed (+1d4) rides its strikes (unlike the Archer's arrow, a form feature), and its damage counts as cantrip damage (Elemental Fury: Potent Spellcasting applies from 7th, once per turn, like Starseed). Sheet note: the feat grants Shillelagh, so Ursa's known copy frees up for a cantrip swap at his next level.</w:t>
+      </w:r>
+    </w:p>
+    <w:p>
+      <w:pPr>
+        <w:keepNext/>
+        <w:pBdr>
+          <w:left w:val="single" w:sz="18" w:space="12" w:color="8B2020"/>
+        </w:pBdr>
+        <w:shd w:val="clear" w:color="auto" w:fill="FCF6F6"/>
+        <w:spacing w:before="30" w:after="70"/>
+        <w:ind w:left="340" w:right="340"/>
+      </w:pPr>
+      <w:r>
+        <w:rPr>
+          <w:rFonts w:ascii="Georgia" w:hAnsi="Georgia" w:cs="Georgia"/>
+          <w:b/>
+          <w:color w:val="8B2020"/>
+          <w:sz w:val="22"/>
+        </w:rPr>
+        <w:t>The Staff Wakes Further</w:t>
+      </w:r>
+    </w:p>
+    <w:p>
+      <w:pPr>
+        <w:pBdr>
+          <w:left w:val="single" w:sz="18" w:space="12" w:color="8B2020"/>
+        </w:pBdr>
+        <w:shd w:val="clear" w:color="auto" w:fill="FCF6F6"/>
+        <w:spacing w:before="30" w:after="70"/>
+        <w:ind w:left="340" w:right="340"/>
+      </w:pPr>
+      <w:r>
+        <w:rPr>
+          <w:rFonts w:ascii="Georgia" w:hAnsi="Georgia" w:cs="Georgia"/>
+          <w:b w:val="0"/>
+          <w:i/>
+          <w:color w:val="222222"/>
+          <w:sz w:val="18"/>
+        </w:rPr>
+        <w:t>The relic grows, as promised.</w:t>
+      </w:r>
+      <w:r>
+        <w:rPr>
+          <w:rFonts w:ascii="Georgia" w:hAnsi="Georgia" w:cs="Georgia"/>
+          <w:b w:val="0"/>
+          <w:i w:val="0"/>
+          <w:color w:val="222222"/>
+          <w:sz w:val="18"/>
+        </w:rPr>
+        <w:t xml:space="preserve"> The Staff of Waking Constellations has always brightened a new star after every victory: on this road, it brightens for him. Capacity rises to 6 charges (regain 1d4+2 at dawn), and its Starlight glow reaches 20 feet: the whole party fits inside his Starry Form's light, and inside the Amulet of Guiding Light's +1 to attacks and saves.</w:t>
+      </w:r>
+    </w:p>
+    <w:p>
+      <w:pPr>
+        <w:keepNext/>
+        <w:spacing w:before="220" w:after="60"/>
+      </w:pPr>
+      <w:r>
+        <w:rPr>
+          <w:rFonts w:ascii="Georgia" w:hAnsi="Georgia" w:cs="Georgia"/>
+          <w:b/>
+          <w:color w:val="A0522D"/>
+          <w:sz w:val="26"/>
+        </w:rPr>
+        <w:t>Reader of Omens: The Father's Trail (the road east)</w:t>
+      </w:r>
+    </w:p>
+    <w:p>
+      <w:pPr>
+        <w:pBdr>
+          <w:left w:val="single" w:sz="18" w:space="12" w:color="B8860B"/>
+        </w:pBdr>
+        <w:shd w:val="clear" w:color="auto" w:fill="FBF6EA"/>
+        <w:spacing w:before="30" w:after="70"/>
+        <w:ind w:left="340" w:right="340"/>
+      </w:pPr>
+      <w:r>
+        <w:rPr>
+          <w:rFonts w:ascii="Georgia" w:hAnsi="Georgia" w:cs="Georgia"/>
+          <w:b w:val="0"/>
+          <w:i/>
+          <w:color w:val="222222"/>
+          <w:sz w:val="21"/>
+        </w:rPr>
+        <w:t>“Your father read the sky the way other folk read a map. On his trail you learned his art: the omens no longer come at random, and you choose your moment.”</w:t>
+      </w:r>
+    </w:p>
+    <w:p>
+      <w:pPr>
+        <w:keepNext/>
+        <w:pBdr>
+          <w:left w:val="single" w:sz="18" w:space="12" w:color="8B2020"/>
+        </w:pBdr>
+        <w:shd w:val="clear" w:color="auto" w:fill="FCF6F6"/>
+        <w:spacing w:before="30" w:after="70"/>
+        <w:ind w:left="340" w:right="340"/>
+      </w:pPr>
+      <w:r>
+        <w:rPr>
+          <w:rFonts w:ascii="Georgia" w:hAnsi="Georgia" w:cs="Georgia"/>
+          <w:b/>
+          <w:color w:val="8B2020"/>
+          <w:sz w:val="22"/>
+        </w:rPr>
+        <w:t>Reader of Omens (feat)</w:t>
+      </w:r>
+    </w:p>
+    <w:p>
+      <w:pPr>
+        <w:pBdr>
+          <w:left w:val="single" w:sz="18" w:space="12" w:color="8B2020"/>
+        </w:pBdr>
+        <w:shd w:val="clear" w:color="auto" w:fill="FCF6F6"/>
+        <w:spacing w:before="30" w:after="70"/>
+        <w:ind w:left="340" w:right="340"/>
+      </w:pPr>
+      <w:r>
+        <w:rPr>
+          <w:rFonts w:ascii="Georgia" w:hAnsi="Georgia" w:cs="Georgia"/>
+          <w:b/>
+          <w:i w:val="0"/>
+          <w:color w:val="222222"/>
+          <w:sz w:val="18"/>
+        </w:rPr>
+        <w:t>Both Omens.</w:t>
+      </w:r>
+      <w:r>
+        <w:rPr>
+          <w:rFonts w:ascii="Georgia" w:hAnsi="Georgia" w:cs="Georgia"/>
+          <w:b w:val="0"/>
+          <w:i w:val="0"/>
+          <w:color w:val="222222"/>
+          <w:sz w:val="18"/>
+        </w:rPr>
+        <w:t xml:space="preserve"> When you consult your Star Map after a Long Rest, you do not roll for a single omen. Instead, you gain access to both Weal and Woe until your next Long Rest.</w:t>
+      </w:r>
+    </w:p>
+    <w:p>
+      <w:pPr>
+        <w:pBdr>
+          <w:left w:val="single" w:sz="18" w:space="12" w:color="8B2020"/>
+        </w:pBdr>
+        <w:shd w:val="clear" w:color="auto" w:fill="FCF6F6"/>
+        <w:spacing w:before="30" w:after="70"/>
+        <w:ind w:left="340" w:right="340"/>
+      </w:pPr>
+      <w:r>
+        <w:rPr>
+          <w:rFonts w:ascii="Georgia" w:hAnsi="Georgia" w:cs="Georgia"/>
+          <w:b/>
+          <w:i w:val="0"/>
+          <w:color w:val="222222"/>
+          <w:sz w:val="18"/>
+        </w:rPr>
+        <w:t>Read the Moment.</w:t>
+      </w:r>
+      <w:r>
+        <w:rPr>
+          <w:rFonts w:ascii="Georgia" w:hAnsi="Georgia" w:cs="Georgia"/>
+          <w:b w:val="0"/>
+          <w:i w:val="0"/>
+          <w:color w:val="222222"/>
+          <w:sz w:val="18"/>
+        </w:rPr>
+        <w:t xml:space="preserve"> You can wait to use your Cosmic Omen reaction until after the d20 is rolled, but before you know the outcome. You then choose whether to apply Weal (add 1d6 to the roll) or Woe (subtract 1d6).</w:t>
+      </w:r>
+    </w:p>
+    <w:p>
+      <w:pPr>
+        <w:pBdr>
+          <w:left w:val="single" w:sz="18" w:space="12" w:color="8B2020"/>
+        </w:pBdr>
+        <w:shd w:val="clear" w:color="auto" w:fill="FCF6F6"/>
+        <w:spacing w:before="30" w:after="70"/>
+        <w:ind w:left="340" w:right="340"/>
+      </w:pPr>
+      <w:r>
+        <w:rPr>
+          <w:rFonts w:ascii="Georgia" w:hAnsi="Georgia" w:cs="Georgia"/>
+          <w:b/>
+          <w:i w:val="0"/>
+          <w:color w:val="222222"/>
+          <w:sz w:val="18"/>
+        </w:rPr>
+        <w:t>Shared Tides.</w:t>
+      </w:r>
+      <w:r>
+        <w:rPr>
+          <w:rFonts w:ascii="Georgia" w:hAnsi="Georgia" w:cs="Georgia"/>
+          <w:b w:val="0"/>
+          <w:i w:val="0"/>
+          <w:color w:val="222222"/>
+          <w:sz w:val="18"/>
+        </w:rPr>
+        <w:t xml:space="preserve"> Your uses of Cosmic Omen remain a single pool equal to your Wisdom modifier (regaining all uses on a Long Rest). Spend each use on either Weal or Woe.</w:t>
+      </w:r>
+    </w:p>
+    <w:p>
+      <w:pPr>
+        <w:pBdr>
+          <w:left w:val="single" w:sz="18" w:space="12" w:color="8B2020"/>
+        </w:pBdr>
+        <w:shd w:val="clear" w:color="auto" w:fill="FCF6F6"/>
+        <w:spacing w:before="30" w:after="70"/>
+        <w:ind w:left="340" w:right="340"/>
+      </w:pPr>
+      <w:r>
+        <w:rPr>
+          <w:rFonts w:ascii="Georgia" w:hAnsi="Georgia" w:cs="Georgia"/>
+          <w:b w:val="0"/>
+          <w:i/>
+          <w:color w:val="222222"/>
+          <w:sz w:val="18"/>
+        </w:rPr>
+        <w:t>Prerequisite: the Cosmic Omen feature (gained at druid level 6).</w:t>
+      </w:r>
+    </w:p>
+    <w:p>
+      <w:pPr>
+        <w:keepNext/>
+        <w:pBdr>
+          <w:left w:val="single" w:sz="18" w:space="12" w:color="8B2020"/>
+        </w:pBdr>
+        <w:shd w:val="clear" w:color="auto" w:fill="FCF6F6"/>
+        <w:spacing w:before="30" w:after="70"/>
+        <w:ind w:left="340" w:right="340"/>
+      </w:pPr>
+      <w:r>
+        <w:rPr>
+          <w:rFonts w:ascii="Georgia" w:hAnsi="Georgia" w:cs="Georgia"/>
+          <w:b/>
+          <w:color w:val="8B2020"/>
+          <w:sz w:val="22"/>
+        </w:rPr>
+        <w:t>Ash's Sigil-Stone</w:t>
+      </w:r>
+    </w:p>
+    <w:p>
+      <w:pPr>
+        <w:pBdr>
+          <w:left w:val="single" w:sz="18" w:space="12" w:color="8B2020"/>
+        </w:pBdr>
+        <w:shd w:val="clear" w:color="auto" w:fill="FCF6F6"/>
+        <w:spacing w:before="30" w:after="70"/>
+        <w:ind w:left="340" w:right="340"/>
+      </w:pPr>
+      <w:r>
+        <w:rPr>
+          <w:rFonts w:ascii="Georgia" w:hAnsi="Georgia" w:cs="Georgia"/>
+          <w:b w:val="0"/>
+          <w:i/>
+          <w:color w:val="222222"/>
+          <w:sz w:val="18"/>
+        </w:rPr>
+        <w:t>Recovered on the trail. Attunement.</w:t>
+      </w:r>
+    </w:p>
+    <w:p>
+      <w:pPr>
+        <w:pBdr>
+          <w:left w:val="single" w:sz="18" w:space="12" w:color="8B2020"/>
+        </w:pBdr>
+        <w:shd w:val="clear" w:color="auto" w:fill="FCF6F6"/>
+        <w:spacing w:before="30" w:after="70"/>
+        <w:ind w:left="340" w:right="340"/>
+      </w:pPr>
+      <w:r>
+        <w:rPr>
+          <w:rFonts w:ascii="Georgia" w:hAnsi="Georgia" w:cs="Georgia"/>
+          <w:b w:val="0"/>
+          <w:i w:val="0"/>
+          <w:color w:val="222222"/>
+          <w:sz w:val="18"/>
+        </w:rPr>
+        <w:t>A river-smooth stone etched with a half-finished sigil of Elaria, in Ash's own hand. It sits warm in the palm when carried east. 1/long rest: cast Aura of Vitality from it without a spell slot, healing between fights (triggers his Chalice splash). One day, when the sigil is finished, it may wake.</w:t>
+      </w:r>
+    </w:p>
+    <w:p>
+      <w:pPr>
+        <w:pBdr>
+          <w:left w:val="single" w:sz="18" w:space="12" w:color="5B2A86"/>
+        </w:pBdr>
+        <w:shd w:val="clear" w:color="auto" w:fill="F4F0FA"/>
+        <w:spacing w:before="30" w:after="70"/>
+        <w:ind w:left="340" w:right="340"/>
+      </w:pPr>
+      <w:r>
+        <w:rPr>
+          <w:rFonts w:ascii="Georgia" w:hAnsi="Georgia" w:cs="Georgia"/>
+          <w:b w:val="0"/>
+          <w:i w:val="0"/>
+          <w:color w:val="222222"/>
+          <w:sz w:val="19"/>
+        </w:rPr>
+        <w:t>▶ The S13 clue rides here.</w:t>
+      </w:r>
+    </w:p>
+    <w:p>
+      <w:pPr>
+        <w:spacing w:after="80"/>
+      </w:pPr>
       <w:r>
         <w:rPr>
           <w:rFonts w:ascii="Georgia" w:hAnsi="Georgia" w:cs="Georgia"/>
@@ -656,23 +2821,36 @@
           <w:color w:val="222222"/>
           <w:sz w:val="21"/>
         </w:rPr>
-        <w:t>: kindle the staff as part of the same bonus action, radiant +1d6 rider (2d6 at 11, 3d6 at 17), lasting as long as the form. The Staff wakes further: 6 charges, brighter starlight.</w:t>
+        <w:t>Ursa gains the one road he walked, feat and keepsake together. The other two roads remain: the stars are patient, and the wild does not forget him.</w:t>
       </w:r>
     </w:p>
     <w:p>
       <w:pPr>
-        <w:spacing w:after="80"/>
+        <w:keepNext/>
+        <w:spacing w:before="400" w:after="120"/>
+        <w:pBdr>
+          <w:bottom w:val="single" w:sz="6" w:space="4" w:color="B8860B"/>
+        </w:pBdr>
       </w:pPr>
       <w:r>
         <w:rPr>
           <w:rFonts w:ascii="Georgia" w:hAnsi="Georgia" w:cs="Georgia"/>
           <w:b/>
-          <w:i w:val="0"/>
-          <w:color w:val="222222"/>
-          <w:sz w:val="21"/>
+          <w:color w:val="B8860B"/>
+          <w:sz w:val="32"/>
         </w:rPr>
-        <w:t>Reader of Omens</w:t>
+        <w:t>Glimmerstone Artifacts (Lilly's Path)</w:t>
       </w:r>
+    </w:p>
+    <w:p>
+      <w:pPr>
+        <w:pBdr>
+          <w:left w:val="single" w:sz="18" w:space="12" w:color="B8860B"/>
+        </w:pBdr>
+        <w:shd w:val="clear" w:color="auto" w:fill="FBF6EA"/>
+        <w:spacing w:before="30" w:after="70"/>
+        <w:ind w:left="340" w:right="340"/>
+      </w:pPr>
       <w:r>
         <w:rPr>
           <w:rFonts w:ascii="Georgia" w:hAnsi="Georgia" w:cs="Georgia"/>
@@ -681,18 +2859,48 @@
           <w:color w:val="222222"/>
           <w:sz w:val="21"/>
         </w:rPr>
-        <w:t xml:space="preserve"> (the Father's Trail road): </w:t>
+        <w:t>Three masterworks of deep gnome artifice, forged for Lilly Glimmergear in the year apart. Three masterworks, one choice. Each door of Lilly's year apart leads to one of these treasures: stay and build the portal (the Sentinel), go home to Glimmerspire and Poots (Boomstick), or give the year to mote research (the Awakened Sphere). She walks one road and claims one masterwork. The attunement ledger closes on every road: her Frostbite Shard, her Pocket Dynamo, and the new artifact make exactly three, and on the Sentinel's road it is only two, for the Dynamo itself is rebuilt into the guardian.</w:t>
       </w:r>
+    </w:p>
+    <w:p>
+      <w:pPr>
+        <w:keepNext/>
+        <w:spacing w:before="220" w:after="60"/>
+      </w:pPr>
       <w:r>
         <w:rPr>
           <w:rFonts w:ascii="Georgia" w:hAnsi="Georgia" w:cs="Georgia"/>
           <w:b/>
-          <w:i w:val="0"/>
+          <w:color w:val="A0522D"/>
+          <w:sz w:val="26"/>
+        </w:rPr>
+        <w:t>Boomstick</w:t>
+      </w:r>
+    </w:p>
+    <w:p>
+      <w:pPr>
+        <w:pBdr>
+          <w:left w:val="single" w:sz="18" w:space="12" w:color="B8860B"/>
+        </w:pBdr>
+        <w:shd w:val="clear" w:color="auto" w:fill="FBF6EA"/>
+        <w:spacing w:before="30" w:after="70"/>
+        <w:ind w:left="340" w:right="340"/>
+      </w:pPr>
+      <w:r>
+        <w:rPr>
+          <w:rFonts w:ascii="Georgia" w:hAnsi="Georgia" w:cs="Georgia"/>
+          <w:b w:val="0"/>
+          <w:i/>
           <w:color w:val="222222"/>
           <w:sz w:val="21"/>
         </w:rPr>
-        <w:t>Weal and Woe</w:t>
+        <w:t>“It doesn't jam. It doesn't misfire. It simply states its opinion, loudly.”</w:t>
       </w:r>
+    </w:p>
+    <w:p>
+      <w:pPr>
+        <w:spacing w:after="80"/>
+      </w:pPr>
       <w:r>
         <w:rPr>
           <w:rFonts w:ascii="Georgia" w:hAnsi="Georgia" w:cs="Georgia"/>
@@ -701,90 +2909,7 @@
           <w:color w:val="222222"/>
           <w:sz w:val="21"/>
         </w:rPr>
-        <w:t xml:space="preserve">, a pool of Wisdom-modifier omens applied AFTER a d20 is rolled; and </w:t>
-      </w:r>
-      <w:r>
-        <w:rPr>
-          <w:rFonts w:ascii="Georgia" w:hAnsi="Georgia" w:cs="Georgia"/>
-          <w:b/>
-          <w:i w:val="0"/>
-          <w:color w:val="222222"/>
-          <w:sz w:val="21"/>
-        </w:rPr>
-        <w:t>Ash's Sigil-Stone</w:t>
-      </w:r>
-      <w:r>
-        <w:rPr>
-          <w:rFonts w:ascii="Georgia" w:hAnsi="Georgia" w:cs="Georgia"/>
-          <w:b w:val="0"/>
-          <w:i w:val="0"/>
-          <w:color w:val="222222"/>
-          <w:sz w:val="21"/>
-        </w:rPr>
-        <w:t>, 1/long rest Aura of Vitality without a slot, carrying a half-finished sigil of Elaria that has more to say.</w:t>
-      </w:r>
-    </w:p>
-    <w:p>
-      <w:pPr>
-        <w:spacing w:after="80"/>
-      </w:pPr>
-      <w:r>
-        <w:rPr>
-          <w:rFonts w:ascii="Georgia" w:hAnsi="Georgia" w:cs="Georgia"/>
-          <w:b/>
-          <w:i w:val="0"/>
-          <w:color w:val="222222"/>
-          <w:sz w:val="21"/>
-        </w:rPr>
-        <w:t>Beast Handler</w:t>
-      </w:r>
-      <w:r>
-        <w:rPr>
-          <w:rFonts w:ascii="Georgia" w:hAnsi="Georgia" w:cs="Georgia"/>
-          <w:b w:val="0"/>
-          <w:i w:val="0"/>
-          <w:color w:val="222222"/>
-          <w:sz w:val="21"/>
-        </w:rPr>
-        <w:t xml:space="preserve"> (the Living World road): Summon Beast always casts at the highest level Ursa can cast, Wild Speech with his summons, and the </w:t>
-      </w:r>
-      <w:r>
-        <w:rPr>
-          <w:rFonts w:ascii="Georgia" w:hAnsi="Georgia" w:cs="Georgia"/>
-          <w:b/>
-          <w:i w:val="0"/>
-          <w:color w:val="222222"/>
-          <w:sz w:val="21"/>
-        </w:rPr>
-        <w:t>Wildheart Token</w:t>
-      </w:r>
-      <w:r>
-        <w:rPr>
-          <w:rFonts w:ascii="Georgia" w:hAnsi="Georgia" w:cs="Georgia"/>
-          <w:b w:val="0"/>
-          <w:i w:val="0"/>
-          <w:color w:val="222222"/>
-          <w:sz w:val="21"/>
-        </w:rPr>
-        <w:t>: a named beast-friend whose shape the spirit always takes, and who refuses to die (1/day drops to 1 HP instead of 0).</w:t>
-      </w:r>
-    </w:p>
-    <w:p>
-      <w:pPr>
-        <w:keepNext/>
-        <w:spacing w:before="400" w:after="120"/>
-        <w:pBdr>
-          <w:bottom w:val="single" w:sz="6" w:space="4" w:color="B8860B"/>
-        </w:pBdr>
-      </w:pPr>
-      <w:r>
-        <w:rPr>
-          <w:rFonts w:ascii="Georgia" w:hAnsi="Georgia" w:cs="Georgia"/>
-          <w:b/>
-          <w:color w:val="B8860B"/>
-          <w:sz w:val="32"/>
-        </w:rPr>
-        <w:t>Glimmerstone Artifacts (Lilly's Path)</w:t>
+        <w:t>On this road, Boomstick takes the dagger's watch. Boomstick becomes Lilly's spellcasting focus and her designated Arcane Firearm (an artificer designates only one). With her shield in the other hand, her hands are exactly full: pistol, shield, and nothing wasted. The Frostbite Shard retires to her belt as a keepsake, or one day, a gift.</w:t>
       </w:r>
     </w:p>
     <w:p>
@@ -840,27 +2965,57 @@
           <w:color w:val="888888"/>
           <w:sz w:val="18"/>
         </w:rPr>
-        <w:t>The Boomstick, if Lilly walks the Glimmerspire road.</w:t>
+        <w:t>Boomstick, primed and opinionated.</w:t>
       </w:r>
     </w:p>
     <w:p>
       <w:pPr>
-        <w:spacing w:after="80"/>
+        <w:keepNext/>
+        <w:pBdr>
+          <w:left w:val="single" w:sz="18" w:space="12" w:color="8B2020"/>
+        </w:pBdr>
+        <w:shd w:val="clear" w:color="auto" w:fill="FCF6F6"/>
+        <w:spacing w:before="30" w:after="70"/>
+        <w:ind w:left="340" w:right="340"/>
+      </w:pPr>
+      <w:r>
+        <w:rPr>
+          <w:rFonts w:ascii="Georgia" w:hAnsi="Georgia" w:cs="Georgia"/>
+          <w:b/>
+          <w:color w:val="8B2020"/>
+          <w:sz w:val="22"/>
+        </w:rPr>
+        <w:t>Boomstick</w:t>
+      </w:r>
+    </w:p>
+    <w:p>
+      <w:pPr>
+        <w:pBdr>
+          <w:left w:val="single" w:sz="18" w:space="12" w:color="8B2020"/>
+        </w:pBdr>
+        <w:shd w:val="clear" w:color="auto" w:fill="FCF6F6"/>
+        <w:spacing w:before="30" w:after="70"/>
+        <w:ind w:left="340" w:right="340"/>
       </w:pPr>
       <w:r>
         <w:rPr>
           <w:rFonts w:ascii="Georgia" w:hAnsi="Georgia" w:cs="Georgia"/>
           <w:b w:val="0"/>
-          <w:i w:val="0"/>
+          <w:i/>
           <w:color w:val="222222"/>
-          <w:sz w:val="21"/>
+          <w:sz w:val="18"/>
         </w:rPr>
-        <w:t>Chosen at level 7 (full document: characters/path_rewards/glimmerstone_artifacts_v2.pdf). Every road keeps her at exactly three attunements.</w:t>
+        <w:t>Weapon (Repeating Pistol), Rare (Requires Attunement by an Artificer)</w:t>
       </w:r>
     </w:p>
     <w:p>
       <w:pPr>
-        <w:spacing w:after="80"/>
+        <w:pBdr>
+          <w:left w:val="single" w:sz="18" w:space="12" w:color="8B2020"/>
+        </w:pBdr>
+        <w:shd w:val="clear" w:color="auto" w:fill="FCF6F6"/>
+        <w:spacing w:before="30" w:after="70"/>
+        <w:ind w:left="340" w:right="340"/>
       </w:pPr>
       <w:r>
         <w:rPr>
@@ -868,9 +3023,9 @@
           <w:b/>
           <w:i w:val="0"/>
           <w:color w:val="222222"/>
-          <w:sz w:val="21"/>
+          <w:sz w:val="18"/>
         </w:rPr>
-        <w:t>The Sentinel</w:t>
+        <w:t>Repeating Pistol, +2.</w:t>
       </w:r>
       <w:r>
         <w:rPr>
@@ -878,13 +3033,188 @@
           <w:b w:val="0"/>
           <w:i w:val="0"/>
           <w:color w:val="222222"/>
-          <w:sz w:val="21"/>
+          <w:sz w:val="18"/>
         </w:rPr>
-        <w:t xml:space="preserve"> (the stay-and-build road): the Pocket Dynamo rebuilt into a Medium construct guardian. AC 18, HP 5 + 5 per level, no duration. Force Blast (120 ft., 2d8 + INT) or Electric Pulse (15 ft., jolts Reactions away); Guardian Protocol (reaction temp HP); self-mending; reboots with a spell slot if destroyed. Replaces the Eldritch Cannon while attuned.</w:t>
+        <w:t xml:space="preserve"> You gain a +2 bonus to attack and damage rolls made with this magic firearm. It deals 1d10 Thunder damage and never needs reloading or ammunition; its clockwork drum conjures its own rounds.</w:t>
       </w:r>
     </w:p>
     <w:p>
       <w:pPr>
+        <w:pBdr>
+          <w:left w:val="single" w:sz="18" w:space="12" w:color="8B2020"/>
+        </w:pBdr>
+        <w:shd w:val="clear" w:color="auto" w:fill="FCF6F6"/>
+        <w:spacing w:before="30" w:after="70"/>
+        <w:ind w:left="340" w:right="340"/>
+      </w:pPr>
+      <w:r>
+        <w:rPr>
+          <w:rFonts w:ascii="Georgia" w:hAnsi="Georgia" w:cs="Georgia"/>
+          <w:b/>
+          <w:i w:val="0"/>
+          <w:color w:val="222222"/>
+          <w:sz w:val="18"/>
+        </w:rPr>
+        <w:t>Wand of the War Mage.</w:t>
+      </w:r>
+      <w:r>
+        <w:rPr>
+          <w:rFonts w:ascii="Georgia" w:hAnsi="Georgia" w:cs="Georgia"/>
+          <w:b w:val="0"/>
+          <w:i w:val="0"/>
+          <w:color w:val="222222"/>
+          <w:sz w:val="18"/>
+        </w:rPr>
+        <w:t xml:space="preserve"> While holding Boomstick, you gain a +2 bonus to spell attack rolls, and you ignore Half Cover when making a spell attack. This also improves your Eldritch Cannon's attack rolls, since they use your spell attack modifier.</w:t>
+      </w:r>
+    </w:p>
+    <w:p>
+      <w:pPr>
+        <w:pBdr>
+          <w:left w:val="single" w:sz="18" w:space="12" w:color="8B2020"/>
+        </w:pBdr>
+        <w:shd w:val="clear" w:color="auto" w:fill="FCF6F6"/>
+        <w:spacing w:before="30" w:after="70"/>
+        <w:ind w:left="340" w:right="340"/>
+      </w:pPr>
+      <w:r>
+        <w:rPr>
+          <w:rFonts w:ascii="Georgia" w:hAnsi="Georgia" w:cs="Georgia"/>
+          <w:b/>
+          <w:i w:val="0"/>
+          <w:color w:val="222222"/>
+          <w:sz w:val="18"/>
+        </w:rPr>
+        <w:t>Spell Focus and Arcane Firearm.</w:t>
+      </w:r>
+      <w:r>
+        <w:rPr>
+          <w:rFonts w:ascii="Georgia" w:hAnsi="Georgia" w:cs="Georgia"/>
+          <w:b w:val="0"/>
+          <w:i w:val="0"/>
+          <w:color w:val="222222"/>
+          <w:sz w:val="18"/>
+        </w:rPr>
+        <w:t xml:space="preserve"> Boomstick serves as your artificer spellcasting focus and as your Arcane Firearm: you can add 1d8 to one damage roll of an artificer spell you cast through it, dealt as Thunder damage.</w:t>
+      </w:r>
+    </w:p>
+    <w:p>
+      <w:pPr>
+        <w:pBdr>
+          <w:left w:val="single" w:sz="18" w:space="12" w:color="8B2020"/>
+        </w:pBdr>
+        <w:shd w:val="clear" w:color="auto" w:fill="FCF6F6"/>
+        <w:spacing w:before="30" w:after="70"/>
+        <w:ind w:left="340" w:right="340"/>
+      </w:pPr>
+      <w:r>
+        <w:rPr>
+          <w:rFonts w:ascii="Georgia" w:hAnsi="Georgia" w:cs="Georgia"/>
+          <w:b/>
+          <w:i w:val="0"/>
+          <w:color w:val="222222"/>
+          <w:sz w:val="18"/>
+        </w:rPr>
+        <w:t>Concussion Infusion.</w:t>
+      </w:r>
+      <w:r>
+        <w:rPr>
+          <w:rFonts w:ascii="Georgia" w:hAnsi="Georgia" w:cs="Georgia"/>
+          <w:b w:val="0"/>
+          <w:i w:val="0"/>
+          <w:color w:val="222222"/>
+          <w:sz w:val="18"/>
+        </w:rPr>
+        <w:t xml:space="preserve"> When a creature takes damage from a spell you cast through Boomstick, it takes an additional 2 Thunder damage and can't take Reactions until the start of its next turn (the disorienting boom).</w:t>
+      </w:r>
+    </w:p>
+    <w:p>
+      <w:pPr>
+        <w:pBdr>
+          <w:left w:val="single" w:sz="18" w:space="12" w:color="8B2020"/>
+        </w:pBdr>
+        <w:shd w:val="clear" w:color="auto" w:fill="FCF6F6"/>
+        <w:spacing w:before="30" w:after="70"/>
+        <w:ind w:left="340" w:right="340"/>
+      </w:pPr>
+      <w:r>
+        <w:rPr>
+          <w:rFonts w:ascii="Georgia" w:hAnsi="Georgia" w:cs="Georgia"/>
+          <w:b/>
+          <w:i w:val="0"/>
+          <w:color w:val="222222"/>
+          <w:sz w:val="18"/>
+        </w:rPr>
+        <w:t>Made to Channel.</w:t>
+      </w:r>
+      <w:r>
+        <w:rPr>
+          <w:rFonts w:ascii="Georgia" w:hAnsi="Georgia" w:cs="Georgia"/>
+          <w:b w:val="0"/>
+          <w:i w:val="0"/>
+          <w:color w:val="222222"/>
+          <w:sz w:val="18"/>
+        </w:rPr>
+        <w:t xml:space="preserve"> When you cast True Strike through Boomstick, the shot uses your Intelligence, counts as a spell attack (gaining the +2 and ignoring Half Cover), and deals Boomstick's Thunder plus True Strike's Radiant. A reliable scaling shot that leaves your Bonus Action free for your cannon.</w:t>
+      </w:r>
+    </w:p>
+    <w:p>
+      <w:pPr>
+        <w:pBdr>
+          <w:left w:val="single" w:sz="18" w:space="12" w:color="8B2020"/>
+        </w:pBdr>
+        <w:shd w:val="clear" w:color="auto" w:fill="FCF6F6"/>
+        <w:spacing w:before="30" w:after="70"/>
+        <w:ind w:left="340" w:right="340"/>
+      </w:pPr>
+      <w:r>
+        <w:rPr>
+          <w:rFonts w:ascii="Georgia" w:hAnsi="Georgia" w:cs="Georgia"/>
+          <w:b w:val="0"/>
+          <w:i/>
+          <w:color w:val="222222"/>
+          <w:sz w:val="18"/>
+        </w:rPr>
+        <w:t>Forged by the masters of Glimmerstone.</w:t>
+      </w:r>
+    </w:p>
+    <w:p>
+      <w:pPr>
+        <w:keepNext/>
+        <w:spacing w:before="220" w:after="60"/>
+      </w:pPr>
+      <w:r>
+        <w:rPr>
+          <w:rFonts w:ascii="Georgia" w:hAnsi="Georgia" w:cs="Georgia"/>
+          <w:b/>
+          <w:color w:val="A0522D"/>
+          <w:sz w:val="26"/>
+        </w:rPr>
+        <w:t>The Awakened Essence Sphere</w:t>
+      </w:r>
+    </w:p>
+    <w:p>
+      <w:pPr>
+        <w:pBdr>
+          <w:left w:val="single" w:sz="18" w:space="12" w:color="B8860B"/>
+        </w:pBdr>
+        <w:shd w:val="clear" w:color="auto" w:fill="FBF6EA"/>
+        <w:spacing w:before="30" w:after="70"/>
+        <w:ind w:left="340" w:right="340"/>
+      </w:pPr>
+      <w:r>
+        <w:rPr>
+          <w:rFonts w:ascii="Georgia" w:hAnsi="Georgia" w:cs="Georgia"/>
+          <w:b w:val="0"/>
+          <w:i/>
+          <w:color w:val="222222"/>
+          <w:sz w:val="21"/>
+        </w:rPr>
+        <w:t>“It was never a keepsake. It was a key, and it is finally awake.”</w:t>
+      </w:r>
+    </w:p>
+    <w:p>
+      <w:pPr>
         <w:keepNext/>
         <w:spacing w:before="120" w:after="40"/>
         <w:jc w:val="center"/>
@@ -892,7 +3222,7 @@
       <w:r>
         <w:drawing>
           <wp:inline xmlns:a="http://schemas.openxmlformats.org/drawingml/2006/main" xmlns:pic="http://schemas.openxmlformats.org/drawingml/2006/picture">
-            <wp:extent cx="3108960" cy="3108960"/>
+            <wp:extent cx="3291840" cy="3291840"/>
             <wp:docPr id="5" name="Picture 5"/>
             <wp:cNvGraphicFramePr>
               <a:graphicFrameLocks noChangeAspect="1"/>
@@ -913,7 +3243,7 @@
                   <pic:spPr>
                     <a:xfrm>
                       <a:off x="0" y="0"/>
-                      <a:ext cx="3108960" cy="3108960"/>
+                      <a:ext cx="3291840" cy="3291840"/>
                     </a:xfrm>
                     <a:prstGeom prst="rect"/>
                   </pic:spPr>
@@ -936,23 +3266,13 @@
           <w:color w:val="888888"/>
           <w:sz w:val="18"/>
         </w:rPr>
-        <w:t>The Sentinel, the Pocket Dynamo rebuilt as a guardian.</w:t>
+        <w:t>The Sphere, drinking the loose light of the world.</w:t>
       </w:r>
     </w:p>
     <w:p>
       <w:pPr>
         <w:spacing w:after="80"/>
       </w:pPr>
-      <w:r>
-        <w:rPr>
-          <w:rFonts w:ascii="Georgia" w:hAnsi="Georgia" w:cs="Georgia"/>
-          <w:b/>
-          <w:i w:val="0"/>
-          <w:color w:val="222222"/>
-          <w:sz w:val="21"/>
-        </w:rPr>
-        <w:t>The Boomstick</w:t>
-      </w:r>
       <w:r>
         <w:rPr>
           <w:rFonts w:ascii="Georgia" w:hAnsi="Georgia" w:cs="Georgia"/>
@@ -961,12 +3281,57 @@
           <w:color w:val="222222"/>
           <w:sz w:val="21"/>
         </w:rPr>
-        <w:t xml:space="preserve"> (the Glimmerspire road): +2 repeating pistol, 1d10 thunder, never reloads; a Wand of the War Mage and Arcane Firearm (+1d8 thunder) in one; Concussion knockback; channels True Strike.</w:t>
+        <w:t>The Sphere has spent the whole journey quietly pulling loose motes from the air. Now awakened, it holds a swirling jumble of collected aether that powers it from the start, and as the party clears each elemental rift and installs its pure Mote, the Sphere learns that plane's mighty discharge.</w:t>
       </w:r>
     </w:p>
     <w:p>
       <w:pPr>
-        <w:spacing w:after="80"/>
+        <w:keepNext/>
+        <w:pBdr>
+          <w:left w:val="single" w:sz="18" w:space="12" w:color="8B2020"/>
+        </w:pBdr>
+        <w:shd w:val="clear" w:color="auto" w:fill="FCF6F6"/>
+        <w:spacing w:before="30" w:after="70"/>
+        <w:ind w:left="340" w:right="340"/>
+      </w:pPr>
+      <w:r>
+        <w:rPr>
+          <w:rFonts w:ascii="Georgia" w:hAnsi="Georgia" w:cs="Georgia"/>
+          <w:b/>
+          <w:color w:val="8B2020"/>
+          <w:sz w:val="22"/>
+        </w:rPr>
+        <w:t>The Awakened Essence Sphere</w:t>
+      </w:r>
+    </w:p>
+    <w:p>
+      <w:pPr>
+        <w:pBdr>
+          <w:left w:val="single" w:sz="18" w:space="12" w:color="8B2020"/>
+        </w:pBdr>
+        <w:shd w:val="clear" w:color="auto" w:fill="FCF6F6"/>
+        <w:spacing w:before="30" w:after="70"/>
+        <w:ind w:left="340" w:right="340"/>
+      </w:pPr>
+      <w:r>
+        <w:rPr>
+          <w:rFonts w:ascii="Georgia" w:hAnsi="Georgia" w:cs="Georgia"/>
+          <w:b w:val="0"/>
+          <w:i/>
+          <w:color w:val="222222"/>
+          <w:sz w:val="18"/>
+        </w:rPr>
+        <w:t>Wondrous Item, Rare (Requires Attunement). Mote Channeling.</w:t>
+      </w:r>
+    </w:p>
+    <w:p>
+      <w:pPr>
+        <w:pBdr>
+          <w:left w:val="single" w:sz="18" w:space="12" w:color="8B2020"/>
+        </w:pBdr>
+        <w:shd w:val="clear" w:color="auto" w:fill="FCF6F6"/>
+        <w:spacing w:before="30" w:after="70"/>
+        <w:ind w:left="340" w:right="340"/>
       </w:pPr>
       <w:r>
         <w:rPr>
@@ -974,9 +3339,9 @@
           <w:b/>
           <w:i w:val="0"/>
           <w:color w:val="222222"/>
-          <w:sz w:val="21"/>
+          <w:sz w:val="18"/>
         </w:rPr>
-        <w:t>The Awakened Essence Sphere</w:t>
+        <w:t>Mote Channeling.</w:t>
       </w:r>
       <w:r>
         <w:rPr>
@@ -984,26 +3349,322 @@
           <w:b w:val="0"/>
           <w:i w:val="0"/>
           <w:color w:val="222222"/>
-          <w:sz w:val="21"/>
+          <w:sz w:val="18"/>
         </w:rPr>
-        <w:t xml:space="preserve"> (the researcher road): Mote Channeling (2/short rest shared pool): a base Aether Ward (2d8 + INT temp HP to allies within 15 ft.) and five LOCKED elemental discharges, one unlocking per Mote installed in the Rift Portal's ring.</w:t>
+        <w:t xml:space="preserve"> You can use the Sphere's powers a total of 2 times per Short Rest (a shared pool). You start with the base Aether Ward and unlock one elemental discharge each time you install a rift's Mote. Where a save is called for, the DC is your spell save DC.</w:t>
       </w:r>
     </w:p>
     <w:p>
       <w:pPr>
+        <w:pBdr>
+          <w:left w:val="single" w:sz="18" w:space="12" w:color="8B2020"/>
+        </w:pBdr>
+        <w:shd w:val="clear" w:color="auto" w:fill="FCF6F6"/>
+        <w:spacing w:before="30" w:after="70"/>
+        <w:ind w:left="340" w:right="340"/>
+      </w:pPr>
+      <w:r>
+        <w:rPr>
+          <w:rFonts w:ascii="Georgia" w:hAnsi="Georgia" w:cs="Georgia"/>
+          <w:b/>
+          <w:i w:val="0"/>
+          <w:color w:val="222222"/>
+          <w:sz w:val="18"/>
+        </w:rPr>
+        <w:t>Base Power: Collected Aether. Aether Ward.</w:t>
+      </w:r>
+      <w:r>
+        <w:rPr>
+          <w:rFonts w:ascii="Georgia" w:hAnsi="Georgia" w:cs="Georgia"/>
+          <w:b w:val="0"/>
+          <w:i w:val="0"/>
+          <w:color w:val="222222"/>
+          <w:sz w:val="18"/>
+        </w:rPr>
+        <w:t xml:space="preserve"> Action. You and each ally within 15 feet gain 2d8 + your Intelligence modifier Temporary Hit Points as the gathered motes form a protective shell. (Available from the start.)</w:t>
+      </w:r>
+    </w:p>
+    <w:p>
+      <w:pPr>
+        <w:pBdr>
+          <w:left w:val="single" w:sz="18" w:space="12" w:color="8B2020"/>
+        </w:pBdr>
+        <w:shd w:val="clear" w:color="auto" w:fill="FCF6F6"/>
+        <w:spacing w:before="30" w:after="70"/>
+        <w:ind w:left="340" w:right="340"/>
+      </w:pPr>
+      <w:r>
+        <w:rPr>
+          <w:rFonts w:ascii="Georgia" w:hAnsi="Georgia" w:cs="Georgia"/>
+          <w:b/>
+          <w:i w:val="0"/>
+          <w:color w:val="222222"/>
+          <w:sz w:val="18"/>
+        </w:rPr>
+        <w:t>Rift Tracker.</w:t>
+      </w:r>
+      <w:r>
+        <w:rPr>
+          <w:rFonts w:ascii="Georgia" w:hAnsi="Georgia" w:cs="Georgia"/>
+          <w:b w:val="0"/>
+          <w:i w:val="0"/>
+          <w:color w:val="222222"/>
+          <w:sz w:val="18"/>
+        </w:rPr>
+        <w:t xml:space="preserve"> Mark each Mote as it comes home: Ignis, Unda, Aer, Terra, Umbra. Five rifts, five discharges, and a Sphere that remembers every one.</w:t>
+      </w:r>
+    </w:p>
+    <w:p>
+      <w:pPr>
         <w:keepNext/>
-        <w:spacing w:before="120" w:after="40"/>
-        <w:jc w:val="center"/>
+        <w:pBdr>
+          <w:left w:val="single" w:sz="18" w:space="12" w:color="8B2020"/>
+        </w:pBdr>
+        <w:shd w:val="clear" w:color="auto" w:fill="FCF6F6"/>
+        <w:spacing w:before="30" w:after="70"/>
+        <w:ind w:left="340" w:right="340"/>
+      </w:pPr>
+      <w:r>
+        <w:rPr>
+          <w:rFonts w:ascii="Georgia" w:hAnsi="Georgia" w:cs="Georgia"/>
+          <w:b/>
+          <w:color w:val="8B2020"/>
+          <w:sz w:val="22"/>
+        </w:rPr>
+        <w:t>Elemental Discharges</w:t>
+      </w:r>
+    </w:p>
+    <w:p>
+      <w:pPr>
+        <w:pBdr>
+          <w:left w:val="single" w:sz="18" w:space="12" w:color="8B2020"/>
+        </w:pBdr>
+        <w:shd w:val="clear" w:color="auto" w:fill="FCF6F6"/>
+        <w:spacing w:before="30" w:after="70"/>
+        <w:ind w:left="340" w:right="340"/>
+      </w:pPr>
+      <w:r>
+        <w:rPr>
+          <w:rFonts w:ascii="Georgia" w:hAnsi="Georgia" w:cs="Georgia"/>
+          <w:b w:val="0"/>
+          <w:i/>
+          <w:color w:val="222222"/>
+          <w:sz w:val="18"/>
+        </w:rPr>
+        <w:t>Each unlocks when its rift is cleared and its Mote installed. The menu grows as the campaign goes.</w:t>
+      </w:r>
+    </w:p>
+    <w:p>
+      <w:pPr>
+        <w:pBdr>
+          <w:left w:val="single" w:sz="18" w:space="12" w:color="8B2020"/>
+        </w:pBdr>
+        <w:shd w:val="clear" w:color="auto" w:fill="FCF6F6"/>
+        <w:spacing w:before="30" w:after="70"/>
+        <w:ind w:left="340" w:right="340"/>
+      </w:pPr>
+      <w:r>
+        <w:rPr>
+          <w:rFonts w:ascii="Georgia" w:hAnsi="Georgia" w:cs="Georgia"/>
+          <w:b/>
+          <w:i w:val="0"/>
+          <w:color w:val="222222"/>
+          <w:sz w:val="18"/>
+        </w:rPr>
+        <w:t>Fire / Ignis, Cinderstorm (LOCKED).</w:t>
+      </w:r>
+      <w:r>
+        <w:rPr>
+          <w:rFonts w:ascii="Georgia" w:hAnsi="Georgia" w:cs="Georgia"/>
+          <w:b w:val="0"/>
+          <w:i w:val="0"/>
+          <w:color w:val="222222"/>
+          <w:sz w:val="18"/>
+        </w:rPr>
+        <w:t xml:space="preserve"> Action. A 40-foot-radius firestorm within 120 feet. Each creature in the area makes a Dexterity saving throw, taking 8d6 Fire damage on a failed save, or half as much on a success. The area becomes burning terrain until the start of your next turn: difficult terrain, and any creature that enters it or starts its turn there takes 2d6 Fire damage.</w:t>
+      </w:r>
+    </w:p>
+    <w:p>
+      <w:pPr>
+        <w:pBdr>
+          <w:left w:val="single" w:sz="18" w:space="12" w:color="8B2020"/>
+        </w:pBdr>
+        <w:shd w:val="clear" w:color="auto" w:fill="FCF6F6"/>
+        <w:spacing w:before="30" w:after="70"/>
+        <w:ind w:left="340" w:right="340"/>
+      </w:pPr>
+      <w:r>
+        <w:rPr>
+          <w:rFonts w:ascii="Georgia" w:hAnsi="Georgia" w:cs="Georgia"/>
+          <w:b/>
+          <w:i w:val="0"/>
+          <w:color w:val="222222"/>
+          <w:sz w:val="18"/>
+        </w:rPr>
+        <w:t>Water / Unda, Drowning Surge (LOCKED).</w:t>
+      </w:r>
+      <w:r>
+        <w:rPr>
+          <w:rFonts w:ascii="Georgia" w:hAnsi="Georgia" w:cs="Georgia"/>
+          <w:b w:val="0"/>
+          <w:i w:val="0"/>
+          <w:color w:val="222222"/>
+          <w:sz w:val="18"/>
+        </w:rPr>
+        <w:t xml:space="preserve"> Action. A 30-foot Cone of crushing water. Each creature in the Cone makes a Constitution saving throw, taking 6d8 Cold damage on a failed save, or half as much on a success. On a failure, the creature also has the Prone condition and its Speed is halved until the end of its next turn.</w:t>
+      </w:r>
+    </w:p>
+    <w:p>
+      <w:pPr>
+        <w:pBdr>
+          <w:left w:val="single" w:sz="18" w:space="12" w:color="8B2020"/>
+        </w:pBdr>
+        <w:shd w:val="clear" w:color="auto" w:fill="FCF6F6"/>
+        <w:spacing w:before="30" w:after="70"/>
+        <w:ind w:left="340" w:right="340"/>
+      </w:pPr>
+      <w:r>
+        <w:rPr>
+          <w:rFonts w:ascii="Georgia" w:hAnsi="Georgia" w:cs="Georgia"/>
+          <w:b/>
+          <w:i w:val="0"/>
+          <w:color w:val="222222"/>
+          <w:sz w:val="18"/>
+        </w:rPr>
+        <w:t>Air / Aer, Cyclone (LOCKED).</w:t>
+      </w:r>
+      <w:r>
+        <w:rPr>
+          <w:rFonts w:ascii="Georgia" w:hAnsi="Georgia" w:cs="Georgia"/>
+          <w:b w:val="0"/>
+          <w:i w:val="0"/>
+          <w:color w:val="222222"/>
+          <w:sz w:val="18"/>
+        </w:rPr>
+        <w:t xml:space="preserve"> Action. A 30-foot-radius whirlwind within 120 feet. Each creature in the area makes a Strength saving throw, taking 6d8 Thunder damage on a failed save, or half as much on a success. On a failure, the creature is also flung 20 feet and has the Prone condition.</w:t>
+      </w:r>
+    </w:p>
+    <w:p>
+      <w:pPr>
+        <w:pBdr>
+          <w:left w:val="single" w:sz="18" w:space="12" w:color="8B2020"/>
+        </w:pBdr>
+        <w:shd w:val="clear" w:color="auto" w:fill="FCF6F6"/>
+        <w:spacing w:before="30" w:after="70"/>
+        <w:ind w:left="340" w:right="340"/>
+      </w:pPr>
+      <w:r>
+        <w:rPr>
+          <w:rFonts w:ascii="Georgia" w:hAnsi="Georgia" w:cs="Georgia"/>
+          <w:b/>
+          <w:i w:val="0"/>
+          <w:color w:val="222222"/>
+          <w:sz w:val="18"/>
+        </w:rPr>
+        <w:t>Earth / Terra, Tectonic Slam (LOCKED).</w:t>
+      </w:r>
+      <w:r>
+        <w:rPr>
+          <w:rFonts w:ascii="Georgia" w:hAnsi="Georgia" w:cs="Georgia"/>
+          <w:b w:val="0"/>
+          <w:i w:val="0"/>
+          <w:color w:val="222222"/>
+          <w:sz w:val="18"/>
+        </w:rPr>
+        <w:t xml:space="preserve"> Action. A 20-foot-radius eruption within 120 feet. Each creature in the area makes a Dexterity saving throw, taking 7d8 Force damage on a failed save; creatures that fail also have the Prone condition. The area becomes a Jagged Field until your next turn: difficult terrain that deals 5 Piercing damage for every 5 feet a creature travels through it, and you and your allies in the area have Half Cover from the raised stone.</w:t>
+      </w:r>
+    </w:p>
+    <w:p>
+      <w:pPr>
+        <w:pBdr>
+          <w:left w:val="single" w:sz="18" w:space="12" w:color="8B2020"/>
+        </w:pBdr>
+        <w:shd w:val="clear" w:color="auto" w:fill="FCF6F6"/>
+        <w:spacing w:before="30" w:after="70"/>
+        <w:ind w:left="340" w:right="340"/>
+      </w:pPr>
+      <w:r>
+        <w:rPr>
+          <w:rFonts w:ascii="Georgia" w:hAnsi="Georgia" w:cs="Georgia"/>
+          <w:b/>
+          <w:i w:val="0"/>
+          <w:color w:val="222222"/>
+          <w:sz w:val="18"/>
+        </w:rPr>
+        <w:t>Shadow / Umbra, Soul Siphon (LOCKED).</w:t>
+      </w:r>
+      <w:r>
+        <w:rPr>
+          <w:rFonts w:ascii="Georgia" w:hAnsi="Georgia" w:cs="Georgia"/>
+          <w:b w:val="0"/>
+          <w:i w:val="0"/>
+          <w:color w:val="222222"/>
+          <w:sz w:val="18"/>
+        </w:rPr>
+        <w:t xml:space="preserve"> Action. One creature within 60 feet (or split the dice among up to three). Each target makes a Constitution saving throw, taking 8d6 Necrotic damage on a failed save, or half as much on a success. You regain Hit Points (or grant them to an ally within 30 feet) equal to half the Necrotic damage dealt.</w:t>
+      </w:r>
+    </w:p>
+    <w:p>
+      <w:pPr>
+        <w:keepNext/>
+        <w:spacing w:before="220" w:after="60"/>
+      </w:pPr>
+      <w:r>
+        <w:rPr>
+          <w:rFonts w:ascii="Georgia" w:hAnsi="Georgia" w:cs="Georgia"/>
+          <w:b/>
+          <w:color w:val="A0522D"/>
+          <w:sz w:val="26"/>
+        </w:rPr>
+        <w:t>The Sentinel</w:t>
+      </w:r>
+    </w:p>
+    <w:p>
+      <w:pPr>
+        <w:pBdr>
+          <w:left w:val="single" w:sz="18" w:space="12" w:color="B8860B"/>
+        </w:pBdr>
+        <w:shd w:val="clear" w:color="auto" w:fill="FBF6EA"/>
+        <w:spacing w:before="30" w:after="70"/>
+        <w:ind w:left="340" w:right="340"/>
+      </w:pPr>
+      <w:r>
+        <w:rPr>
+          <w:rFonts w:ascii="Georgia" w:hAnsi="Georgia" w:cs="Georgia"/>
+          <w:b w:val="0"/>
+          <w:i/>
+          <w:color w:val="222222"/>
+          <w:sz w:val="21"/>
+        </w:rPr>
+        <w:t>“An upgraded Eldritch Cannon, rebuilt at the bench into a faithful guardian.”</w:t>
+      </w:r>
+    </w:p>
+    <w:p>
+      <w:pPr>
+        <w:keepNext/>
+        <w:pBdr>
+          <w:left w:val="single" w:sz="18" w:space="12" w:color="8B2020"/>
+        </w:pBdr>
+        <w:shd w:val="clear" w:color="auto" w:fill="FCF6F6"/>
+        <w:spacing w:before="30" w:after="0"/>
+        <w:ind w:left="340" w:right="340"/>
       </w:pPr>
       <w:r>
         <w:drawing>
-          <wp:inline xmlns:a="http://schemas.openxmlformats.org/drawingml/2006/main" xmlns:pic="http://schemas.openxmlformats.org/drawingml/2006/picture">
-            <wp:extent cx="3291840" cy="3291840"/>
+          <wp:anchor xmlns:a="http://schemas.openxmlformats.org/drawingml/2006/main" behindDoc="0" distT="0" distB="0" distL="114300" distR="0" simplePos="0" locked="0" layoutInCell="1" allowOverlap="1" relativeHeight="2">
+            <wp:simplePos x="0" y="0"/>
+            <wp:positionH relativeFrom="column">
+              <wp:align>right</wp:align>
+            </wp:positionH>
+            <wp:positionV relativeFrom="paragraph">
+              <wp:posOffset>0</wp:posOffset>
+            </wp:positionV>
+            <wp:extent cx="2148840" cy="2148840"/>
+            <wp:effectExtent l="0" t="0" r="0" b="0"/>
+            <wp:wrapSquare wrapText="bothSides"/>
             <wp:docPr id="6" name="Picture 6"/>
-            <wp:cNvGraphicFramePr>
-              <a:graphicFrameLocks noChangeAspect="1"/>
-            </wp:cNvGraphicFramePr>
-            <a:graphic>
+            <wp:cNvGraphicFramePr/>
+            <a:graphic xmlns:pic="http://schemas.openxmlformats.org/drawingml/2006/picture">
               <a:graphicData uri="http://schemas.openxmlformats.org/drawingml/2006/picture">
                 <pic:pic>
                   <pic:nvPicPr>
@@ -1019,30 +3680,693 @@
                   <pic:spPr>
                     <a:xfrm>
                       <a:off x="0" y="0"/>
-                      <a:ext cx="3291840" cy="3291840"/>
+                      <a:ext cx="2148840" cy="2148840"/>
                     </a:xfrm>
                     <a:prstGeom prst="rect"/>
                   </pic:spPr>
                 </pic:pic>
               </a:graphicData>
             </a:graphic>
-          </wp:inline>
+          </wp:anchor>
         </w:drawing>
+      </w:r>
+      <w:r>
+        <w:rPr>
+          <w:rFonts w:ascii="Georgia" w:hAnsi="Georgia" w:cs="Georgia"/>
+          <w:b/>
+          <w:color w:val="8B2020"/>
+          <w:sz w:val="25"/>
+        </w:rPr>
+        <w:t>The Sentinel</w:t>
       </w:r>
     </w:p>
     <w:p>
       <w:pPr>
-        <w:spacing w:after="140"/>
-        <w:jc w:val="center"/>
+        <w:pBdr>
+          <w:left w:val="single" w:sz="18" w:space="12" w:color="8B2020"/>
+        </w:pBdr>
+        <w:shd w:val="clear" w:color="auto" w:fill="FCF6F6"/>
+        <w:spacing w:before="0" w:after="20"/>
+        <w:ind w:left="340" w:right="340"/>
       </w:pPr>
       <w:r>
         <w:rPr>
           <w:rFonts w:ascii="Georgia" w:hAnsi="Georgia" w:cs="Georgia"/>
           <w:i/>
-          <w:color w:val="888888"/>
+          <w:color w:val="222222"/>
+          <w:sz w:val="17"/>
+        </w:rPr>
+        <w:t>Medium Construct (the Pocket Dynamo, rebuilt; Requires Attunement by Lilly)</w:t>
+      </w:r>
+    </w:p>
+    <w:p>
+      <w:pPr>
+        <w:pBdr>
+          <w:left w:val="single" w:sz="18" w:space="12" w:color="8B2020"/>
+          <w:bottom w:val="single" w:sz="4" w:space="1" w:color="8B2020"/>
+        </w:pBdr>
+        <w:shd w:val="clear" w:color="auto" w:fill="FCF6F6"/>
+        <w:spacing w:before="20" w:after="20"/>
+        <w:ind w:left="340" w:right="340"/>
+      </w:pPr>
+    </w:p>
+    <w:p>
+      <w:pPr>
+        <w:pBdr>
+          <w:left w:val="single" w:sz="18" w:space="12" w:color="8B2020"/>
+        </w:pBdr>
+        <w:shd w:val="clear" w:color="auto" w:fill="FCF6F6"/>
+        <w:spacing w:before="0" w:after="0"/>
+        <w:ind w:left="340" w:right="340"/>
+      </w:pPr>
+      <w:r>
+        <w:rPr>
+          <w:rFonts w:ascii="Georgia" w:hAnsi="Georgia" w:cs="Georgia"/>
+          <w:b/>
+          <w:color w:val="8B2020"/>
           <w:sz w:val="18"/>
         </w:rPr>
-        <w:t>The Awakened Essence Sphere.</w:t>
+        <w:t xml:space="preserve">Armor Class </w:t>
+      </w:r>
+      <w:r>
+        <w:rPr>
+          <w:rFonts w:ascii="Georgia" w:hAnsi="Georgia" w:cs="Georgia"/>
+          <w:b w:val="0"/>
+          <w:i w:val="0"/>
+          <w:color w:val="222222"/>
+          <w:sz w:val="18"/>
+        </w:rPr>
+        <w:t>18</w:t>
+      </w:r>
+    </w:p>
+    <w:p>
+      <w:pPr>
+        <w:pBdr>
+          <w:left w:val="single" w:sz="18" w:space="12" w:color="8B2020"/>
+        </w:pBdr>
+        <w:shd w:val="clear" w:color="auto" w:fill="FCF6F6"/>
+        <w:spacing w:before="0" w:after="0"/>
+        <w:ind w:left="340" w:right="340"/>
+      </w:pPr>
+      <w:r>
+        <w:rPr>
+          <w:rFonts w:ascii="Georgia" w:hAnsi="Georgia" w:cs="Georgia"/>
+          <w:b/>
+          <w:color w:val="8B2020"/>
+          <w:sz w:val="18"/>
+        </w:rPr>
+        <w:t xml:space="preserve">Hit Points </w:t>
+      </w:r>
+      <w:r>
+        <w:rPr>
+          <w:rFonts w:ascii="Georgia" w:hAnsi="Georgia" w:cs="Georgia"/>
+          <w:b w:val="0"/>
+          <w:i w:val="0"/>
+          <w:color w:val="222222"/>
+          <w:sz w:val="18"/>
+        </w:rPr>
+        <w:t>5 + five times your artificer level (40 at Level 7); it has a number of d8 Hit Dice equal to your artificer level</w:t>
+      </w:r>
+    </w:p>
+    <w:p>
+      <w:pPr>
+        <w:pBdr>
+          <w:left w:val="single" w:sz="18" w:space="12" w:color="8B2020"/>
+        </w:pBdr>
+        <w:shd w:val="clear" w:color="auto" w:fill="FCF6F6"/>
+        <w:spacing w:before="0" w:after="0"/>
+        <w:ind w:left="340" w:right="340"/>
+      </w:pPr>
+      <w:r>
+        <w:rPr>
+          <w:rFonts w:ascii="Georgia" w:hAnsi="Georgia" w:cs="Georgia"/>
+          <w:b/>
+          <w:color w:val="8B2020"/>
+          <w:sz w:val="18"/>
+        </w:rPr>
+        <w:t xml:space="preserve">Speed </w:t>
+      </w:r>
+      <w:r>
+        <w:rPr>
+          <w:rFonts w:ascii="Georgia" w:hAnsi="Georgia" w:cs="Georgia"/>
+          <w:b w:val="0"/>
+          <w:i w:val="0"/>
+          <w:color w:val="222222"/>
+          <w:sz w:val="18"/>
+        </w:rPr>
+        <w:t>30 ft.</w:t>
+      </w:r>
+    </w:p>
+    <w:p>
+      <w:pPr>
+        <w:pBdr>
+          <w:left w:val="single" w:sz="18" w:space="12" w:color="8B2020"/>
+          <w:bottom w:val="single" w:sz="4" w:space="1" w:color="8B2020"/>
+        </w:pBdr>
+        <w:shd w:val="clear" w:color="auto" w:fill="FCF6F6"/>
+        <w:spacing w:before="20" w:after="20"/>
+        <w:ind w:left="340" w:right="340"/>
+      </w:pPr>
+    </w:p>
+    <w:p>
+      <w:pPr>
+        <w:pBdr>
+          <w:left w:val="single" w:sz="18" w:space="12" w:color="8B2020"/>
+        </w:pBdr>
+        <w:shd w:val="clear" w:color="auto" w:fill="FCF6F6"/>
+        <w:spacing w:before="30" w:after="20"/>
+        <w:ind w:left="340" w:right="340"/>
+      </w:pPr>
+      <w:r>
+        <w:rPr>
+          <w:rFonts w:ascii="Georgia" w:hAnsi="Georgia" w:cs="Georgia"/>
+          <w:b/>
+          <w:color w:val="8B2020"/>
+          <w:sz w:val="18"/>
+        </w:rPr>
+        <w:t xml:space="preserve">STR </w:t>
+      </w:r>
+      <w:r>
+        <w:rPr>
+          <w:rFonts w:ascii="Georgia" w:hAnsi="Georgia" w:cs="Georgia"/>
+          <w:color w:val="222222"/>
+          <w:sz w:val="18"/>
+        </w:rPr>
+        <w:t>14 (+2)</w:t>
+      </w:r>
+      <w:r>
+        <w:rPr>
+          <w:rFonts w:ascii="Georgia" w:hAnsi="Georgia" w:cs="Georgia"/>
+          <w:b/>
+          <w:color w:val="8B2020"/>
+          <w:sz w:val="18"/>
+        </w:rPr>
+        <w:t xml:space="preserve">   DEX </w:t>
+      </w:r>
+      <w:r>
+        <w:rPr>
+          <w:rFonts w:ascii="Georgia" w:hAnsi="Georgia" w:cs="Georgia"/>
+          <w:color w:val="222222"/>
+          <w:sz w:val="18"/>
+        </w:rPr>
+        <w:t>10 (+0)</w:t>
+      </w:r>
+      <w:r>
+        <w:rPr>
+          <w:rFonts w:ascii="Georgia" w:hAnsi="Georgia" w:cs="Georgia"/>
+          <w:b/>
+          <w:color w:val="8B2020"/>
+          <w:sz w:val="18"/>
+        </w:rPr>
+        <w:t xml:space="preserve">   CON </w:t>
+      </w:r>
+      <w:r>
+        <w:rPr>
+          <w:rFonts w:ascii="Georgia" w:hAnsi="Georgia" w:cs="Georgia"/>
+          <w:color w:val="222222"/>
+          <w:sz w:val="18"/>
+        </w:rPr>
+        <w:t>16 (+3)</w:t>
+      </w:r>
+      <w:r>
+        <w:rPr>
+          <w:rFonts w:ascii="Georgia" w:hAnsi="Georgia" w:cs="Georgia"/>
+          <w:b/>
+          <w:color w:val="8B2020"/>
+          <w:sz w:val="18"/>
+        </w:rPr>
+        <w:t xml:space="preserve">   INT </w:t>
+      </w:r>
+      <w:r>
+        <w:rPr>
+          <w:rFonts w:ascii="Georgia" w:hAnsi="Georgia" w:cs="Georgia"/>
+          <w:color w:val="222222"/>
+          <w:sz w:val="18"/>
+        </w:rPr>
+        <w:t>4 (-3)</w:t>
+      </w:r>
+      <w:r>
+        <w:rPr>
+          <w:rFonts w:ascii="Georgia" w:hAnsi="Georgia" w:cs="Georgia"/>
+          <w:b/>
+          <w:color w:val="8B2020"/>
+          <w:sz w:val="18"/>
+        </w:rPr>
+        <w:t xml:space="preserve">   WIS </w:t>
+      </w:r>
+      <w:r>
+        <w:rPr>
+          <w:rFonts w:ascii="Georgia" w:hAnsi="Georgia" w:cs="Georgia"/>
+          <w:color w:val="222222"/>
+          <w:sz w:val="18"/>
+        </w:rPr>
+        <w:t>12 (+1)</w:t>
+      </w:r>
+      <w:r>
+        <w:rPr>
+          <w:rFonts w:ascii="Georgia" w:hAnsi="Georgia" w:cs="Georgia"/>
+          <w:b/>
+          <w:color w:val="8B2020"/>
+          <w:sz w:val="18"/>
+        </w:rPr>
+        <w:t xml:space="preserve">   CHA </w:t>
+      </w:r>
+      <w:r>
+        <w:rPr>
+          <w:rFonts w:ascii="Georgia" w:hAnsi="Georgia" w:cs="Georgia"/>
+          <w:color w:val="222222"/>
+          <w:sz w:val="18"/>
+        </w:rPr>
+        <w:t>6 (-2)</w:t>
+      </w:r>
+    </w:p>
+    <w:p>
+      <w:pPr>
+        <w:pBdr>
+          <w:left w:val="single" w:sz="18" w:space="12" w:color="8B2020"/>
+          <w:bottom w:val="single" w:sz="4" w:space="1" w:color="8B2020"/>
+        </w:pBdr>
+        <w:shd w:val="clear" w:color="auto" w:fill="FCF6F6"/>
+        <w:spacing w:before="20" w:after="20"/>
+        <w:ind w:left="340" w:right="340"/>
+      </w:pPr>
+    </w:p>
+    <w:p>
+      <w:pPr>
+        <w:pBdr>
+          <w:left w:val="single" w:sz="18" w:space="12" w:color="8B2020"/>
+        </w:pBdr>
+        <w:shd w:val="clear" w:color="auto" w:fill="FCF6F6"/>
+        <w:spacing w:before="0" w:after="0"/>
+        <w:ind w:left="340" w:right="340"/>
+      </w:pPr>
+      <w:r>
+        <w:rPr>
+          <w:rFonts w:ascii="Georgia" w:hAnsi="Georgia" w:cs="Georgia"/>
+          <w:b/>
+          <w:color w:val="8B2020"/>
+          <w:sz w:val="18"/>
+        </w:rPr>
+        <w:t xml:space="preserve">Damage Immunities </w:t>
+      </w:r>
+      <w:r>
+        <w:rPr>
+          <w:rFonts w:ascii="Georgia" w:hAnsi="Georgia" w:cs="Georgia"/>
+          <w:b w:val="0"/>
+          <w:i w:val="0"/>
+          <w:color w:val="222222"/>
+          <w:sz w:val="18"/>
+        </w:rPr>
+        <w:t>Poison</w:t>
+      </w:r>
+    </w:p>
+    <w:p>
+      <w:pPr>
+        <w:pBdr>
+          <w:left w:val="single" w:sz="18" w:space="12" w:color="8B2020"/>
+        </w:pBdr>
+        <w:shd w:val="clear" w:color="auto" w:fill="FCF6F6"/>
+        <w:spacing w:before="0" w:after="0"/>
+        <w:ind w:left="340" w:right="340"/>
+      </w:pPr>
+      <w:r>
+        <w:rPr>
+          <w:rFonts w:ascii="Georgia" w:hAnsi="Georgia" w:cs="Georgia"/>
+          <w:b/>
+          <w:color w:val="8B2020"/>
+          <w:sz w:val="18"/>
+        </w:rPr>
+        <w:t xml:space="preserve">Condition Immunities </w:t>
+      </w:r>
+      <w:r>
+        <w:rPr>
+          <w:rFonts w:ascii="Georgia" w:hAnsi="Georgia" w:cs="Georgia"/>
+          <w:b w:val="0"/>
+          <w:i w:val="0"/>
+          <w:color w:val="222222"/>
+          <w:sz w:val="18"/>
+        </w:rPr>
+        <w:t>Charmed, Exhaustion, Poisoned</w:t>
+      </w:r>
+    </w:p>
+    <w:p>
+      <w:pPr>
+        <w:pBdr>
+          <w:left w:val="single" w:sz="18" w:space="12" w:color="8B2020"/>
+        </w:pBdr>
+        <w:shd w:val="clear" w:color="auto" w:fill="FCF6F6"/>
+        <w:spacing w:before="0" w:after="0"/>
+        <w:ind w:left="340" w:right="340"/>
+      </w:pPr>
+      <w:r>
+        <w:rPr>
+          <w:rFonts w:ascii="Georgia" w:hAnsi="Georgia" w:cs="Georgia"/>
+          <w:b/>
+          <w:color w:val="8B2020"/>
+          <w:sz w:val="18"/>
+        </w:rPr>
+        <w:t xml:space="preserve">Senses </w:t>
+      </w:r>
+      <w:r>
+        <w:rPr>
+          <w:rFonts w:ascii="Georgia" w:hAnsi="Georgia" w:cs="Georgia"/>
+          <w:b w:val="0"/>
+          <w:i w:val="0"/>
+          <w:color w:val="222222"/>
+          <w:sz w:val="18"/>
+        </w:rPr>
+        <w:t>Darkvision 60 ft., Passive Perception 11</w:t>
+      </w:r>
+    </w:p>
+    <w:p>
+      <w:pPr>
+        <w:pBdr>
+          <w:left w:val="single" w:sz="18" w:space="12" w:color="8B2020"/>
+        </w:pBdr>
+        <w:shd w:val="clear" w:color="auto" w:fill="FCF6F6"/>
+        <w:spacing w:before="0" w:after="0"/>
+        <w:ind w:left="340" w:right="340"/>
+      </w:pPr>
+      <w:r>
+        <w:rPr>
+          <w:rFonts w:ascii="Georgia" w:hAnsi="Georgia" w:cs="Georgia"/>
+          <w:b/>
+          <w:color w:val="8B2020"/>
+          <w:sz w:val="18"/>
+        </w:rPr>
+        <w:t xml:space="preserve">Languages </w:t>
+      </w:r>
+      <w:r>
+        <w:rPr>
+          <w:rFonts w:ascii="Georgia" w:hAnsi="Georgia" w:cs="Georgia"/>
+          <w:b w:val="0"/>
+          <w:i w:val="0"/>
+          <w:color w:val="222222"/>
+          <w:sz w:val="18"/>
+        </w:rPr>
+        <w:t>understands the languages you know</w:t>
+      </w:r>
+    </w:p>
+    <w:p>
+      <w:pPr>
+        <w:pBdr>
+          <w:left w:val="single" w:sz="18" w:space="12" w:color="8B2020"/>
+        </w:pBdr>
+        <w:shd w:val="clear" w:color="auto" w:fill="FCF6F6"/>
+        <w:spacing w:before="30" w:after="20"/>
+        <w:ind w:left="340" w:right="340"/>
+      </w:pPr>
+      <w:r>
+        <w:rPr>
+          <w:rFonts w:ascii="Georgia" w:hAnsi="Georgia" w:cs="Georgia"/>
+          <w:b/>
+          <w:i/>
+          <w:color w:val="222222"/>
+          <w:sz w:val="18"/>
+        </w:rPr>
+        <w:t xml:space="preserve">Duration. </w:t>
+      </w:r>
+      <w:r>
+        <w:rPr>
+          <w:rFonts w:ascii="Georgia" w:hAnsi="Georgia" w:cs="Georgia"/>
+          <w:b w:val="0"/>
+          <w:i w:val="0"/>
+          <w:color w:val="222222"/>
+          <w:sz w:val="18"/>
+        </w:rPr>
+        <w:t>None: it stays until it drops to 0 Hit Points or you dismiss it (no action required); deploy or recall it as a Bonus Action.</w:t>
+      </w:r>
+    </w:p>
+    <w:p>
+      <w:pPr>
+        <w:pBdr>
+          <w:left w:val="single" w:sz="18" w:space="12" w:color="8B2020"/>
+        </w:pBdr>
+        <w:shd w:val="clear" w:color="auto" w:fill="FCF6F6"/>
+        <w:spacing w:before="30" w:after="20"/>
+        <w:ind w:left="340" w:right="340"/>
+      </w:pPr>
+      <w:r>
+        <w:rPr>
+          <w:rFonts w:ascii="Georgia" w:hAnsi="Georgia" w:cs="Georgia"/>
+          <w:b/>
+          <w:i/>
+          <w:color w:val="222222"/>
+          <w:sz w:val="18"/>
+        </w:rPr>
+        <w:t xml:space="preserve">Bound Construct. </w:t>
+      </w:r>
+      <w:r>
+        <w:rPr>
+          <w:rFonts w:ascii="Georgia" w:hAnsi="Georgia" w:cs="Georgia"/>
+          <w:b w:val="0"/>
+          <w:i w:val="0"/>
+          <w:color w:val="222222"/>
+          <w:sz w:val="18"/>
+        </w:rPr>
+        <w:t>Add your Proficiency Bonus to any ability check or saving throw the Sentinel makes.</w:t>
+      </w:r>
+    </w:p>
+    <w:p>
+      <w:pPr>
+        <w:pBdr>
+          <w:left w:val="single" w:sz="18" w:space="12" w:color="8B2020"/>
+        </w:pBdr>
+        <w:shd w:val="clear" w:color="auto" w:fill="FCF6F6"/>
+        <w:spacing w:before="30" w:after="20"/>
+        <w:ind w:left="340" w:right="340"/>
+      </w:pPr>
+      <w:r>
+        <w:rPr>
+          <w:rFonts w:ascii="Georgia" w:hAnsi="Georgia" w:cs="Georgia"/>
+          <w:b/>
+          <w:i/>
+          <w:color w:val="222222"/>
+          <w:sz w:val="18"/>
+        </w:rPr>
+        <w:t xml:space="preserve">Rebuilt Dynamo. </w:t>
+      </w:r>
+      <w:r>
+        <w:rPr>
+          <w:rFonts w:ascii="Georgia" w:hAnsi="Georgia" w:cs="Georgia"/>
+          <w:b w:val="0"/>
+          <w:i w:val="0"/>
+          <w:color w:val="222222"/>
+          <w:sz w:val="18"/>
+        </w:rPr>
+        <w:t>The Sentinel is Lilly's Eldritch Cannon feature, rebuilt: while attuned, she deploys the Sentinel instead of a cannon (never both). The Dynamo's gifts live on inside it: free deployment, no duration, and a hotter frame: the old cannon threw 2d8 flat, the Dynamo warmed that to 2d8+2, and the Sentinel's blasts now carry her full Intelligence (2d8+5). Mending repairs it 2d6, and if it ever drops to 0 Hit Points, she reboots it with a spell slot of 1st level or higher, just as a cannon is rebuilt.</w:t>
+      </w:r>
+    </w:p>
+    <w:p>
+      <w:pPr>
+        <w:pBdr>
+          <w:left w:val="single" w:sz="18" w:space="12" w:color="8B2020"/>
+          <w:bottom w:val="single" w:sz="4" w:space="1" w:color="8B2020"/>
+        </w:pBdr>
+        <w:shd w:val="clear" w:color="auto" w:fill="FCF6F6"/>
+        <w:spacing w:before="20" w:after="20"/>
+        <w:ind w:left="340" w:right="340"/>
+      </w:pPr>
+    </w:p>
+    <w:p>
+      <w:pPr>
+        <w:keepNext/>
+        <w:pBdr>
+          <w:left w:val="single" w:sz="18" w:space="12" w:color="8B2020"/>
+        </w:pBdr>
+        <w:shd w:val="clear" w:color="auto" w:fill="FCF6F6"/>
+        <w:spacing w:before="30" w:after="20"/>
+        <w:ind w:left="340" w:right="340"/>
+      </w:pPr>
+      <w:r>
+        <w:rPr>
+          <w:rFonts w:ascii="Georgia" w:hAnsi="Georgia" w:cs="Georgia"/>
+          <w:b/>
+          <w:color w:val="8B2020"/>
+          <w:sz w:val="20"/>
+        </w:rPr>
+        <w:t>Actions</w:t>
+      </w:r>
+    </w:p>
+    <w:p>
+      <w:pPr>
+        <w:pBdr>
+          <w:left w:val="single" w:sz="18" w:space="12" w:color="8B2020"/>
+        </w:pBdr>
+        <w:shd w:val="clear" w:color="auto" w:fill="FCF6F6"/>
+        <w:spacing w:before="30" w:after="20"/>
+        <w:ind w:left="340" w:right="340"/>
+      </w:pPr>
+      <w:r>
+        <w:rPr>
+          <w:rFonts w:ascii="Georgia" w:hAnsi="Georgia" w:cs="Georgia"/>
+          <w:b/>
+          <w:i/>
+          <w:color w:val="222222"/>
+          <w:sz w:val="18"/>
+        </w:rPr>
+        <w:t xml:space="preserve">Activate. </w:t>
+      </w:r>
+      <w:r>
+        <w:rPr>
+          <w:rFonts w:ascii="Georgia" w:hAnsi="Georgia" w:cs="Georgia"/>
+          <w:b w:val="0"/>
+          <w:i w:val="0"/>
+          <w:color w:val="222222"/>
+          <w:sz w:val="18"/>
+        </w:rPr>
+        <w:t>On your turn you can use a Bonus Action to activate the Sentinel. When you do, it takes one of the following actions of your choice.</w:t>
+      </w:r>
+    </w:p>
+    <w:p>
+      <w:pPr>
+        <w:pBdr>
+          <w:left w:val="single" w:sz="18" w:space="12" w:color="8B2020"/>
+        </w:pBdr>
+        <w:shd w:val="clear" w:color="auto" w:fill="FCF6F6"/>
+        <w:spacing w:before="30" w:after="20"/>
+        <w:ind w:left="340" w:right="340"/>
+      </w:pPr>
+      <w:r>
+        <w:rPr>
+          <w:rFonts w:ascii="Georgia" w:hAnsi="Georgia" w:cs="Georgia"/>
+          <w:b/>
+          <w:i/>
+          <w:color w:val="222222"/>
+          <w:sz w:val="18"/>
+        </w:rPr>
+        <w:t xml:space="preserve">Force Blast. </w:t>
+      </w:r>
+      <w:r>
+        <w:rPr>
+          <w:rFonts w:ascii="Georgia" w:hAnsi="Georgia" w:cs="Georgia"/>
+          <w:b w:val="0"/>
+          <w:i w:val="0"/>
+          <w:color w:val="222222"/>
+          <w:sz w:val="18"/>
+        </w:rPr>
+        <w:t>Ranged Attack Roll: your spell attack modifier, range 120 feet. Hit: 2d8 + your Intelligence modifier Force damage.</w:t>
+      </w:r>
+    </w:p>
+    <w:p>
+      <w:pPr>
+        <w:pBdr>
+          <w:left w:val="single" w:sz="18" w:space="12" w:color="8B2020"/>
+        </w:pBdr>
+        <w:shd w:val="clear" w:color="auto" w:fill="FCF6F6"/>
+        <w:spacing w:before="30" w:after="20"/>
+        <w:ind w:left="340" w:right="340"/>
+      </w:pPr>
+      <w:r>
+        <w:rPr>
+          <w:rFonts w:ascii="Georgia" w:hAnsi="Georgia" w:cs="Georgia"/>
+          <w:b/>
+          <w:i/>
+          <w:color w:val="222222"/>
+          <w:sz w:val="18"/>
+        </w:rPr>
+        <w:t xml:space="preserve">Electric Pulse. </w:t>
+      </w:r>
+      <w:r>
+        <w:rPr>
+          <w:rFonts w:ascii="Georgia" w:hAnsi="Georgia" w:cs="Georgia"/>
+          <w:b w:val="0"/>
+          <w:i w:val="0"/>
+          <w:color w:val="222222"/>
+          <w:sz w:val="18"/>
+        </w:rPr>
+        <w:t>Lightning arcs from the Sentinel's core. Each creature of your choice within 15 feet of the Sentinel makes a Dexterity saving throw (DC equals your spell save DC), taking 2d8 + your Intelligence modifier Lightning damage on a failure, or half as much on a success. A creature that fails is jolted: it can't take Reactions until the start of your next turn.</w:t>
+      </w:r>
+    </w:p>
+    <w:p>
+      <w:pPr>
+        <w:pBdr>
+          <w:left w:val="single" w:sz="18" w:space="12" w:color="8B2020"/>
+          <w:bottom w:val="single" w:sz="4" w:space="1" w:color="8B2020"/>
+        </w:pBdr>
+        <w:shd w:val="clear" w:color="auto" w:fill="FCF6F6"/>
+        <w:spacing w:before="20" w:after="20"/>
+        <w:ind w:left="340" w:right="340"/>
+      </w:pPr>
+    </w:p>
+    <w:p>
+      <w:pPr>
+        <w:keepNext/>
+        <w:pBdr>
+          <w:left w:val="single" w:sz="18" w:space="12" w:color="8B2020"/>
+        </w:pBdr>
+        <w:shd w:val="clear" w:color="auto" w:fill="FCF6F6"/>
+        <w:spacing w:before="30" w:after="20"/>
+        <w:ind w:left="340" w:right="340"/>
+      </w:pPr>
+      <w:r>
+        <w:rPr>
+          <w:rFonts w:ascii="Georgia" w:hAnsi="Georgia" w:cs="Georgia"/>
+          <w:b/>
+          <w:color w:val="8B2020"/>
+          <w:sz w:val="20"/>
+        </w:rPr>
+        <w:t>Reactions</w:t>
+      </w:r>
+    </w:p>
+    <w:p>
+      <w:pPr>
+        <w:pBdr>
+          <w:left w:val="single" w:sz="18" w:space="12" w:color="8B2020"/>
+        </w:pBdr>
+        <w:shd w:val="clear" w:color="auto" w:fill="FCF6F6"/>
+        <w:spacing w:before="30" w:after="20"/>
+        <w:ind w:left="340" w:right="340"/>
+      </w:pPr>
+      <w:r>
+        <w:rPr>
+          <w:rFonts w:ascii="Georgia" w:hAnsi="Georgia" w:cs="Georgia"/>
+          <w:b/>
+          <w:i/>
+          <w:color w:val="222222"/>
+          <w:sz w:val="18"/>
+        </w:rPr>
+        <w:t xml:space="preserve">Guardian Protocol (1/round). </w:t>
+      </w:r>
+      <w:r>
+        <w:rPr>
+          <w:rFonts w:ascii="Georgia" w:hAnsi="Georgia" w:cs="Georgia"/>
+          <w:b w:val="0"/>
+          <w:i w:val="0"/>
+          <w:color w:val="222222"/>
+          <w:sz w:val="18"/>
+        </w:rPr>
+        <w:t>Trigger: an ally within 15 feet of the Sentinel takes damage. Response: that ally gains 1d8 + your Intelligence modifier Temporary Hit Points.</w:t>
+      </w:r>
+    </w:p>
+    <w:p>
+      <w:pPr>
+        <w:spacing w:after="0"/>
+      </w:pPr>
+    </w:p>
+    <w:p>
+      <w:pPr>
+        <w:spacing w:after="80"/>
+      </w:pPr>
+      <w:r>
+        <w:rPr>
+          <w:rFonts w:ascii="Georgia" w:hAnsi="Georgia" w:cs="Georgia"/>
+          <w:b/>
+          <w:i w:val="0"/>
+          <w:color w:val="222222"/>
+          <w:sz w:val="21"/>
+        </w:rPr>
+        <w:t>Why this is an upgrade.</w:t>
+      </w:r>
+      <w:r>
+        <w:rPr>
+          <w:rFonts w:ascii="Georgia" w:hAnsi="Georgia" w:cs="Georgia"/>
+          <w:b w:val="0"/>
+          <w:i w:val="0"/>
+          <w:color w:val="222222"/>
+          <w:sz w:val="21"/>
+        </w:rPr>
+        <w:t xml:space="preserve"> The old cannon made Lilly choose a mode; the Sentinel walks on its own 30 feet, then blasts or pulses on her Bonus Action (her pick every time), and shields her friends as a Reaction in the same round. Her old kit lives on inside it: the Force Ballista became the Force Blast, the Storm mode became the Electric Pulse, and the Protector stands watch as Guardian Protocol. The Flamethrower was traded for lightning, Gearhaven's own element. Forged by the masters of Glimmerstone.</w:t>
       </w:r>
     </w:p>
     <w:p>
@@ -1178,7 +4502,7 @@
       <w:r>
         <w:drawing>
           <wp:inline xmlns:a="http://schemas.openxmlformats.org/drawingml/2006/main" xmlns:pic="http://schemas.openxmlformats.org/drawingml/2006/picture">
-            <wp:extent cx="3474720" cy="3474720"/>
+            <wp:extent cx="2560320" cy="2560320"/>
             <wp:docPr id="8" name="Picture 8"/>
             <wp:cNvGraphicFramePr>
               <a:graphicFrameLocks noChangeAspect="1"/>
@@ -1199,7 +4523,7 @@
                   <pic:spPr>
                     <a:xfrm>
                       <a:off x="0" y="0"/>
-                      <a:ext cx="3474720" cy="3474720"/>
+                      <a:ext cx="2560320" cy="2560320"/>
                     </a:xfrm>
                     <a:prstGeom prst="rect"/>
                   </pic:spPr>

</xml_diff>

<commit_message>
Volumes refit for parchment/margins; bestiary Gearhaven heading kept as Session 7
Lore, treasures, custom, bestiary all re-fit to the new engine
(page breaks, float sizes, keep-with-next statblock headers); merged
Compendium 50pp; final publish of all 10 PDFs on parchment.

Co-Authored-By: Claude Opus 4.8 <noreply@anthropic.com>
</commit_message>
<xml_diff>
--- a/compendium/custom_compendium.docx
+++ b/compendium/custom_compendium.docx
@@ -4447,7 +4447,7 @@
       <w:r>
         <w:drawing>
           <wp:inline xmlns:a="http://schemas.openxmlformats.org/drawingml/2006/main" xmlns:pic="http://schemas.openxmlformats.org/drawingml/2006/picture">
-            <wp:extent cx="3108960" cy="3108960"/>
+            <wp:extent cx="1828800" cy="1828800"/>
             <wp:docPr id="7" name="Picture 7"/>
             <wp:cNvGraphicFramePr>
               <a:graphicFrameLocks noChangeAspect="1"/>
@@ -4468,7 +4468,7 @@
                   <pic:spPr>
                     <a:xfrm>
                       <a:off x="0" y="0"/>
-                      <a:ext cx="3108960" cy="3108960"/>
+                      <a:ext cx="1828800" cy="1828800"/>
                     </a:xfrm>
                     <a:prstGeom prst="rect"/>
                   </pic:spPr>
@@ -4503,7 +4503,7 @@
       <w:r>
         <w:drawing>
           <wp:inline xmlns:a="http://schemas.openxmlformats.org/drawingml/2006/main" xmlns:pic="http://schemas.openxmlformats.org/drawingml/2006/picture">
-            <wp:extent cx="2560320" cy="2560320"/>
+            <wp:extent cx="1828800" cy="1828800"/>
             <wp:docPr id="8" name="Picture 8"/>
             <wp:cNvGraphicFramePr>
               <a:graphicFrameLocks noChangeAspect="1"/>
@@ -4524,7 +4524,7 @@
                   <pic:spPr>
                     <a:xfrm>
                       <a:off x="0" y="0"/>
-                      <a:ext cx="2560320" cy="2560320"/>
+                      <a:ext cx="1828800" cy="1828800"/>
                     </a:xfrm>
                     <a:prstGeom prst="rect"/>
                   </pic:spPr>

</xml_diff>

<commit_message>
Book-wide inline-image + melody pass (DM directives)
55 centered images converted to embedded text-floats with breathing
room; ~10 story showpieces kept centered and enlarged; 3 gallery
imgrows; Session 4's rhyme verses and all four carols set as golden
melody blocks; dead space eliminated across all nine documents.
Final publish of all 10 PDFs.

Co-Authored-By: Claude Opus 4.8 <noreply@anthropic.com>
</commit_message>
<xml_diff>
--- a/compendium/custom_compendium.docx
+++ b/compendium/custom_compendium.docx
@@ -386,6 +386,52 @@
     </w:p>
     <w:p>
       <w:pPr>
+        <w:spacing w:after="0" w:before="0"/>
+      </w:pPr>
+      <w:r>
+        <w:drawing>
+          <wp:anchor xmlns:a="http://schemas.openxmlformats.org/drawingml/2006/main" behindDoc="0" distT="91440" distB="91440" distL="201600" distR="0" simplePos="0" locked="0" layoutInCell="1" allowOverlap="1" relativeHeight="2">
+            <wp:simplePos x="0" y="0"/>
+            <wp:positionH relativeFrom="column">
+              <wp:align>right</wp:align>
+            </wp:positionH>
+            <wp:positionV relativeFrom="paragraph">
+              <wp:posOffset>0</wp:posOffset>
+            </wp:positionV>
+            <wp:extent cx="2194560" cy="2194560"/>
+            <wp:effectExtent l="0" t="0" r="0" b="0"/>
+            <wp:wrapSquare wrapText="bothSides"/>
+            <wp:docPr id="1" name="Picture 1"/>
+            <wp:cNvGraphicFramePr/>
+            <a:graphic xmlns:pic="http://schemas.openxmlformats.org/drawingml/2006/picture">
+              <a:graphicData uri="http://schemas.openxmlformats.org/drawingml/2006/picture">
+                <pic:pic>
+                  <pic:nvPicPr>
+                    <pic:cNvPr id="0" name="image.jpg"/>
+                    <pic:cNvPicPr/>
+                  </pic:nvPicPr>
+                  <pic:blipFill>
+                    <a:blip r:embed="rId10"/>
+                    <a:stretch>
+                      <a:fillRect/>
+                    </a:stretch>
+                  </pic:blipFill>
+                  <pic:spPr>
+                    <a:xfrm>
+                      <a:off x="0" y="0"/>
+                      <a:ext cx="2194560" cy="2194560"/>
+                    </a:xfrm>
+                    <a:prstGeom prst="rect"/>
+                  </pic:spPr>
+                </pic:pic>
+              </a:graphicData>
+            </a:graphic>
+          </wp:anchor>
+        </w:drawing>
+      </w:r>
+    </w:p>
+    <w:p>
+      <w:pPr>
         <w:spacing w:after="80"/>
       </w:pPr>
       <w:r>
@@ -442,62 +488,6 @@
     <w:p>
       <w:pPr>
         <w:keepNext/>
-        <w:spacing w:before="120" w:after="40"/>
-        <w:jc w:val="center"/>
-      </w:pPr>
-      <w:r>
-        <w:drawing>
-          <wp:inline xmlns:a="http://schemas.openxmlformats.org/drawingml/2006/main" xmlns:pic="http://schemas.openxmlformats.org/drawingml/2006/picture">
-            <wp:extent cx="3291840" cy="3291840"/>
-            <wp:docPr id="1" name="Picture 1"/>
-            <wp:cNvGraphicFramePr>
-              <a:graphicFrameLocks noChangeAspect="1"/>
-            </wp:cNvGraphicFramePr>
-            <a:graphic>
-              <a:graphicData uri="http://schemas.openxmlformats.org/drawingml/2006/picture">
-                <pic:pic>
-                  <pic:nvPicPr>
-                    <pic:cNvPr id="0" name="image.jpg"/>
-                    <pic:cNvPicPr/>
-                  </pic:nvPicPr>
-                  <pic:blipFill>
-                    <a:blip r:embed="rId10"/>
-                    <a:stretch>
-                      <a:fillRect/>
-                    </a:stretch>
-                  </pic:blipFill>
-                  <pic:spPr>
-                    <a:xfrm>
-                      <a:off x="0" y="0"/>
-                      <a:ext cx="3291840" cy="3291840"/>
-                    </a:xfrm>
-                    <a:prstGeom prst="rect"/>
-                  </pic:spPr>
-                </pic:pic>
-              </a:graphicData>
-            </a:graphic>
-          </wp:inline>
-        </w:drawing>
-      </w:r>
-    </w:p>
-    <w:p>
-      <w:pPr>
-        <w:spacing w:after="140"/>
-        <w:jc w:val="center"/>
-      </w:pPr>
-      <w:r>
-        <w:rPr>
-          <w:rFonts w:ascii="Georgia" w:hAnsi="Georgia" w:cs="Georgia"/>
-          <w:i/>
-          <w:color w:val="888888"/>
-          <w:sz w:val="18"/>
-        </w:rPr>
-        <w:t>Stabby, Bloodfang ignited.</w:t>
-      </w:r>
-    </w:p>
-    <w:p>
-      <w:pPr>
-        <w:keepNext/>
         <w:pBdr>
           <w:left w:val="single" w:sz="18" w:space="12" w:color="8B2020"/>
         </w:pBdr>
@@ -887,6 +877,52 @@
     </w:p>
     <w:p>
       <w:pPr>
+        <w:spacing w:after="0" w:before="0"/>
+      </w:pPr>
+      <w:r>
+        <w:drawing>
+          <wp:anchor xmlns:a="http://schemas.openxmlformats.org/drawingml/2006/main" behindDoc="0" distT="91440" distB="91440" distL="201600" distR="0" simplePos="0" locked="0" layoutInCell="1" allowOverlap="1" relativeHeight="2">
+            <wp:simplePos x="0" y="0"/>
+            <wp:positionH relativeFrom="column">
+              <wp:align>right</wp:align>
+            </wp:positionH>
+            <wp:positionV relativeFrom="paragraph">
+              <wp:posOffset>0</wp:posOffset>
+            </wp:positionV>
+            <wp:extent cx="2194560" cy="2194560"/>
+            <wp:effectExtent l="0" t="0" r="0" b="0"/>
+            <wp:wrapSquare wrapText="bothSides"/>
+            <wp:docPr id="2" name="Picture 2"/>
+            <wp:cNvGraphicFramePr/>
+            <a:graphic xmlns:pic="http://schemas.openxmlformats.org/drawingml/2006/picture">
+              <a:graphicData uri="http://schemas.openxmlformats.org/drawingml/2006/picture">
+                <pic:pic>
+                  <pic:nvPicPr>
+                    <pic:cNvPr id="0" name="image.jpg"/>
+                    <pic:cNvPicPr/>
+                  </pic:nvPicPr>
+                  <pic:blipFill>
+                    <a:blip r:embed="rId11"/>
+                    <a:stretch>
+                      <a:fillRect/>
+                    </a:stretch>
+                  </pic:blipFill>
+                  <pic:spPr>
+                    <a:xfrm>
+                      <a:off x="0" y="0"/>
+                      <a:ext cx="2194560" cy="2194560"/>
+                    </a:xfrm>
+                    <a:prstGeom prst="rect"/>
+                  </pic:spPr>
+                </pic:pic>
+              </a:graphicData>
+            </a:graphic>
+          </wp:anchor>
+        </w:drawing>
+      </w:r>
+    </w:p>
+    <w:p>
+      <w:pPr>
         <w:spacing w:after="80"/>
       </w:pPr>
       <w:r>
@@ -943,62 +979,6 @@
     <w:p>
       <w:pPr>
         <w:keepNext/>
-        <w:spacing w:before="120" w:after="40"/>
-        <w:jc w:val="center"/>
-      </w:pPr>
-      <w:r>
-        <w:drawing>
-          <wp:inline xmlns:a="http://schemas.openxmlformats.org/drawingml/2006/main" xmlns:pic="http://schemas.openxmlformats.org/drawingml/2006/picture">
-            <wp:extent cx="3291840" cy="3291840"/>
-            <wp:docPr id="2" name="Picture 2"/>
-            <wp:cNvGraphicFramePr>
-              <a:graphicFrameLocks noChangeAspect="1"/>
-            </wp:cNvGraphicFramePr>
-            <a:graphic>
-              <a:graphicData uri="http://schemas.openxmlformats.org/drawingml/2006/picture">
-                <pic:pic>
-                  <pic:nvPicPr>
-                    <pic:cNvPr id="0" name="image.jpg"/>
-                    <pic:cNvPicPr/>
-                  </pic:nvPicPr>
-                  <pic:blipFill>
-                    <a:blip r:embed="rId11"/>
-                    <a:stretch>
-                      <a:fillRect/>
-                    </a:stretch>
-                  </pic:blipFill>
-                  <pic:spPr>
-                    <a:xfrm>
-                      <a:off x="0" y="0"/>
-                      <a:ext cx="3291840" cy="3291840"/>
-                    </a:xfrm>
-                    <a:prstGeom prst="rect"/>
-                  </pic:spPr>
-                </pic:pic>
-              </a:graphicData>
-            </a:graphic>
-          </wp:inline>
-        </w:drawing>
-      </w:r>
-    </w:p>
-    <w:p>
-      <w:pPr>
-        <w:spacing w:after="140"/>
-        <w:jc w:val="center"/>
-      </w:pPr>
-      <w:r>
-        <w:rPr>
-          <w:rFonts w:ascii="Georgia" w:hAnsi="Georgia" w:cs="Georgia"/>
-          <w:i/>
-          <w:color w:val="888888"/>
-          <w:sz w:val="18"/>
-        </w:rPr>
-        <w:t>Stabby, the Flowing Guard.</w:t>
-      </w:r>
-    </w:p>
-    <w:p>
-      <w:pPr>
-        <w:keepNext/>
         <w:pBdr>
           <w:left w:val="single" w:sz="18" w:space="12" w:color="8B2020"/>
         </w:pBdr>
@@ -1388,6 +1368,52 @@
     </w:p>
     <w:p>
       <w:pPr>
+        <w:spacing w:after="0" w:before="0"/>
+      </w:pPr>
+      <w:r>
+        <w:drawing>
+          <wp:anchor xmlns:a="http://schemas.openxmlformats.org/drawingml/2006/main" behindDoc="0" distT="91440" distB="91440" distL="201600" distR="0" simplePos="0" locked="0" layoutInCell="1" allowOverlap="1" relativeHeight="2">
+            <wp:simplePos x="0" y="0"/>
+            <wp:positionH relativeFrom="column">
+              <wp:align>right</wp:align>
+            </wp:positionH>
+            <wp:positionV relativeFrom="paragraph">
+              <wp:posOffset>0</wp:posOffset>
+            </wp:positionV>
+            <wp:extent cx="2194560" cy="2194560"/>
+            <wp:effectExtent l="0" t="0" r="0" b="0"/>
+            <wp:wrapSquare wrapText="bothSides"/>
+            <wp:docPr id="3" name="Picture 3"/>
+            <wp:cNvGraphicFramePr/>
+            <a:graphic xmlns:pic="http://schemas.openxmlformats.org/drawingml/2006/picture">
+              <a:graphicData uri="http://schemas.openxmlformats.org/drawingml/2006/picture">
+                <pic:pic>
+                  <pic:nvPicPr>
+                    <pic:cNvPr id="0" name="image.jpg"/>
+                    <pic:cNvPicPr/>
+                  </pic:nvPicPr>
+                  <pic:blipFill>
+                    <a:blip r:embed="rId12"/>
+                    <a:stretch>
+                      <a:fillRect/>
+                    </a:stretch>
+                  </pic:blipFill>
+                  <pic:spPr>
+                    <a:xfrm>
+                      <a:off x="0" y="0"/>
+                      <a:ext cx="2194560" cy="2194560"/>
+                    </a:xfrm>
+                    <a:prstGeom prst="rect"/>
+                  </pic:spPr>
+                </pic:pic>
+              </a:graphicData>
+            </a:graphic>
+          </wp:anchor>
+        </w:drawing>
+      </w:r>
+    </w:p>
+    <w:p>
+      <w:pPr>
         <w:spacing w:after="80"/>
       </w:pPr>
       <w:r>
@@ -1444,62 +1470,6 @@
     <w:p>
       <w:pPr>
         <w:keepNext/>
-        <w:spacing w:before="120" w:after="40"/>
-        <w:jc w:val="center"/>
-      </w:pPr>
-      <w:r>
-        <w:drawing>
-          <wp:inline xmlns:a="http://schemas.openxmlformats.org/drawingml/2006/main" xmlns:pic="http://schemas.openxmlformats.org/drawingml/2006/picture">
-            <wp:extent cx="3291840" cy="3291840"/>
-            <wp:docPr id="3" name="Picture 3"/>
-            <wp:cNvGraphicFramePr>
-              <a:graphicFrameLocks noChangeAspect="1"/>
-            </wp:cNvGraphicFramePr>
-            <a:graphic>
-              <a:graphicData uri="http://schemas.openxmlformats.org/drawingml/2006/picture">
-                <pic:pic>
-                  <pic:nvPicPr>
-                    <pic:cNvPr id="0" name="image.jpg"/>
-                    <pic:cNvPicPr/>
-                  </pic:nvPicPr>
-                  <pic:blipFill>
-                    <a:blip r:embed="rId12"/>
-                    <a:stretch>
-                      <a:fillRect/>
-                    </a:stretch>
-                  </pic:blipFill>
-                  <pic:spPr>
-                    <a:xfrm>
-                      <a:off x="0" y="0"/>
-                      <a:ext cx="3291840" cy="3291840"/>
-                    </a:xfrm>
-                    <a:prstGeom prst="rect"/>
-                  </pic:spPr>
-                </pic:pic>
-              </a:graphicData>
-            </a:graphic>
-          </wp:inline>
-        </w:drawing>
-      </w:r>
-    </w:p>
-    <w:p>
-      <w:pPr>
-        <w:spacing w:after="140"/>
-        <w:jc w:val="center"/>
-      </w:pPr>
-      <w:r>
-        <w:rPr>
-          <w:rFonts w:ascii="Georgia" w:hAnsi="Georgia" w:cs="Georgia"/>
-          <w:i/>
-          <w:color w:val="888888"/>
-          <w:sz w:val="18"/>
-        </w:rPr>
-        <w:t>Stabby, wreathed in the Idol's gloom.</w:t>
-      </w:r>
-    </w:p>
-    <w:p>
-      <w:pPr>
-        <w:keepNext/>
         <w:pBdr>
           <w:left w:val="single" w:sz="18" w:space="12" w:color="8B2020"/>
         </w:pBdr>
@@ -2900,34 +2870,24 @@
     </w:p>
     <w:p>
       <w:pPr>
-        <w:spacing w:after="80"/>
-      </w:pPr>
-      <w:r>
-        <w:rPr>
-          <w:rFonts w:ascii="Georgia" w:hAnsi="Georgia" w:cs="Georgia"/>
-          <w:b w:val="0"/>
-          <w:i w:val="0"/>
-          <w:color w:val="222222"/>
-          <w:sz w:val="21"/>
-        </w:rPr>
-        <w:t>On this road, Boomstick takes the dagger's watch. Boomstick becomes Lilly's spellcasting focus and her designated Arcane Firearm (an artificer designates only one). With her shield in the other hand, her hands are exactly full: pistol, shield, and nothing wasted. The Frostbite Shard retires to her belt as a keepsake, or one day, a gift.</w:t>
-      </w:r>
-    </w:p>
-    <w:p>
-      <w:pPr>
-        <w:keepNext/>
-        <w:spacing w:before="120" w:after="40"/>
-        <w:jc w:val="center"/>
+        <w:spacing w:after="0" w:before="0"/>
       </w:pPr>
       <w:r>
         <w:drawing>
-          <wp:inline xmlns:a="http://schemas.openxmlformats.org/drawingml/2006/main" xmlns:pic="http://schemas.openxmlformats.org/drawingml/2006/picture">
-            <wp:extent cx="3291840" cy="3291840"/>
+          <wp:anchor xmlns:a="http://schemas.openxmlformats.org/drawingml/2006/main" behindDoc="0" distT="91440" distB="91440" distL="201600" distR="0" simplePos="0" locked="0" layoutInCell="1" allowOverlap="1" relativeHeight="2">
+            <wp:simplePos x="0" y="0"/>
+            <wp:positionH relativeFrom="column">
+              <wp:align>right</wp:align>
+            </wp:positionH>
+            <wp:positionV relativeFrom="paragraph">
+              <wp:posOffset>0</wp:posOffset>
+            </wp:positionV>
+            <wp:extent cx="2194560" cy="2194560"/>
+            <wp:effectExtent l="0" t="0" r="0" b="0"/>
+            <wp:wrapSquare wrapText="bothSides"/>
             <wp:docPr id="4" name="Picture 4"/>
-            <wp:cNvGraphicFramePr>
-              <a:graphicFrameLocks noChangeAspect="1"/>
-            </wp:cNvGraphicFramePr>
-            <a:graphic>
+            <wp:cNvGraphicFramePr/>
+            <a:graphic xmlns:pic="http://schemas.openxmlformats.org/drawingml/2006/picture">
               <a:graphicData uri="http://schemas.openxmlformats.org/drawingml/2006/picture">
                 <pic:pic>
                   <pic:nvPicPr>
@@ -2943,30 +2903,30 @@
                   <pic:spPr>
                     <a:xfrm>
                       <a:off x="0" y="0"/>
-                      <a:ext cx="3291840" cy="3291840"/>
+                      <a:ext cx="2194560" cy="2194560"/>
                     </a:xfrm>
                     <a:prstGeom prst="rect"/>
                   </pic:spPr>
                 </pic:pic>
               </a:graphicData>
             </a:graphic>
-          </wp:inline>
+          </wp:anchor>
         </w:drawing>
       </w:r>
     </w:p>
     <w:p>
       <w:pPr>
-        <w:spacing w:after="140"/>
-        <w:jc w:val="center"/>
+        <w:spacing w:after="80"/>
       </w:pPr>
       <w:r>
         <w:rPr>
           <w:rFonts w:ascii="Georgia" w:hAnsi="Georgia" w:cs="Georgia"/>
-          <w:i/>
-          <w:color w:val="888888"/>
-          <w:sz w:val="18"/>
+          <w:b w:val="0"/>
+          <w:i w:val="0"/>
+          <w:color w:val="222222"/>
+          <w:sz w:val="21"/>
         </w:rPr>
-        <w:t>Boomstick, primed and opinionated.</w:t>
+        <w:t>On this road, Boomstick takes the dagger's watch. Boomstick becomes Lilly's spellcasting focus and her designated Arcane Firearm (an artificer designates only one). With her shield in the other hand, her hands are exactly full: pistol, shield, and nothing wasted. The Frostbite Shard retires to her belt as a keepsake, or one day, a gift.</w:t>
       </w:r>
     </w:p>
     <w:p>
@@ -3216,19 +3176,24 @@
     </w:p>
     <w:p>
       <w:pPr>
-        <w:keepNext/>
-        <w:spacing w:before="120" w:after="40"/>
-        <w:jc w:val="center"/>
+        <w:spacing w:after="0" w:before="0"/>
       </w:pPr>
       <w:r>
         <w:drawing>
-          <wp:inline xmlns:a="http://schemas.openxmlformats.org/drawingml/2006/main" xmlns:pic="http://schemas.openxmlformats.org/drawingml/2006/picture">
-            <wp:extent cx="3291840" cy="3291840"/>
+          <wp:anchor xmlns:a="http://schemas.openxmlformats.org/drawingml/2006/main" behindDoc="0" distT="91440" distB="91440" distL="201600" distR="0" simplePos="0" locked="0" layoutInCell="1" allowOverlap="1" relativeHeight="2">
+            <wp:simplePos x="0" y="0"/>
+            <wp:positionH relativeFrom="column">
+              <wp:align>right</wp:align>
+            </wp:positionH>
+            <wp:positionV relativeFrom="paragraph">
+              <wp:posOffset>0</wp:posOffset>
+            </wp:positionV>
+            <wp:extent cx="2194560" cy="2194560"/>
+            <wp:effectExtent l="0" t="0" r="0" b="0"/>
+            <wp:wrapSquare wrapText="bothSides"/>
             <wp:docPr id="5" name="Picture 5"/>
-            <wp:cNvGraphicFramePr>
-              <a:graphicFrameLocks noChangeAspect="1"/>
-            </wp:cNvGraphicFramePr>
-            <a:graphic>
+            <wp:cNvGraphicFramePr/>
+            <a:graphic xmlns:pic="http://schemas.openxmlformats.org/drawingml/2006/picture">
               <a:graphicData uri="http://schemas.openxmlformats.org/drawingml/2006/picture">
                 <pic:pic>
                   <pic:nvPicPr>
@@ -3244,30 +3209,15 @@
                   <pic:spPr>
                     <a:xfrm>
                       <a:off x="0" y="0"/>
-                      <a:ext cx="3291840" cy="3291840"/>
+                      <a:ext cx="2194560" cy="2194560"/>
                     </a:xfrm>
                     <a:prstGeom prst="rect"/>
                   </pic:spPr>
                 </pic:pic>
               </a:graphicData>
             </a:graphic>
-          </wp:inline>
+          </wp:anchor>
         </w:drawing>
-      </w:r>
-    </w:p>
-    <w:p>
-      <w:pPr>
-        <w:spacing w:after="140"/>
-        <w:jc w:val="center"/>
-      </w:pPr>
-      <w:r>
-        <w:rPr>
-          <w:rFonts w:ascii="Georgia" w:hAnsi="Georgia" w:cs="Georgia"/>
-          <w:i/>
-          <w:color w:val="888888"/>
-          <w:sz w:val="18"/>
-        </w:rPr>
-        <w:t>The Sphere, drinking the loose light of the world.</w:t>
       </w:r>
     </w:p>
     <w:p>
@@ -3652,7 +3602,7 @@
       </w:pPr>
       <w:r>
         <w:drawing>
-          <wp:anchor xmlns:a="http://schemas.openxmlformats.org/drawingml/2006/main" behindDoc="0" distT="0" distB="0" distL="114300" distR="0" simplePos="0" locked="0" layoutInCell="1" allowOverlap="1" relativeHeight="2">
+          <wp:anchor xmlns:a="http://schemas.openxmlformats.org/drawingml/2006/main" behindDoc="0" distT="91440" distB="91440" distL="201600" distR="0" simplePos="0" locked="0" layoutInCell="1" allowOverlap="1" relativeHeight="2">
             <wp:simplePos x="0" y="0"/>
             <wp:positionH relativeFrom="column">
               <wp:align>right</wp:align>
@@ -4438,117 +4388,152 @@
         <w:t xml:space="preserve"> Elaria's sigil, wrapped in a leafed vine (or cupped in wings, on the Sash), found on every gift along the Guardians' path. When you see it, she saw you coming.</w:t>
       </w:r>
     </w:p>
+    <w:tbl>
+      <w:tblPr>
+        <w:tblW w:type="auto" w:w="0"/>
+        <w:jc w:val="center"/>
+        <w:tblLayout w:type="fixed"/>
+        <w:tblLook w:firstColumn="1" w:firstRow="1" w:lastColumn="0" w:lastRow="0" w:noHBand="0" w:noVBand="1" w:val="04A0"/>
+      </w:tblPr>
+      <w:tblGrid>
+        <w:gridCol w:w="4680"/>
+        <w:gridCol w:w="4680"/>
+      </w:tblGrid>
+      <w:tr>
+        <w:tc>
+          <w:tcPr>
+            <w:tcW w:type="dxa" w:w="4680"/>
+          </w:tcPr>
+          <w:p>
+            <w:pPr>
+              <w:jc w:val="center"/>
+            </w:pPr>
+            <w:r>
+              <w:drawing>
+                <wp:inline xmlns:a="http://schemas.openxmlformats.org/drawingml/2006/main" xmlns:pic="http://schemas.openxmlformats.org/drawingml/2006/picture">
+                  <wp:extent cx="2788920" cy="2788920"/>
+                  <wp:docPr id="7" name="Picture 7"/>
+                  <wp:cNvGraphicFramePr>
+                    <a:graphicFrameLocks noChangeAspect="1"/>
+                  </wp:cNvGraphicFramePr>
+                  <a:graphic>
+                    <a:graphicData uri="http://schemas.openxmlformats.org/drawingml/2006/picture">
+                      <pic:pic>
+                        <pic:nvPicPr>
+                          <pic:cNvPr id="0" name="image.jpg"/>
+                          <pic:cNvPicPr/>
+                        </pic:nvPicPr>
+                        <pic:blipFill>
+                          <a:blip r:embed="rId16"/>
+                          <a:stretch>
+                            <a:fillRect/>
+                          </a:stretch>
+                        </pic:blipFill>
+                        <pic:spPr>
+                          <a:xfrm>
+                            <a:off x="0" y="0"/>
+                            <a:ext cx="2788920" cy="2788920"/>
+                          </a:xfrm>
+                          <a:prstGeom prst="rect"/>
+                        </pic:spPr>
+                      </pic:pic>
+                    </a:graphicData>
+                  </a:graphic>
+                </wp:inline>
+              </w:drawing>
+            </w:r>
+          </w:p>
+        </w:tc>
+        <w:tc>
+          <w:tcPr>
+            <w:tcW w:type="dxa" w:w="4680"/>
+          </w:tcPr>
+          <w:p>
+            <w:pPr>
+              <w:jc w:val="center"/>
+            </w:pPr>
+            <w:r>
+              <w:drawing>
+                <wp:inline xmlns:a="http://schemas.openxmlformats.org/drawingml/2006/main" xmlns:pic="http://schemas.openxmlformats.org/drawingml/2006/picture">
+                  <wp:extent cx="2788920" cy="2788920"/>
+                  <wp:docPr id="8" name="Picture 8"/>
+                  <wp:cNvGraphicFramePr>
+                    <a:graphicFrameLocks noChangeAspect="1"/>
+                  </wp:cNvGraphicFramePr>
+                  <a:graphic>
+                    <a:graphicData uri="http://schemas.openxmlformats.org/drawingml/2006/picture">
+                      <pic:pic>
+                        <pic:nvPicPr>
+                          <pic:cNvPr id="0" name="image.jpg"/>
+                          <pic:cNvPicPr/>
+                        </pic:nvPicPr>
+                        <pic:blipFill>
+                          <a:blip r:embed="rId17"/>
+                          <a:stretch>
+                            <a:fillRect/>
+                          </a:stretch>
+                        </pic:blipFill>
+                        <pic:spPr>
+                          <a:xfrm>
+                            <a:off x="0" y="0"/>
+                            <a:ext cx="2788920" cy="2788920"/>
+                          </a:xfrm>
+                          <a:prstGeom prst="rect"/>
+                        </pic:spPr>
+                      </pic:pic>
+                    </a:graphicData>
+                  </a:graphic>
+                </wp:inline>
+              </w:drawing>
+            </w:r>
+          </w:p>
+        </w:tc>
+      </w:tr>
+      <w:tr>
+        <w:tc>
+          <w:tcPr>
+            <w:tcW w:type="dxa" w:w="4680"/>
+          </w:tcPr>
+          <w:p>
+            <w:pPr>
+              <w:jc w:val="center"/>
+            </w:pPr>
+            <w:r>
+              <w:rPr>
+                <w:rFonts w:ascii="Georgia" w:hAnsi="Georgia" w:cs="Georgia"/>
+                <w:i/>
+                <w:color w:val="888888"/>
+                <w:sz w:val="18"/>
+              </w:rPr>
+              <w:t>The seven-point star of Elaria, held close.</w:t>
+            </w:r>
+          </w:p>
+        </w:tc>
+        <w:tc>
+          <w:tcPr>
+            <w:tcW w:type="dxa" w:w="4680"/>
+          </w:tcPr>
+          <w:p>
+            <w:pPr>
+              <w:jc w:val="center"/>
+            </w:pPr>
+            <w:r>
+              <w:rPr>
+                <w:rFonts w:ascii="Georgia" w:hAnsi="Georgia" w:cs="Georgia"/>
+                <w:i/>
+                <w:color w:val="888888"/>
+                <w:sz w:val="18"/>
+              </w:rPr>
+              <w:t>Elaria, the sleeping goddess who lit the way.</w:t>
+            </w:r>
+          </w:p>
+        </w:tc>
+      </w:tr>
+    </w:tbl>
     <w:p>
       <w:pPr>
-        <w:keepNext/>
-        <w:spacing w:before="120" w:after="40"/>
-        <w:jc w:val="center"/>
-      </w:pPr>
-      <w:r>
-        <w:drawing>
-          <wp:inline xmlns:a="http://schemas.openxmlformats.org/drawingml/2006/main" xmlns:pic="http://schemas.openxmlformats.org/drawingml/2006/picture">
-            <wp:extent cx="1828800" cy="1828800"/>
-            <wp:docPr id="7" name="Picture 7"/>
-            <wp:cNvGraphicFramePr>
-              <a:graphicFrameLocks noChangeAspect="1"/>
-            </wp:cNvGraphicFramePr>
-            <a:graphic>
-              <a:graphicData uri="http://schemas.openxmlformats.org/drawingml/2006/picture">
-                <pic:pic>
-                  <pic:nvPicPr>
-                    <pic:cNvPr id="0" name="image.jpg"/>
-                    <pic:cNvPicPr/>
-                  </pic:nvPicPr>
-                  <pic:blipFill>
-                    <a:blip r:embed="rId16"/>
-                    <a:stretch>
-                      <a:fillRect/>
-                    </a:stretch>
-                  </pic:blipFill>
-                  <pic:spPr>
-                    <a:xfrm>
-                      <a:off x="0" y="0"/>
-                      <a:ext cx="1828800" cy="1828800"/>
-                    </a:xfrm>
-                    <a:prstGeom prst="rect"/>
-                  </pic:spPr>
-                </pic:pic>
-              </a:graphicData>
-            </a:graphic>
-          </wp:inline>
-        </w:drawing>
-      </w:r>
-    </w:p>
-    <w:p>
-      <w:pPr>
-        <w:spacing w:after="140"/>
-        <w:jc w:val="center"/>
-      </w:pPr>
-      <w:r>
-        <w:rPr>
-          <w:rFonts w:ascii="Georgia" w:hAnsi="Georgia" w:cs="Georgia"/>
-          <w:i/>
-          <w:color w:val="888888"/>
-          <w:sz w:val="18"/>
-        </w:rPr>
-        <w:t>The seven-point star of Elaria, held close.</w:t>
-      </w:r>
-    </w:p>
-    <w:p>
-      <w:pPr>
-        <w:keepNext/>
-        <w:spacing w:before="120" w:after="40"/>
-        <w:jc w:val="center"/>
-      </w:pPr>
-      <w:r>
-        <w:drawing>
-          <wp:inline xmlns:a="http://schemas.openxmlformats.org/drawingml/2006/main" xmlns:pic="http://schemas.openxmlformats.org/drawingml/2006/picture">
-            <wp:extent cx="1828800" cy="1828800"/>
-            <wp:docPr id="8" name="Picture 8"/>
-            <wp:cNvGraphicFramePr>
-              <a:graphicFrameLocks noChangeAspect="1"/>
-            </wp:cNvGraphicFramePr>
-            <a:graphic>
-              <a:graphicData uri="http://schemas.openxmlformats.org/drawingml/2006/picture">
-                <pic:pic>
-                  <pic:nvPicPr>
-                    <pic:cNvPr id="0" name="image.jpg"/>
-                    <pic:cNvPicPr/>
-                  </pic:nvPicPr>
-                  <pic:blipFill>
-                    <a:blip r:embed="rId17"/>
-                    <a:stretch>
-                      <a:fillRect/>
-                    </a:stretch>
-                  </pic:blipFill>
-                  <pic:spPr>
-                    <a:xfrm>
-                      <a:off x="0" y="0"/>
-                      <a:ext cx="1828800" cy="1828800"/>
-                    </a:xfrm>
-                    <a:prstGeom prst="rect"/>
-                  </pic:spPr>
-                </pic:pic>
-              </a:graphicData>
-            </a:graphic>
-          </wp:inline>
-        </w:drawing>
-      </w:r>
-    </w:p>
-    <w:p>
-      <w:pPr>
-        <w:spacing w:after="140"/>
-        <w:jc w:val="center"/>
-      </w:pPr>
-      <w:r>
-        <w:rPr>
-          <w:rFonts w:ascii="Georgia" w:hAnsi="Georgia" w:cs="Georgia"/>
-          <w:i/>
-          <w:color w:val="888888"/>
-          <w:sz w:val="18"/>
-        </w:rPr>
-        <w:t>Elaria, the sleeping goddess who lit the way.</w:t>
-      </w:r>
+        <w:spacing w:after="80"/>
+      </w:pPr>
     </w:p>
     <w:sectPr>
       <w:footerReference w:type="default" r:id="rId9"/>

</xml_diff>

<commit_message>
Fix float overlaps: allowOverlap=0 engine-wide; drop redundant S3 Floraburst float
Floats can no longer stack on each other (Word now pushes them apart);
the S3 companion-choice page verified clean. Full republish.

Co-Authored-By: Claude Opus 4.8 <noreply@anthropic.com>
</commit_message>
<xml_diff>
--- a/compendium/custom_compendium.docx
+++ b/compendium/custom_compendium.docx
@@ -390,7 +390,7 @@
       </w:pPr>
       <w:r>
         <w:drawing>
-          <wp:anchor xmlns:a="http://schemas.openxmlformats.org/drawingml/2006/main" behindDoc="0" distT="91440" distB="91440" distL="201600" distR="0" simplePos="0" locked="0" layoutInCell="1" allowOverlap="1" relativeHeight="2">
+          <wp:anchor xmlns:a="http://schemas.openxmlformats.org/drawingml/2006/main" behindDoc="0" distT="91440" distB="91440" distL="201600" distR="0" simplePos="0" locked="0" layoutInCell="1" allowOverlap="0" relativeHeight="2">
             <wp:simplePos x="0" y="0"/>
             <wp:positionH relativeFrom="column">
               <wp:align>right</wp:align>
@@ -881,7 +881,7 @@
       </w:pPr>
       <w:r>
         <w:drawing>
-          <wp:anchor xmlns:a="http://schemas.openxmlformats.org/drawingml/2006/main" behindDoc="0" distT="91440" distB="91440" distL="201600" distR="0" simplePos="0" locked="0" layoutInCell="1" allowOverlap="1" relativeHeight="2">
+          <wp:anchor xmlns:a="http://schemas.openxmlformats.org/drawingml/2006/main" behindDoc="0" distT="91440" distB="91440" distL="201600" distR="0" simplePos="0" locked="0" layoutInCell="1" allowOverlap="0" relativeHeight="2">
             <wp:simplePos x="0" y="0"/>
             <wp:positionH relativeFrom="column">
               <wp:align>right</wp:align>
@@ -1372,7 +1372,7 @@
       </w:pPr>
       <w:r>
         <w:drawing>
-          <wp:anchor xmlns:a="http://schemas.openxmlformats.org/drawingml/2006/main" behindDoc="0" distT="91440" distB="91440" distL="201600" distR="0" simplePos="0" locked="0" layoutInCell="1" allowOverlap="1" relativeHeight="2">
+          <wp:anchor xmlns:a="http://schemas.openxmlformats.org/drawingml/2006/main" behindDoc="0" distT="91440" distB="91440" distL="201600" distR="0" simplePos="0" locked="0" layoutInCell="1" allowOverlap="0" relativeHeight="2">
             <wp:simplePos x="0" y="0"/>
             <wp:positionH relativeFrom="column">
               <wp:align>right</wp:align>
@@ -2874,7 +2874,7 @@
       </w:pPr>
       <w:r>
         <w:drawing>
-          <wp:anchor xmlns:a="http://schemas.openxmlformats.org/drawingml/2006/main" behindDoc="0" distT="91440" distB="91440" distL="201600" distR="0" simplePos="0" locked="0" layoutInCell="1" allowOverlap="1" relativeHeight="2">
+          <wp:anchor xmlns:a="http://schemas.openxmlformats.org/drawingml/2006/main" behindDoc="0" distT="91440" distB="91440" distL="201600" distR="0" simplePos="0" locked="0" layoutInCell="1" allowOverlap="0" relativeHeight="2">
             <wp:simplePos x="0" y="0"/>
             <wp:positionH relativeFrom="column">
               <wp:align>right</wp:align>
@@ -3180,7 +3180,7 @@
       </w:pPr>
       <w:r>
         <w:drawing>
-          <wp:anchor xmlns:a="http://schemas.openxmlformats.org/drawingml/2006/main" behindDoc="0" distT="91440" distB="91440" distL="201600" distR="0" simplePos="0" locked="0" layoutInCell="1" allowOverlap="1" relativeHeight="2">
+          <wp:anchor xmlns:a="http://schemas.openxmlformats.org/drawingml/2006/main" behindDoc="0" distT="91440" distB="91440" distL="201600" distR="0" simplePos="0" locked="0" layoutInCell="1" allowOverlap="0" relativeHeight="2">
             <wp:simplePos x="0" y="0"/>
             <wp:positionH relativeFrom="column">
               <wp:align>right</wp:align>
@@ -3602,7 +3602,7 @@
       </w:pPr>
       <w:r>
         <w:drawing>
-          <wp:anchor xmlns:a="http://schemas.openxmlformats.org/drawingml/2006/main" behindDoc="0" distT="91440" distB="91440" distL="201600" distR="0" simplePos="0" locked="0" layoutInCell="1" allowOverlap="1" relativeHeight="2">
+          <wp:anchor xmlns:a="http://schemas.openxmlformats.org/drawingml/2006/main" behindDoc="0" distT="91440" distB="91440" distL="201600" distR="0" simplePos="0" locked="0" layoutInCell="1" allowOverlap="0" relativeHeight="2">
             <wp:simplePos x="0" y="0"/>
             <wp:positionH relativeFrom="column">
               <wp:align>right</wp:align>

</xml_diff>

<commit_message>
Big-art layout pass: half-page plates, new world map, sheet slot pips
- Engine: text gaps on both sides of floats; crop option renders square
  art as landscape plates; hmax overrides for showpieces; slots block
  (spell-slot pips); dm block size option
- New DM-approved landscape world map from the party's real route,
  including the sea crossing (old square map retired to _triage)
- Foreword: 11pt at-the-table lines, accent-colored slot pip trackers
- Sessions 1-6 + World doc refit: openers dominate page 1, landscapes
  as half-page plates, Terranox/Krampusshade/Davy Jones/False Hydra
  boss showings, floats upsized, parts start on fresh pages, fixed
  silent no-op pagebreak keys, nothing touching margins or page edges

Co-Authored-By: Claude Opus 4.8 <noreply@anthropic.com>
</commit_message>
<xml_diff>
--- a/compendium/custom_compendium.docx
+++ b/compendium/custom_compendium.docx
@@ -390,7 +390,7 @@
       </w:pPr>
       <w:r>
         <w:drawing>
-          <wp:anchor xmlns:a="http://schemas.openxmlformats.org/drawingml/2006/main" behindDoc="0" distT="91440" distB="91440" distL="201600" distR="0" simplePos="0" locked="0" layoutInCell="1" allowOverlap="0" relativeHeight="2">
+          <wp:anchor xmlns:a="http://schemas.openxmlformats.org/drawingml/2006/main" behindDoc="0" distT="91440" distB="100584" distL="201600" distR="201600" simplePos="0" locked="0" layoutInCell="1" allowOverlap="0" relativeHeight="2">
             <wp:simplePos x="0" y="0"/>
             <wp:positionH relativeFrom="column">
               <wp:align>right</wp:align>
@@ -881,7 +881,7 @@
       </w:pPr>
       <w:r>
         <w:drawing>
-          <wp:anchor xmlns:a="http://schemas.openxmlformats.org/drawingml/2006/main" behindDoc="0" distT="91440" distB="91440" distL="201600" distR="0" simplePos="0" locked="0" layoutInCell="1" allowOverlap="0" relativeHeight="2">
+          <wp:anchor xmlns:a="http://schemas.openxmlformats.org/drawingml/2006/main" behindDoc="0" distT="91440" distB="100584" distL="201600" distR="201600" simplePos="0" locked="0" layoutInCell="1" allowOverlap="0" relativeHeight="2">
             <wp:simplePos x="0" y="0"/>
             <wp:positionH relativeFrom="column">
               <wp:align>right</wp:align>
@@ -1372,7 +1372,7 @@
       </w:pPr>
       <w:r>
         <w:drawing>
-          <wp:anchor xmlns:a="http://schemas.openxmlformats.org/drawingml/2006/main" behindDoc="0" distT="91440" distB="91440" distL="201600" distR="0" simplePos="0" locked="0" layoutInCell="1" allowOverlap="0" relativeHeight="2">
+          <wp:anchor xmlns:a="http://schemas.openxmlformats.org/drawingml/2006/main" behindDoc="0" distT="91440" distB="100584" distL="201600" distR="201600" simplePos="0" locked="0" layoutInCell="1" allowOverlap="0" relativeHeight="2">
             <wp:simplePos x="0" y="0"/>
             <wp:positionH relativeFrom="column">
               <wp:align>right</wp:align>
@@ -2874,7 +2874,7 @@
       </w:pPr>
       <w:r>
         <w:drawing>
-          <wp:anchor xmlns:a="http://schemas.openxmlformats.org/drawingml/2006/main" behindDoc="0" distT="91440" distB="91440" distL="201600" distR="0" simplePos="0" locked="0" layoutInCell="1" allowOverlap="0" relativeHeight="2">
+          <wp:anchor xmlns:a="http://schemas.openxmlformats.org/drawingml/2006/main" behindDoc="0" distT="91440" distB="100584" distL="201600" distR="201600" simplePos="0" locked="0" layoutInCell="1" allowOverlap="0" relativeHeight="2">
             <wp:simplePos x="0" y="0"/>
             <wp:positionH relativeFrom="column">
               <wp:align>right</wp:align>
@@ -3180,7 +3180,7 @@
       </w:pPr>
       <w:r>
         <w:drawing>
-          <wp:anchor xmlns:a="http://schemas.openxmlformats.org/drawingml/2006/main" behindDoc="0" distT="91440" distB="91440" distL="201600" distR="0" simplePos="0" locked="0" layoutInCell="1" allowOverlap="0" relativeHeight="2">
+          <wp:anchor xmlns:a="http://schemas.openxmlformats.org/drawingml/2006/main" behindDoc="0" distT="91440" distB="100584" distL="201600" distR="201600" simplePos="0" locked="0" layoutInCell="1" allowOverlap="0" relativeHeight="2">
             <wp:simplePos x="0" y="0"/>
             <wp:positionH relativeFrom="column">
               <wp:align>right</wp:align>
@@ -3602,7 +3602,7 @@
       </w:pPr>
       <w:r>
         <w:drawing>
-          <wp:anchor xmlns:a="http://schemas.openxmlformats.org/drawingml/2006/main" behindDoc="0" distT="91440" distB="91440" distL="201600" distR="0" simplePos="0" locked="0" layoutInCell="1" allowOverlap="0" relativeHeight="2">
+          <wp:anchor xmlns:a="http://schemas.openxmlformats.org/drawingml/2006/main" behindDoc="0" distT="91440" distB="100584" distL="201600" distR="201600" simplePos="0" locked="0" layoutInCell="1" allowOverlap="0" relativeHeight="2">
             <wp:simplePos x="0" y="0"/>
             <wp:positionH relativeFrom="column">
               <wp:align>right</wp:align>

</xml_diff>

<commit_message>
Move table crunch out of the foreword into the Compendium
The Guardians section of the foreword reads as pure dramatis personae
again; the level-5 mini-sheets (class lines + slot pip trackers) now
open Part III of the Compendium as 'The Guardians at the Table'.

Co-Authored-By: Claude Opus 4.8 <noreply@anthropic.com>
</commit_message>
<xml_diff>
--- a/compendium/custom_compendium.docx
+++ b/compendium/custom_compendium.docx
@@ -92,7 +92,373 @@
           <w:color w:val="222222"/>
           <w:sz w:val="21"/>
         </w:rPr>
-        <w:t>Homebrew and rulings of this table: the paths the heroes may walk after the year apart, and the standing rules of the campaign. 2024 rules throughout; house rules override the books.</w:t>
+        <w:t>Homebrew and rulings of this table: the heroes as they stand at the table, the paths they may walk after the year apart, and the standing rules of the campaign. 2024 rules throughout; house rules override the books.</w:t>
+      </w:r>
+    </w:p>
+    <w:p>
+      <w:pPr>
+        <w:keepNext/>
+        <w:spacing w:before="400" w:after="120"/>
+        <w:pBdr>
+          <w:bottom w:val="single" w:sz="6" w:space="4" w:color="B8860B"/>
+        </w:pBdr>
+      </w:pPr>
+      <w:r>
+        <w:rPr>
+          <w:rFonts w:ascii="Georgia" w:hAnsi="Georgia" w:cs="Georgia"/>
+          <w:b/>
+          <w:color w:val="B8860B"/>
+          <w:sz w:val="32"/>
+        </w:rPr>
+        <w:t>The Guardians at the Table</w:t>
+      </w:r>
+    </w:p>
+    <w:p>
+      <w:pPr>
+        <w:spacing w:after="80"/>
+      </w:pPr>
+      <w:r>
+        <w:rPr>
+          <w:rFonts w:ascii="Georgia" w:hAnsi="Georgia" w:cs="Georgia"/>
+          <w:b w:val="0"/>
+          <w:i w:val="0"/>
+          <w:color w:val="222222"/>
+          <w:sz w:val="21"/>
+        </w:rPr>
+        <w:t>The chronicle's front matter tells you who the Guardians are; this page tells you what they roll. All three stand at level 5 at the close of the Gearhaven chapter.</w:t>
+      </w:r>
+    </w:p>
+    <w:p>
+      <w:pPr>
+        <w:keepNext/>
+        <w:spacing w:before="220" w:after="60"/>
+      </w:pPr>
+      <w:r>
+        <w:rPr>
+          <w:rFonts w:ascii="Georgia" w:hAnsi="Georgia" w:cs="Georgia"/>
+          <w:b/>
+          <w:color w:val="A0522D"/>
+          <w:sz w:val="26"/>
+        </w:rPr>
+        <w:t>Lilly Glimmergear</w:t>
+      </w:r>
+    </w:p>
+    <w:p>
+      <w:pPr>
+        <w:pBdr>
+          <w:left w:val="single" w:sz="18" w:space="12" w:color="5B2A86"/>
+        </w:pBdr>
+        <w:shd w:val="clear" w:color="auto" w:fill="F4F0FA"/>
+        <w:spacing w:before="30" w:after="70"/>
+        <w:ind w:left="340" w:right="340"/>
+      </w:pPr>
+      <w:r>
+        <w:rPr>
+          <w:rFonts w:ascii="Georgia" w:hAnsi="Georgia" w:cs="Georgia"/>
+          <w:b w:val="0"/>
+          <w:i w:val="0"/>
+          <w:color w:val="222222"/>
+          <w:sz w:val="22"/>
+        </w:rPr>
+        <w:t xml:space="preserve">▶ </w:t>
+      </w:r>
+      <w:r>
+        <w:rPr>
+          <w:rFonts w:ascii="Georgia" w:hAnsi="Georgia" w:cs="Georgia"/>
+          <w:b/>
+          <w:i w:val="0"/>
+          <w:color w:val="222222"/>
+          <w:sz w:val="22"/>
+        </w:rPr>
+        <w:t>Level 5 Artificer (Artillerist).</w:t>
+      </w:r>
+      <w:r>
+        <w:rPr>
+          <w:rFonts w:ascii="Georgia" w:hAnsi="Georgia" w:cs="Georgia"/>
+          <w:b w:val="0"/>
+          <w:i w:val="0"/>
+          <w:color w:val="222222"/>
+          <w:sz w:val="22"/>
+        </w:rPr>
+        <w:t xml:space="preserve"> Her Eldritch Cannon deploys as a free action via the Glimmerspire Pocket Dynamo Mk II and runs all day. Signature gear: the Essence Sphere, the Frostbite Shard Dagger.</w:t>
+      </w:r>
+    </w:p>
+    <w:p>
+      <w:pPr>
+        <w:pBdr>
+          <w:left w:val="single" w:sz="18" w:space="12" w:color="1F6FB8"/>
+        </w:pBdr>
+        <w:shd w:val="clear" w:color="auto" w:fill="FBF6EA"/>
+        <w:spacing w:before="0" w:after="40"/>
+        <w:ind w:left="340" w:right="340"/>
+      </w:pPr>
+      <w:r>
+        <w:rPr>
+          <w:rFonts w:ascii="Georgia" w:hAnsi="Georgia" w:cs="Georgia"/>
+          <w:b/>
+          <w:color w:val="1F6FB8"/>
+          <w:sz w:val="23"/>
+        </w:rPr>
+        <w:t xml:space="preserve">Spell Slots, 1st Level   </w:t>
+      </w:r>
+      <w:r>
+        <w:rPr>
+          <w:rFonts w:ascii="Georgia" w:hAnsi="Georgia" w:cs="Georgia"/>
+          <w:b/>
+          <w:color w:val="1F6FB8"/>
+          <w:sz w:val="28"/>
+        </w:rPr>
+        <w:t xml:space="preserve">● ● ● ● </w:t>
+      </w:r>
+    </w:p>
+    <w:p>
+      <w:pPr>
+        <w:pBdr>
+          <w:left w:val="single" w:sz="18" w:space="12" w:color="1F6FB8"/>
+        </w:pBdr>
+        <w:shd w:val="clear" w:color="auto" w:fill="FBF6EA"/>
+        <w:spacing w:before="0" w:after="160"/>
+        <w:ind w:left="340" w:right="340"/>
+      </w:pPr>
+      <w:r>
+        <w:rPr>
+          <w:rFonts w:ascii="Georgia" w:hAnsi="Georgia" w:cs="Georgia"/>
+          <w:b/>
+          <w:color w:val="1F6FB8"/>
+          <w:sz w:val="23"/>
+        </w:rPr>
+        <w:t xml:space="preserve">Spell Slots, 2nd Level   </w:t>
+      </w:r>
+      <w:r>
+        <w:rPr>
+          <w:rFonts w:ascii="Georgia" w:hAnsi="Georgia" w:cs="Georgia"/>
+          <w:b/>
+          <w:color w:val="1F6FB8"/>
+          <w:sz w:val="28"/>
+        </w:rPr>
+        <w:t xml:space="preserve">● ● </w:t>
+      </w:r>
+    </w:p>
+    <w:p>
+      <w:pPr>
+        <w:keepNext/>
+        <w:spacing w:before="220" w:after="60"/>
+      </w:pPr>
+      <w:r>
+        <w:rPr>
+          <w:rFonts w:ascii="Georgia" w:hAnsi="Georgia" w:cs="Georgia"/>
+          <w:b/>
+          <w:color w:val="A0522D"/>
+          <w:sz w:val="26"/>
+        </w:rPr>
+        <w:t>Stabby Sharpblade</w:t>
+      </w:r>
+    </w:p>
+    <w:p>
+      <w:pPr>
+        <w:pBdr>
+          <w:left w:val="single" w:sz="18" w:space="12" w:color="5B2A86"/>
+        </w:pBdr>
+        <w:shd w:val="clear" w:color="auto" w:fill="F4F0FA"/>
+        <w:spacing w:before="30" w:after="70"/>
+        <w:ind w:left="340" w:right="340"/>
+      </w:pPr>
+      <w:r>
+        <w:rPr>
+          <w:rFonts w:ascii="Georgia" w:hAnsi="Georgia" w:cs="Georgia"/>
+          <w:b w:val="0"/>
+          <w:i w:val="0"/>
+          <w:color w:val="222222"/>
+          <w:sz w:val="22"/>
+        </w:rPr>
+        <w:t xml:space="preserve">▶ </w:t>
+      </w:r>
+      <w:r>
+        <w:rPr>
+          <w:rFonts w:ascii="Georgia" w:hAnsi="Georgia" w:cs="Georgia"/>
+          <w:b/>
+          <w:i w:val="0"/>
+          <w:color w:val="222222"/>
+          <w:sz w:val="22"/>
+        </w:rPr>
+        <w:t>Level 5 Monk (Kensei).</w:t>
+      </w:r>
+      <w:r>
+        <w:rPr>
+          <w:rFonts w:ascii="Georgia" w:hAnsi="Georgia" w:cs="Georgia"/>
+          <w:b w:val="0"/>
+          <w:i w:val="0"/>
+          <w:color w:val="222222"/>
+          <w:sz w:val="22"/>
+        </w:rPr>
+        <w:t xml:space="preserve"> No spell slots; he runs on Focus Points, all back on a short rest (Flurry of Blows, Stunning Strike, Patient Defense, Step of the Wind). Signature gear: the Candyfang Katana, the Sash of the Swift Current.</w:t>
+      </w:r>
+    </w:p>
+    <w:p>
+      <w:pPr>
+        <w:pBdr>
+          <w:left w:val="single" w:sz="18" w:space="12" w:color="A32B2B"/>
+        </w:pBdr>
+        <w:shd w:val="clear" w:color="auto" w:fill="FBF6EA"/>
+        <w:spacing w:before="0" w:after="160"/>
+        <w:ind w:left="340" w:right="340"/>
+      </w:pPr>
+      <w:r>
+        <w:rPr>
+          <w:rFonts w:ascii="Georgia" w:hAnsi="Georgia" w:cs="Georgia"/>
+          <w:b/>
+          <w:color w:val="A32B2B"/>
+          <w:sz w:val="23"/>
+        </w:rPr>
+        <w:t xml:space="preserve">Focus Points   </w:t>
+      </w:r>
+      <w:r>
+        <w:rPr>
+          <w:rFonts w:ascii="Georgia" w:hAnsi="Georgia" w:cs="Georgia"/>
+          <w:b/>
+          <w:color w:val="A32B2B"/>
+          <w:sz w:val="28"/>
+        </w:rPr>
+        <w:t xml:space="preserve">● ● ● ● ● </w:t>
+      </w:r>
+    </w:p>
+    <w:p>
+      <w:pPr>
+        <w:keepNext/>
+        <w:spacing w:before="220" w:after="60"/>
+      </w:pPr>
+      <w:r>
+        <w:rPr>
+          <w:rFonts w:ascii="Georgia" w:hAnsi="Georgia" w:cs="Georgia"/>
+          <w:b/>
+          <w:color w:val="A0522D"/>
+          <w:sz w:val="26"/>
+        </w:rPr>
+        <w:t>Ursa Catchum</w:t>
+      </w:r>
+    </w:p>
+    <w:p>
+      <w:pPr>
+        <w:pBdr>
+          <w:left w:val="single" w:sz="18" w:space="12" w:color="5B2A86"/>
+        </w:pBdr>
+        <w:shd w:val="clear" w:color="auto" w:fill="F4F0FA"/>
+        <w:spacing w:before="30" w:after="70"/>
+        <w:ind w:left="340" w:right="340"/>
+      </w:pPr>
+      <w:r>
+        <w:rPr>
+          <w:rFonts w:ascii="Georgia" w:hAnsi="Georgia" w:cs="Georgia"/>
+          <w:b w:val="0"/>
+          <w:i w:val="0"/>
+          <w:color w:val="222222"/>
+          <w:sz w:val="22"/>
+        </w:rPr>
+        <w:t xml:space="preserve">▶ </w:t>
+      </w:r>
+      <w:r>
+        <w:rPr>
+          <w:rFonts w:ascii="Georgia" w:hAnsi="Georgia" w:cs="Georgia"/>
+          <w:b/>
+          <w:i w:val="0"/>
+          <w:color w:val="222222"/>
+          <w:sz w:val="22"/>
+        </w:rPr>
+        <w:t>Level 5 Druid (Circle of the Stars).</w:t>
+      </w:r>
+      <w:r>
+        <w:rPr>
+          <w:rFonts w:ascii="Georgia" w:hAnsi="Georgia" w:cs="Georgia"/>
+          <w:b w:val="0"/>
+          <w:i w:val="0"/>
+          <w:color w:val="222222"/>
+          <w:sz w:val="22"/>
+        </w:rPr>
+        <w:t xml:space="preserve"> About eight free Guiding Bolts a day from the Star Map and the Staff of Waking Constellations' charges. Signature gear: the Staff, three enchanted potatoes.</w:t>
+      </w:r>
+    </w:p>
+    <w:p>
+      <w:pPr>
+        <w:pBdr>
+          <w:left w:val="single" w:sz="18" w:space="12" w:color="5B2A86"/>
+        </w:pBdr>
+        <w:shd w:val="clear" w:color="auto" w:fill="FBF6EA"/>
+        <w:spacing w:before="0" w:after="40"/>
+        <w:ind w:left="340" w:right="340"/>
+      </w:pPr>
+      <w:r>
+        <w:rPr>
+          <w:rFonts w:ascii="Georgia" w:hAnsi="Georgia" w:cs="Georgia"/>
+          <w:b/>
+          <w:color w:val="5B2A86"/>
+          <w:sz w:val="23"/>
+        </w:rPr>
+        <w:t xml:space="preserve">Spell Slots, 1st Level   </w:t>
+      </w:r>
+      <w:r>
+        <w:rPr>
+          <w:rFonts w:ascii="Georgia" w:hAnsi="Georgia" w:cs="Georgia"/>
+          <w:b/>
+          <w:color w:val="5B2A86"/>
+          <w:sz w:val="28"/>
+        </w:rPr>
+        <w:t xml:space="preserve">● ● ● ● </w:t>
+      </w:r>
+    </w:p>
+    <w:p>
+      <w:pPr>
+        <w:pBdr>
+          <w:left w:val="single" w:sz="18" w:space="12" w:color="5B2A86"/>
+        </w:pBdr>
+        <w:shd w:val="clear" w:color="auto" w:fill="FBF6EA"/>
+        <w:spacing w:before="0" w:after="40"/>
+        <w:ind w:left="340" w:right="340"/>
+      </w:pPr>
+      <w:r>
+        <w:rPr>
+          <w:rFonts w:ascii="Georgia" w:hAnsi="Georgia" w:cs="Georgia"/>
+          <w:b/>
+          <w:color w:val="5B2A86"/>
+          <w:sz w:val="23"/>
+        </w:rPr>
+        <w:t xml:space="preserve">Spell Slots, 2nd Level   </w:t>
+      </w:r>
+      <w:r>
+        <w:rPr>
+          <w:rFonts w:ascii="Georgia" w:hAnsi="Georgia" w:cs="Georgia"/>
+          <w:b/>
+          <w:color w:val="5B2A86"/>
+          <w:sz w:val="28"/>
+        </w:rPr>
+        <w:t xml:space="preserve">● ● ● </w:t>
+      </w:r>
+    </w:p>
+    <w:p>
+      <w:pPr>
+        <w:pBdr>
+          <w:left w:val="single" w:sz="18" w:space="12" w:color="5B2A86"/>
+        </w:pBdr>
+        <w:shd w:val="clear" w:color="auto" w:fill="FBF6EA"/>
+        <w:spacing w:before="0" w:after="160"/>
+        <w:ind w:left="340" w:right="340"/>
+      </w:pPr>
+      <w:r>
+        <w:rPr>
+          <w:rFonts w:ascii="Georgia" w:hAnsi="Georgia" w:cs="Georgia"/>
+          <w:b/>
+          <w:color w:val="5B2A86"/>
+          <w:sz w:val="23"/>
+        </w:rPr>
+        <w:t xml:space="preserve">Spell Slots, 3rd Level   </w:t>
+      </w:r>
+      <w:r>
+        <w:rPr>
+          <w:rFonts w:ascii="Georgia" w:hAnsi="Georgia" w:cs="Georgia"/>
+          <w:b/>
+          <w:color w:val="5B2A86"/>
+          <w:sz w:val="28"/>
+        </w:rPr>
+        <w:t xml:space="preserve">● ● </w:t>
       </w:r>
     </w:p>
     <w:p>

</xml_diff>

<commit_message>
Set-piece rules card block; Part IV character sheets; covenant gallery row; route-free map wired
Co-Authored-By: Claude Opus 4.8 <noreply@anthropic.com>
</commit_message>
<xml_diff>
--- a/compendium/custom_compendium.docx
+++ b/compendium/custom_compendium.docx
@@ -92,373 +92,7 @@
           <w:color w:val="222222"/>
           <w:sz w:val="21"/>
         </w:rPr>
-        <w:t>Homebrew and rulings of this table: the heroes as they stand at the table, the paths they may walk after the year apart, and the standing rules of the campaign. 2024 rules throughout; house rules override the books.</w:t>
-      </w:r>
-    </w:p>
-    <w:p>
-      <w:pPr>
-        <w:keepNext/>
-        <w:spacing w:before="400" w:after="120"/>
-        <w:pBdr>
-          <w:bottom w:val="single" w:sz="6" w:space="4" w:color="B8860B"/>
-        </w:pBdr>
-      </w:pPr>
-      <w:r>
-        <w:rPr>
-          <w:rFonts w:ascii="Georgia" w:hAnsi="Georgia" w:cs="Georgia"/>
-          <w:b/>
-          <w:color w:val="B8860B"/>
-          <w:sz w:val="32"/>
-        </w:rPr>
-        <w:t>The Guardians at the Table</w:t>
-      </w:r>
-    </w:p>
-    <w:p>
-      <w:pPr>
-        <w:spacing w:after="80"/>
-      </w:pPr>
-      <w:r>
-        <w:rPr>
-          <w:rFonts w:ascii="Georgia" w:hAnsi="Georgia" w:cs="Georgia"/>
-          <w:b w:val="0"/>
-          <w:i w:val="0"/>
-          <w:color w:val="222222"/>
-          <w:sz w:val="21"/>
-        </w:rPr>
-        <w:t>The chronicle's front matter tells you who the Guardians are; this page tells you what they roll. All three stand at level 5 at the close of the Gearhaven chapter.</w:t>
-      </w:r>
-    </w:p>
-    <w:p>
-      <w:pPr>
-        <w:keepNext/>
-        <w:spacing w:before="220" w:after="60"/>
-      </w:pPr>
-      <w:r>
-        <w:rPr>
-          <w:rFonts w:ascii="Georgia" w:hAnsi="Georgia" w:cs="Georgia"/>
-          <w:b/>
-          <w:color w:val="A0522D"/>
-          <w:sz w:val="26"/>
-        </w:rPr>
-        <w:t>Lilly Glimmergear</w:t>
-      </w:r>
-    </w:p>
-    <w:p>
-      <w:pPr>
-        <w:pBdr>
-          <w:left w:val="single" w:sz="18" w:space="12" w:color="5B2A86"/>
-        </w:pBdr>
-        <w:shd w:val="clear" w:color="auto" w:fill="F4F0FA"/>
-        <w:spacing w:before="30" w:after="70"/>
-        <w:ind w:left="340" w:right="340"/>
-      </w:pPr>
-      <w:r>
-        <w:rPr>
-          <w:rFonts w:ascii="Georgia" w:hAnsi="Georgia" w:cs="Georgia"/>
-          <w:b w:val="0"/>
-          <w:i w:val="0"/>
-          <w:color w:val="222222"/>
-          <w:sz w:val="22"/>
-        </w:rPr>
-        <w:t xml:space="preserve">▶ </w:t>
-      </w:r>
-      <w:r>
-        <w:rPr>
-          <w:rFonts w:ascii="Georgia" w:hAnsi="Georgia" w:cs="Georgia"/>
-          <w:b/>
-          <w:i w:val="0"/>
-          <w:color w:val="222222"/>
-          <w:sz w:val="22"/>
-        </w:rPr>
-        <w:t>Level 5 Artificer (Artillerist).</w:t>
-      </w:r>
-      <w:r>
-        <w:rPr>
-          <w:rFonts w:ascii="Georgia" w:hAnsi="Georgia" w:cs="Georgia"/>
-          <w:b w:val="0"/>
-          <w:i w:val="0"/>
-          <w:color w:val="222222"/>
-          <w:sz w:val="22"/>
-        </w:rPr>
-        <w:t xml:space="preserve"> Her Eldritch Cannon deploys as a free action via the Glimmerspire Pocket Dynamo Mk II and runs all day. Signature gear: the Essence Sphere, the Frostbite Shard Dagger.</w:t>
-      </w:r>
-    </w:p>
-    <w:p>
-      <w:pPr>
-        <w:pBdr>
-          <w:left w:val="single" w:sz="18" w:space="12" w:color="1F6FB8"/>
-        </w:pBdr>
-        <w:shd w:val="clear" w:color="auto" w:fill="FBF6EA"/>
-        <w:spacing w:before="0" w:after="40"/>
-        <w:ind w:left="340" w:right="340"/>
-      </w:pPr>
-      <w:r>
-        <w:rPr>
-          <w:rFonts w:ascii="Georgia" w:hAnsi="Georgia" w:cs="Georgia"/>
-          <w:b/>
-          <w:color w:val="1F6FB8"/>
-          <w:sz w:val="23"/>
-        </w:rPr>
-        <w:t xml:space="preserve">Spell Slots, 1st Level   </w:t>
-      </w:r>
-      <w:r>
-        <w:rPr>
-          <w:rFonts w:ascii="Georgia" w:hAnsi="Georgia" w:cs="Georgia"/>
-          <w:b/>
-          <w:color w:val="1F6FB8"/>
-          <w:sz w:val="28"/>
-        </w:rPr>
-        <w:t xml:space="preserve">● ● ● ● </w:t>
-      </w:r>
-    </w:p>
-    <w:p>
-      <w:pPr>
-        <w:pBdr>
-          <w:left w:val="single" w:sz="18" w:space="12" w:color="1F6FB8"/>
-        </w:pBdr>
-        <w:shd w:val="clear" w:color="auto" w:fill="FBF6EA"/>
-        <w:spacing w:before="0" w:after="160"/>
-        <w:ind w:left="340" w:right="340"/>
-      </w:pPr>
-      <w:r>
-        <w:rPr>
-          <w:rFonts w:ascii="Georgia" w:hAnsi="Georgia" w:cs="Georgia"/>
-          <w:b/>
-          <w:color w:val="1F6FB8"/>
-          <w:sz w:val="23"/>
-        </w:rPr>
-        <w:t xml:space="preserve">Spell Slots, 2nd Level   </w:t>
-      </w:r>
-      <w:r>
-        <w:rPr>
-          <w:rFonts w:ascii="Georgia" w:hAnsi="Georgia" w:cs="Georgia"/>
-          <w:b/>
-          <w:color w:val="1F6FB8"/>
-          <w:sz w:val="28"/>
-        </w:rPr>
-        <w:t xml:space="preserve">● ● </w:t>
-      </w:r>
-    </w:p>
-    <w:p>
-      <w:pPr>
-        <w:keepNext/>
-        <w:spacing w:before="220" w:after="60"/>
-      </w:pPr>
-      <w:r>
-        <w:rPr>
-          <w:rFonts w:ascii="Georgia" w:hAnsi="Georgia" w:cs="Georgia"/>
-          <w:b/>
-          <w:color w:val="A0522D"/>
-          <w:sz w:val="26"/>
-        </w:rPr>
-        <w:t>Stabby Sharpblade</w:t>
-      </w:r>
-    </w:p>
-    <w:p>
-      <w:pPr>
-        <w:pBdr>
-          <w:left w:val="single" w:sz="18" w:space="12" w:color="5B2A86"/>
-        </w:pBdr>
-        <w:shd w:val="clear" w:color="auto" w:fill="F4F0FA"/>
-        <w:spacing w:before="30" w:after="70"/>
-        <w:ind w:left="340" w:right="340"/>
-      </w:pPr>
-      <w:r>
-        <w:rPr>
-          <w:rFonts w:ascii="Georgia" w:hAnsi="Georgia" w:cs="Georgia"/>
-          <w:b w:val="0"/>
-          <w:i w:val="0"/>
-          <w:color w:val="222222"/>
-          <w:sz w:val="22"/>
-        </w:rPr>
-        <w:t xml:space="preserve">▶ </w:t>
-      </w:r>
-      <w:r>
-        <w:rPr>
-          <w:rFonts w:ascii="Georgia" w:hAnsi="Georgia" w:cs="Georgia"/>
-          <w:b/>
-          <w:i w:val="0"/>
-          <w:color w:val="222222"/>
-          <w:sz w:val="22"/>
-        </w:rPr>
-        <w:t>Level 5 Monk (Kensei).</w:t>
-      </w:r>
-      <w:r>
-        <w:rPr>
-          <w:rFonts w:ascii="Georgia" w:hAnsi="Georgia" w:cs="Georgia"/>
-          <w:b w:val="0"/>
-          <w:i w:val="0"/>
-          <w:color w:val="222222"/>
-          <w:sz w:val="22"/>
-        </w:rPr>
-        <w:t xml:space="preserve"> No spell slots; he runs on Focus Points, all back on a short rest (Flurry of Blows, Stunning Strike, Patient Defense, Step of the Wind). Signature gear: the Candyfang Katana, the Sash of the Swift Current.</w:t>
-      </w:r>
-    </w:p>
-    <w:p>
-      <w:pPr>
-        <w:pBdr>
-          <w:left w:val="single" w:sz="18" w:space="12" w:color="A32B2B"/>
-        </w:pBdr>
-        <w:shd w:val="clear" w:color="auto" w:fill="FBF6EA"/>
-        <w:spacing w:before="0" w:after="160"/>
-        <w:ind w:left="340" w:right="340"/>
-      </w:pPr>
-      <w:r>
-        <w:rPr>
-          <w:rFonts w:ascii="Georgia" w:hAnsi="Georgia" w:cs="Georgia"/>
-          <w:b/>
-          <w:color w:val="A32B2B"/>
-          <w:sz w:val="23"/>
-        </w:rPr>
-        <w:t xml:space="preserve">Focus Points   </w:t>
-      </w:r>
-      <w:r>
-        <w:rPr>
-          <w:rFonts w:ascii="Georgia" w:hAnsi="Georgia" w:cs="Georgia"/>
-          <w:b/>
-          <w:color w:val="A32B2B"/>
-          <w:sz w:val="28"/>
-        </w:rPr>
-        <w:t xml:space="preserve">● ● ● ● ● </w:t>
-      </w:r>
-    </w:p>
-    <w:p>
-      <w:pPr>
-        <w:keepNext/>
-        <w:spacing w:before="220" w:after="60"/>
-      </w:pPr>
-      <w:r>
-        <w:rPr>
-          <w:rFonts w:ascii="Georgia" w:hAnsi="Georgia" w:cs="Georgia"/>
-          <w:b/>
-          <w:color w:val="A0522D"/>
-          <w:sz w:val="26"/>
-        </w:rPr>
-        <w:t>Ursa Catchum</w:t>
-      </w:r>
-    </w:p>
-    <w:p>
-      <w:pPr>
-        <w:pBdr>
-          <w:left w:val="single" w:sz="18" w:space="12" w:color="5B2A86"/>
-        </w:pBdr>
-        <w:shd w:val="clear" w:color="auto" w:fill="F4F0FA"/>
-        <w:spacing w:before="30" w:after="70"/>
-        <w:ind w:left="340" w:right="340"/>
-      </w:pPr>
-      <w:r>
-        <w:rPr>
-          <w:rFonts w:ascii="Georgia" w:hAnsi="Georgia" w:cs="Georgia"/>
-          <w:b w:val="0"/>
-          <w:i w:val="0"/>
-          <w:color w:val="222222"/>
-          <w:sz w:val="22"/>
-        </w:rPr>
-        <w:t xml:space="preserve">▶ </w:t>
-      </w:r>
-      <w:r>
-        <w:rPr>
-          <w:rFonts w:ascii="Georgia" w:hAnsi="Georgia" w:cs="Georgia"/>
-          <w:b/>
-          <w:i w:val="0"/>
-          <w:color w:val="222222"/>
-          <w:sz w:val="22"/>
-        </w:rPr>
-        <w:t>Level 5 Druid (Circle of the Stars).</w:t>
-      </w:r>
-      <w:r>
-        <w:rPr>
-          <w:rFonts w:ascii="Georgia" w:hAnsi="Georgia" w:cs="Georgia"/>
-          <w:b w:val="0"/>
-          <w:i w:val="0"/>
-          <w:color w:val="222222"/>
-          <w:sz w:val="22"/>
-        </w:rPr>
-        <w:t xml:space="preserve"> About eight free Guiding Bolts a day from the Star Map and the Staff of Waking Constellations' charges. Signature gear: the Staff, three enchanted potatoes.</w:t>
-      </w:r>
-    </w:p>
-    <w:p>
-      <w:pPr>
-        <w:pBdr>
-          <w:left w:val="single" w:sz="18" w:space="12" w:color="5B2A86"/>
-        </w:pBdr>
-        <w:shd w:val="clear" w:color="auto" w:fill="FBF6EA"/>
-        <w:spacing w:before="0" w:after="40"/>
-        <w:ind w:left="340" w:right="340"/>
-      </w:pPr>
-      <w:r>
-        <w:rPr>
-          <w:rFonts w:ascii="Georgia" w:hAnsi="Georgia" w:cs="Georgia"/>
-          <w:b/>
-          <w:color w:val="5B2A86"/>
-          <w:sz w:val="23"/>
-        </w:rPr>
-        <w:t xml:space="preserve">Spell Slots, 1st Level   </w:t>
-      </w:r>
-      <w:r>
-        <w:rPr>
-          <w:rFonts w:ascii="Georgia" w:hAnsi="Georgia" w:cs="Georgia"/>
-          <w:b/>
-          <w:color w:val="5B2A86"/>
-          <w:sz w:val="28"/>
-        </w:rPr>
-        <w:t xml:space="preserve">● ● ● ● </w:t>
-      </w:r>
-    </w:p>
-    <w:p>
-      <w:pPr>
-        <w:pBdr>
-          <w:left w:val="single" w:sz="18" w:space="12" w:color="5B2A86"/>
-        </w:pBdr>
-        <w:shd w:val="clear" w:color="auto" w:fill="FBF6EA"/>
-        <w:spacing w:before="0" w:after="40"/>
-        <w:ind w:left="340" w:right="340"/>
-      </w:pPr>
-      <w:r>
-        <w:rPr>
-          <w:rFonts w:ascii="Georgia" w:hAnsi="Georgia" w:cs="Georgia"/>
-          <w:b/>
-          <w:color w:val="5B2A86"/>
-          <w:sz w:val="23"/>
-        </w:rPr>
-        <w:t xml:space="preserve">Spell Slots, 2nd Level   </w:t>
-      </w:r>
-      <w:r>
-        <w:rPr>
-          <w:rFonts w:ascii="Georgia" w:hAnsi="Georgia" w:cs="Georgia"/>
-          <w:b/>
-          <w:color w:val="5B2A86"/>
-          <w:sz w:val="28"/>
-        </w:rPr>
-        <w:t xml:space="preserve">● ● ● </w:t>
-      </w:r>
-    </w:p>
-    <w:p>
-      <w:pPr>
-        <w:pBdr>
-          <w:left w:val="single" w:sz="18" w:space="12" w:color="5B2A86"/>
-        </w:pBdr>
-        <w:shd w:val="clear" w:color="auto" w:fill="FBF6EA"/>
-        <w:spacing w:before="0" w:after="160"/>
-        <w:ind w:left="340" w:right="340"/>
-      </w:pPr>
-      <w:r>
-        <w:rPr>
-          <w:rFonts w:ascii="Georgia" w:hAnsi="Georgia" w:cs="Georgia"/>
-          <w:b/>
-          <w:color w:val="5B2A86"/>
-          <w:sz w:val="23"/>
-        </w:rPr>
-        <w:t xml:space="preserve">Spell Slots, 3rd Level   </w:t>
-      </w:r>
-      <w:r>
-        <w:rPr>
-          <w:rFonts w:ascii="Georgia" w:hAnsi="Georgia" w:cs="Georgia"/>
-          <w:b/>
-          <w:color w:val="5B2A86"/>
-          <w:sz w:val="28"/>
-        </w:rPr>
-        <w:t xml:space="preserve">● ● </w:t>
+        <w:t>Homebrew and rulings of this table: the paths the heroes may walk after the year apart, and the standing rules of the campaign. 2024 rules throughout; house rules override the books. The heroes themselves, every number, slot, and spell, now live in Part IV: The Guardians' Character Sheets.</w:t>
       </w:r>
     </w:p>
     <w:p>

</xml_diff>

<commit_message>
Book-wide geometry pass: zero margin violations
- S7: caption text-boxes had white shape fills, visible against the
  new parchment; converted to transparent
- Engine: imgrow tables drop Word's default side cell margins;
  statblock heads keep-chain so portraits cannot sink off page bottoms
- Shrunk two sinking floats (S1 Lilly, S2 villagers) and the Drowned
  Pirate portrait; automated sweep now reports zero margin violations
  and zero blank pages across all 10 PDFs

Co-Authored-By: Claude Opus 4.8 <noreply@anthropic.com>
</commit_message>
<xml_diff>
--- a/compendium/custom_compendium.docx
+++ b/compendium/custom_compendium.docx
@@ -3593,6 +3593,7 @@
     <w:p>
       <w:pPr>
         <w:keepNext/>
+        <w:keepLines/>
         <w:pBdr>
           <w:left w:val="single" w:sz="18" w:space="12" w:color="8B2020"/>
         </w:pBdr>
@@ -3653,6 +3654,8 @@
     </w:p>
     <w:p>
       <w:pPr>
+        <w:keepNext/>
+        <w:keepLines/>
         <w:pBdr>
           <w:left w:val="single" w:sz="18" w:space="12" w:color="8B2020"/>
         </w:pBdr>
@@ -3672,6 +3675,8 @@
     </w:p>
     <w:p>
       <w:pPr>
+        <w:keepNext/>
+        <w:keepLines/>
         <w:pBdr>
           <w:left w:val="single" w:sz="18" w:space="12" w:color="8B2020"/>
           <w:bottom w:val="single" w:sz="4" w:space="1" w:color="8B2020"/>
@@ -3683,6 +3688,8 @@
     </w:p>
     <w:p>
       <w:pPr>
+        <w:keepNext/>
+        <w:keepLines/>
         <w:pBdr>
           <w:left w:val="single" w:sz="18" w:space="12" w:color="8B2020"/>
         </w:pBdr>
@@ -3712,6 +3719,8 @@
     </w:p>
     <w:p>
       <w:pPr>
+        <w:keepNext/>
+        <w:keepLines/>
         <w:pBdr>
           <w:left w:val="single" w:sz="18" w:space="12" w:color="8B2020"/>
         </w:pBdr>
@@ -3741,6 +3750,8 @@
     </w:p>
     <w:p>
       <w:pPr>
+        <w:keepNext/>
+        <w:keepLines/>
         <w:pBdr>
           <w:left w:val="single" w:sz="18" w:space="12" w:color="8B2020"/>
         </w:pBdr>
@@ -3770,6 +3781,8 @@
     </w:p>
     <w:p>
       <w:pPr>
+        <w:keepNext/>
+        <w:keepLines/>
         <w:pBdr>
           <w:left w:val="single" w:sz="18" w:space="12" w:color="8B2020"/>
           <w:bottom w:val="single" w:sz="4" w:space="1" w:color="8B2020"/>
@@ -3781,6 +3794,8 @@
     </w:p>
     <w:p>
       <w:pPr>
+        <w:keepNext/>
+        <w:keepLines/>
         <w:pBdr>
           <w:left w:val="single" w:sz="18" w:space="12" w:color="8B2020"/>
         </w:pBdr>
@@ -4394,6 +4409,10 @@
         <w:jc w:val="center"/>
         <w:tblLayout w:type="fixed"/>
         <w:tblLook w:firstColumn="1" w:firstRow="1" w:lastColumn="0" w:lastRow="0" w:noHBand="0" w:noVBand="1" w:val="04A0"/>
+        <w:tblCellMar>
+          <w:left w:w="0" w:type="dxa"/>
+          <w:right w:w="0" w:type="dxa"/>
+        </w:tblCellMar>
       </w:tblPr>
       <w:tblGrid>
         <w:gridCol w:w="4680"/>

</xml_diff>

<commit_message>
Whitespace pass: bank opener/epilogue plates, fix part-opener orphan
Final round of the whole-book whitespace solution (39 offender pages ->
14, no blank or near-blank pages, 258 pages held, avg 13% -> 10%):
- Banked the approved Bestiary opener plate (Compendium Part I divider)
  and the Session 7 "One Year Later" epilogue plate (the worst page,
  63% -> filled).
- Sized part-opener plates (5.7 wide, hmax 3.4) so the opener image plus
  the part intro share the divider page without pushing the first
  creature's teaser onto a near-blank page.
- Plate floor (~3.0in) so short legacy img_w cards still fill; tightened
  the pack thumbnail cap so minor-mob rows co-locate cleanly.

Remaining >30% pages are borderline section-ends/openers (31-40%) plus
three Session 6 set-piece pages; no blanks anywhere. No em dashes.

Co-Authored-By: Claude Opus 4.8 <noreply@anthropic.com>
</commit_message>
<xml_diff>
--- a/compendium/custom_compendium.docx
+++ b/compendium/custom_compendium.docx
@@ -2961,6 +2961,52 @@
     </w:p>
     <w:p>
       <w:pPr>
+        <w:spacing w:after="0" w:before="0"/>
+      </w:pPr>
+      <w:r>
+        <w:drawing>
+          <wp:anchor xmlns:a="http://schemas.openxmlformats.org/drawingml/2006/main" behindDoc="0" distT="91440" distB="100584" distL="201600" distR="201600" simplePos="0" locked="0" layoutInCell="1" allowOverlap="0" relativeHeight="2">
+            <wp:simplePos x="0" y="0"/>
+            <wp:positionH relativeFrom="column">
+              <wp:align>right</wp:align>
+            </wp:positionH>
+            <wp:positionV relativeFrom="paragraph">
+              <wp:posOffset>0</wp:posOffset>
+            </wp:positionV>
+            <wp:extent cx="2468880" cy="2468880"/>
+            <wp:effectExtent l="0" t="0" r="0" b="0"/>
+            <wp:wrapSquare wrapText="bothSides"/>
+            <wp:docPr id="7" name="Picture 7"/>
+            <wp:cNvGraphicFramePr/>
+            <a:graphic xmlns:pic="http://schemas.openxmlformats.org/drawingml/2006/picture">
+              <a:graphicData uri="http://schemas.openxmlformats.org/drawingml/2006/picture">
+                <pic:pic>
+                  <pic:nvPicPr>
+                    <pic:cNvPr id="0" name="image.jpg"/>
+                    <pic:cNvPicPr/>
+                  </pic:nvPicPr>
+                  <pic:blipFill>
+                    <a:blip r:embed="rId11"/>
+                    <a:stretch>
+                      <a:fillRect/>
+                    </a:stretch>
+                  </pic:blipFill>
+                  <pic:spPr>
+                    <a:xfrm>
+                      <a:off x="0" y="0"/>
+                      <a:ext cx="2468880" cy="2468880"/>
+                    </a:xfrm>
+                    <a:prstGeom prst="rect"/>
+                  </pic:spPr>
+                </pic:pic>
+              </a:graphicData>
+            </a:graphic>
+          </wp:anchor>
+        </w:drawing>
+      </w:r>
+    </w:p>
+    <w:p>
+      <w:pPr>
         <w:pBdr>
           <w:left w:val="single" w:sz="18" w:space="12" w:color="B8860B"/>
         </w:pBdr>
@@ -3275,7 +3321,7 @@
             <wp:extent cx="2011680" cy="2011680"/>
             <wp:effectExtent l="0" t="0" r="0" b="0"/>
             <wp:wrapSquare wrapText="bothSides"/>
-            <wp:docPr id="7" name="Picture 7"/>
+            <wp:docPr id="8" name="Picture 8"/>
             <wp:cNvGraphicFramePr/>
             <a:graphic xmlns:pic="http://schemas.openxmlformats.org/drawingml/2006/picture">
               <a:graphicData uri="http://schemas.openxmlformats.org/drawingml/2006/picture">
@@ -3582,7 +3628,7 @@
             <wp:extent cx="2194560" cy="2194560"/>
             <wp:effectExtent l="0" t="0" r="0" b="0"/>
             <wp:wrapSquare wrapText="bothSides"/>
-            <wp:docPr id="8" name="Picture 8"/>
+            <wp:docPr id="9" name="Picture 9"/>
             <wp:cNvGraphicFramePr/>
             <a:graphic xmlns:pic="http://schemas.openxmlformats.org/drawingml/2006/picture">
               <a:graphicData uri="http://schemas.openxmlformats.org/drawingml/2006/picture">
@@ -4025,7 +4071,7 @@
             <wp:extent cx="2148840" cy="2148840"/>
             <wp:effectExtent l="0" t="0" r="0" b="0"/>
             <wp:wrapSquare wrapText="bothSides"/>
-            <wp:docPr id="9" name="Picture 9"/>
+            <wp:docPr id="10" name="Picture 10"/>
             <wp:cNvGraphicFramePr/>
             <a:graphic xmlns:pic="http://schemas.openxmlformats.org/drawingml/2006/picture">
               <a:graphicData uri="http://schemas.openxmlformats.org/drawingml/2006/picture">
@@ -4789,156 +4835,51 @@
         <w:t xml:space="preserve"> A dragonmark that woke when he was six: it prickles near frightened animals, grants Speak with Animals and Animal Friendship, and has become the channel through which sleeping and possessed things speak to him (Pikachu, the Grand Custodian). It has never once stirred for a machine.</w:t>
       </w:r>
     </w:p>
-    <w:tbl>
-      <w:tblPr>
-        <w:tblW w:type="auto" w:w="0"/>
-        <w:jc w:val="center"/>
-        <w:tblLayout w:type="fixed"/>
-        <w:tblLook w:firstColumn="1" w:firstRow="1" w:lastColumn="0" w:lastRow="0" w:noHBand="0" w:noVBand="1" w:val="04A0"/>
-        <w:tblCellMar>
-          <w:left w:w="0" w:type="dxa"/>
-          <w:right w:w="0" w:type="dxa"/>
-        </w:tblCellMar>
-      </w:tblPr>
-      <w:tblGrid>
-        <w:gridCol w:w="4680"/>
-        <w:gridCol w:w="4680"/>
-      </w:tblGrid>
-      <w:tr>
-        <w:tc>
-          <w:tcPr>
-            <w:tcW w:type="dxa" w:w="4680"/>
-          </w:tcPr>
-          <w:p>
-            <w:pPr>
-              <w:jc w:val="center"/>
-            </w:pPr>
-            <w:r>
-              <w:drawing>
-                <wp:inline xmlns:a="http://schemas.openxmlformats.org/drawingml/2006/main" xmlns:pic="http://schemas.openxmlformats.org/drawingml/2006/picture">
-                  <wp:extent cx="2194560" cy="2194560"/>
-                  <wp:docPr id="10" name="Picture 10"/>
-                  <wp:cNvGraphicFramePr>
-                    <a:graphicFrameLocks noChangeAspect="1"/>
-                  </wp:cNvGraphicFramePr>
-                  <a:graphic>
-                    <a:graphicData uri="http://schemas.openxmlformats.org/drawingml/2006/picture">
-                      <pic:pic>
-                        <pic:nvPicPr>
-                          <pic:cNvPr id="0" name="image.jpg"/>
-                          <pic:cNvPicPr/>
-                        </pic:nvPicPr>
-                        <pic:blipFill>
-                          <a:blip r:embed="rId19"/>
-                          <a:stretch>
-                            <a:fillRect/>
-                          </a:stretch>
-                        </pic:blipFill>
-                        <pic:spPr>
-                          <a:xfrm>
-                            <a:off x="0" y="0"/>
-                            <a:ext cx="2194560" cy="2194560"/>
-                          </a:xfrm>
-                          <a:prstGeom prst="rect"/>
-                        </pic:spPr>
-                      </pic:pic>
-                    </a:graphicData>
-                  </a:graphic>
-                </wp:inline>
-              </w:drawing>
-            </w:r>
-          </w:p>
-        </w:tc>
-        <w:tc>
-          <w:tcPr>
-            <w:tcW w:type="dxa" w:w="4680"/>
-          </w:tcPr>
-          <w:p>
-            <w:pPr>
-              <w:jc w:val="center"/>
-            </w:pPr>
-            <w:r>
-              <w:drawing>
-                <wp:inline xmlns:a="http://schemas.openxmlformats.org/drawingml/2006/main" xmlns:pic="http://schemas.openxmlformats.org/drawingml/2006/picture">
-                  <wp:extent cx="2194560" cy="2194560"/>
-                  <wp:docPr id="11" name="Picture 11"/>
-                  <wp:cNvGraphicFramePr>
-                    <a:graphicFrameLocks noChangeAspect="1"/>
-                  </wp:cNvGraphicFramePr>
-                  <a:graphic>
-                    <a:graphicData uri="http://schemas.openxmlformats.org/drawingml/2006/picture">
-                      <pic:pic>
-                        <pic:nvPicPr>
-                          <pic:cNvPr id="0" name="image.jpg"/>
-                          <pic:cNvPicPr/>
-                        </pic:nvPicPr>
-                        <pic:blipFill>
-                          <a:blip r:embed="rId20"/>
-                          <a:stretch>
-                            <a:fillRect/>
-                          </a:stretch>
-                        </pic:blipFill>
-                        <pic:spPr>
-                          <a:xfrm>
-                            <a:off x="0" y="0"/>
-                            <a:ext cx="2194560" cy="2194560"/>
-                          </a:xfrm>
-                          <a:prstGeom prst="rect"/>
-                        </pic:spPr>
-                      </pic:pic>
-                    </a:graphicData>
-                  </a:graphic>
-                </wp:inline>
-              </w:drawing>
-            </w:r>
-          </w:p>
-        </w:tc>
-      </w:tr>
-      <w:tr>
-        <w:tc>
-          <w:tcPr>
-            <w:tcW w:type="dxa" w:w="4680"/>
-          </w:tcPr>
-          <w:p>
-            <w:pPr>
-              <w:jc w:val="center"/>
-            </w:pPr>
-            <w:r>
-              <w:rPr>
-                <w:rFonts w:ascii="Georgia" w:hAnsi="Georgia" w:cs="Georgia"/>
-                <w:i/>
-                <w:color w:val="888888"/>
-                <w:sz w:val="18"/>
-              </w:rPr>
-              <w:t>The seven-point star of Elaria, held close.</w:t>
-            </w:r>
-          </w:p>
-        </w:tc>
-        <w:tc>
-          <w:tcPr>
-            <w:tcW w:type="dxa" w:w="4680"/>
-          </w:tcPr>
-          <w:p>
-            <w:pPr>
-              <w:jc w:val="center"/>
-            </w:pPr>
-            <w:r>
-              <w:rPr>
-                <w:rFonts w:ascii="Georgia" w:hAnsi="Georgia" w:cs="Georgia"/>
-                <w:i/>
-                <w:color w:val="888888"/>
-                <w:sz w:val="18"/>
-              </w:rPr>
-              <w:t>Elaria, the sleeping goddess who lit the way.</w:t>
-            </w:r>
-          </w:p>
-        </w:tc>
-      </w:tr>
-    </w:tbl>
     <w:p>
       <w:pPr>
-        <w:spacing w:after="80"/>
-      </w:pPr>
+        <w:spacing w:after="0" w:before="0"/>
+      </w:pPr>
+      <w:r>
+        <w:drawing>
+          <wp:anchor xmlns:a="http://schemas.openxmlformats.org/drawingml/2006/main" behindDoc="0" distT="91440" distB="100584" distL="201600" distR="201600" simplePos="0" locked="0" layoutInCell="1" allowOverlap="0" relativeHeight="2">
+            <wp:simplePos x="0" y="0"/>
+            <wp:positionH relativeFrom="column">
+              <wp:align>right</wp:align>
+            </wp:positionH>
+            <wp:positionV relativeFrom="paragraph">
+              <wp:posOffset>0</wp:posOffset>
+            </wp:positionV>
+            <wp:extent cx="2743200" cy="2743200"/>
+            <wp:effectExtent l="0" t="0" r="0" b="0"/>
+            <wp:wrapSquare wrapText="bothSides"/>
+            <wp:docPr id="11" name="Picture 11"/>
+            <wp:cNvGraphicFramePr/>
+            <a:graphic xmlns:pic="http://schemas.openxmlformats.org/drawingml/2006/picture">
+              <a:graphicData uri="http://schemas.openxmlformats.org/drawingml/2006/picture">
+                <pic:pic>
+                  <pic:nvPicPr>
+                    <pic:cNvPr id="0" name="image.jpg"/>
+                    <pic:cNvPicPr/>
+                  </pic:nvPicPr>
+                  <pic:blipFill>
+                    <a:blip r:embed="rId19"/>
+                    <a:stretch>
+                      <a:fillRect/>
+                    </a:stretch>
+                  </pic:blipFill>
+                  <pic:spPr>
+                    <a:xfrm>
+                      <a:off x="0" y="0"/>
+                      <a:ext cx="2743200" cy="2743200"/>
+                    </a:xfrm>
+                    <a:prstGeom prst="rect"/>
+                  </pic:spPr>
+                </pic:pic>
+              </a:graphicData>
+            </a:graphic>
+          </wp:anchor>
+        </w:drawing>
+      </w:r>
     </w:p>
     <w:p>
       <w:pPr>
@@ -5011,6 +4952,62 @@
           <w:sz w:val="19"/>
         </w:rPr>
         <w:t>Elaria spent her power the way a candle spends itself: all at once, on purpose, so others could see. When Maldrith was sealed beyond the last wall, the Warden had nothing left but her name and her sign, the seven-pointed star wrapped in a leafed vine. She scattered what remained into small safeguards and lay down to sleep, trusting the kind to find them. So far, the old tellings say, her trust has held.</w:t>
+      </w:r>
+    </w:p>
+    <w:p>
+      <w:pPr>
+        <w:keepNext/>
+        <w:spacing w:before="120" w:after="40"/>
+        <w:jc w:val="center"/>
+      </w:pPr>
+      <w:r>
+        <w:drawing>
+          <wp:inline xmlns:a="http://schemas.openxmlformats.org/drawingml/2006/main" xmlns:pic="http://schemas.openxmlformats.org/drawingml/2006/picture">
+            <wp:extent cx="5943600" cy="3958530"/>
+            <wp:docPr id="12" name="Picture 12"/>
+            <wp:cNvGraphicFramePr>
+              <a:graphicFrameLocks noChangeAspect="1"/>
+            </wp:cNvGraphicFramePr>
+            <a:graphic>
+              <a:graphicData uri="http://schemas.openxmlformats.org/drawingml/2006/picture">
+                <pic:pic>
+                  <pic:nvPicPr>
+                    <pic:cNvPr id="0" name="image.jpg"/>
+                    <pic:cNvPicPr/>
+                  </pic:nvPicPr>
+                  <pic:blipFill>
+                    <a:blip r:embed="rId20"/>
+                    <a:stretch>
+                      <a:fillRect/>
+                    </a:stretch>
+                  </pic:blipFill>
+                  <pic:spPr>
+                    <a:xfrm>
+                      <a:off x="0" y="0"/>
+                      <a:ext cx="5943600" cy="3958530"/>
+                    </a:xfrm>
+                    <a:prstGeom prst="rect"/>
+                  </pic:spPr>
+                </pic:pic>
+              </a:graphicData>
+            </a:graphic>
+          </wp:inline>
+        </w:drawing>
+      </w:r>
+    </w:p>
+    <w:p>
+      <w:pPr>
+        <w:spacing w:after="140"/>
+        <w:jc w:val="center"/>
+      </w:pPr>
+      <w:r>
+        <w:rPr>
+          <w:rFonts w:ascii="Georgia" w:hAnsi="Georgia" w:cs="Georgia"/>
+          <w:i/>
+          <w:color w:val="888888"/>
+          <w:sz w:val="18"/>
+        </w:rPr>
+        <w:t>Elaria, the sleeping goddess who lit the way.</w:t>
       </w:r>
     </w:p>
     <w:sectPr>

</xml_diff>

<commit_message>
Remove Air-spirit HP from house rules: it is RAW, not a ruling
The 2024 Summon Beast stat block itself gives the Air form 20 HP (10
under Land/Water). Never a house rule. Removed from house_rules.md,
the Compendium's printed list, the style guide, and CLAUDE.md's seed
list; renumbered to 1-7 everywhere; book PDF rebuilt.

Co-Authored-By: Claude Opus 4.8 <noreply@anthropic.com>
</commit_message>
<xml_diff>
--- a/compendium/custom_compendium.docx
+++ b/compendium/custom_compendium.docx
@@ -185,7 +185,7 @@
           <w:color w:val="222222"/>
           <w:sz w:val="21"/>
         </w:rPr>
-        <w:t>5. Ursa's summoned Air spirit has 20 HP.</w:t>
+        <w:t>5. Deep gnome uses the current 2024-era printing (Svirfneblin Camouflage, Disguise Self and Nondetection 1/long rest each).</w:t>
       </w:r>
     </w:p>
     <w:p>
@@ -200,7 +200,7 @@
           <w:color w:val="222222"/>
           <w:sz w:val="21"/>
         </w:rPr>
-        <w:t>6. Deep gnome uses the current 2024-era printing (Svirfneblin Camouflage, Disguise Self and Nondetection 1/long rest each).</w:t>
+        <w:t>6. Lilly's cannon picks its mode on EVERY activation (Forge of the Artificer rule).</w:t>
       </w:r>
     </w:p>
     <w:p>
@@ -215,22 +215,7 @@
           <w:color w:val="222222"/>
           <w:sz w:val="21"/>
         </w:rPr>
-        <w:t>7. Lilly's cannon picks its mode on EVERY activation (Forge of the Artificer rule).</w:t>
-      </w:r>
-    </w:p>
-    <w:p>
-      <w:pPr>
-        <w:spacing w:after="80"/>
-      </w:pPr>
-      <w:r>
-        <w:rPr>
-          <w:rFonts w:ascii="Georgia" w:hAnsi="Georgia" w:cs="Georgia"/>
-          <w:b w:val="0"/>
-          <w:i w:val="0"/>
-          <w:color w:val="222222"/>
-          <w:sz w:val="21"/>
-        </w:rPr>
-        <w:t>8. Potent Spellcasting rides the kindled staff once per turn (Ursa, from level 7).</w:t>
+        <w:t>7. Potent Spellcasting rides the kindled staff once per turn (Ursa, from level 7).</w:t>
       </w:r>
     </w:p>
     <w:p>

</xml_diff>

<commit_message>
House rules reduced to true adjudications; RAW reminders reclassified
The cannon's per-activation mode pick is core 2024 artificer text
(Forge of the Artificer), not a house rule; same standard applied to
the rest of the list. True house rules are now just the two homebrew
adjudications (Starseed druid-spells-only scope; Potent Spellcasting
on the kindled staff once per turn). Patient Defense, Goodberry,
the Shillelagh swap, the deep gnome printing, cannon mode, and Air
spirit HP are reclassified as unnumbered 2024 migration notes: RAW,
recorded only so documents never regress to 2014 text.

Applied consistently across memory/house_rules.md, the Compendium's
printed section, rules_text_style.md, and CLAUDE.md. Book rebuilt.

Co-Authored-By: Claude Opus 4.8 <noreply@anthropic.com>
</commit_message>
<xml_diff>
--- a/compendium/custom_compendium.docx
+++ b/compendium/custom_compendium.docx
@@ -120,6 +120,21 @@
       <w:r>
         <w:rPr>
           <w:rFonts w:ascii="Georgia" w:hAnsi="Georgia" w:cs="Georgia"/>
+          <w:b/>
+          <w:i w:val="0"/>
+          <w:color w:val="222222"/>
+          <w:sz w:val="21"/>
+        </w:rPr>
+        <w:t>House rules (adjudications beyond the printed rules).</w:t>
+      </w:r>
+    </w:p>
+    <w:p>
+      <w:pPr>
+        <w:spacing w:after="80"/>
+      </w:pPr>
+      <w:r>
+        <w:rPr>
+          <w:rFonts w:ascii="Georgia" w:hAnsi="Georgia" w:cs="Georgia"/>
           <w:b w:val="0"/>
           <w:i w:val="0"/>
           <w:color w:val="222222"/>
@@ -140,13 +155,23 @@
           <w:color w:val="222222"/>
           <w:sz w:val="21"/>
         </w:rPr>
-        <w:t>2. Patient Defense grants a free Disengage (add Dodge by spending 1 Focus).</w:t>
+        <w:t>2. Potent Spellcasting rides the kindled staff once per turn (Ursa, from level 7; no double-dipping with a cantrip in the same turn).</w:t>
       </w:r>
     </w:p>
     <w:p>
       <w:pPr>
         <w:spacing w:after="80"/>
       </w:pPr>
+      <w:r>
+        <w:rPr>
+          <w:rFonts w:ascii="Georgia" w:hAnsi="Georgia" w:cs="Georgia"/>
+          <w:b/>
+          <w:i w:val="0"/>
+          <w:color w:val="222222"/>
+          <w:sz w:val="21"/>
+        </w:rPr>
+        <w:t>2024 notes (these are the printed rules, recorded so the table never slips back to older text).</w:t>
+      </w:r>
       <w:r>
         <w:rPr>
           <w:rFonts w:ascii="Georgia" w:hAnsi="Georgia" w:cs="Georgia"/>
@@ -155,67 +180,7 @@
           <w:color w:val="222222"/>
           <w:sz w:val="21"/>
         </w:rPr>
-        <w:t>3. Shillelagh replaces Primal Savagery on Ursa's sheet (2024 rules).</w:t>
-      </w:r>
-    </w:p>
-    <w:p>
-      <w:pPr>
-        <w:spacing w:after="80"/>
-      </w:pPr>
-      <w:r>
-        <w:rPr>
-          <w:rFonts w:ascii="Georgia" w:hAnsi="Georgia" w:cs="Georgia"/>
-          <w:b w:val="0"/>
-          <w:i w:val="0"/>
-          <w:color w:val="222222"/>
-          <w:sz w:val="21"/>
-        </w:rPr>
-        <w:t>4. Goodberry: eating a berry is a Bonus Action (2024).</w:t>
-      </w:r>
-    </w:p>
-    <w:p>
-      <w:pPr>
-        <w:spacing w:after="80"/>
-      </w:pPr>
-      <w:r>
-        <w:rPr>
-          <w:rFonts w:ascii="Georgia" w:hAnsi="Georgia" w:cs="Georgia"/>
-          <w:b w:val="0"/>
-          <w:i w:val="0"/>
-          <w:color w:val="222222"/>
-          <w:sz w:val="21"/>
-        </w:rPr>
-        <w:t>5. Deep gnome uses the current 2024-era printing (Svirfneblin Camouflage, Disguise Self and Nondetection 1/long rest each).</w:t>
-      </w:r>
-    </w:p>
-    <w:p>
-      <w:pPr>
-        <w:spacing w:after="80"/>
-      </w:pPr>
-      <w:r>
-        <w:rPr>
-          <w:rFonts w:ascii="Georgia" w:hAnsi="Georgia" w:cs="Georgia"/>
-          <w:b w:val="0"/>
-          <w:i w:val="0"/>
-          <w:color w:val="222222"/>
-          <w:sz w:val="21"/>
-        </w:rPr>
-        <w:t>6. Lilly's cannon picks its mode on EVERY activation (Forge of the Artificer rule).</w:t>
-      </w:r>
-    </w:p>
-    <w:p>
-      <w:pPr>
-        <w:spacing w:after="80"/>
-      </w:pPr>
-      <w:r>
-        <w:rPr>
-          <w:rFonts w:ascii="Georgia" w:hAnsi="Georgia" w:cs="Georgia"/>
-          <w:b w:val="0"/>
-          <w:i w:val="0"/>
-          <w:color w:val="222222"/>
-          <w:sz w:val="21"/>
-        </w:rPr>
-        <w:t>7. Potent Spellcasting rides the kindled staff once per turn (Ursa, from level 7).</w:t>
+        <w:t xml:space="preserve"> Patient Defense's free tier is Disengage; Dodge costs 1 Focus Point. Eating a Goodberry is a Bonus Action. Shillelagh replaced Primal Savagery on Ursa's sheet. Deep gnome uses the current printing (Svirfneblin Camouflage; Disguise Self and Nondetection 1/long rest each). The Eldritch Cannon picks its mode on every activation. The Air Bestial Spirit has 20 Hit Points by its own stat block.</w:t>
       </w:r>
     </w:p>
     <w:p>

</xml_diff>

<commit_message>
Aether Ward reaches 30 ft
DM call: 15 ft was too tight. It made the whole party bunch up around Lilly to
get the shell, which fights how this group actually stands in a fight, with
Ursa at the back line and Stabby out front.

Changed in all three places the power is written down, so the sheet, the sim
checklist and the book cannot drift apart: her character sheet, the Door C
section of lilly_kit.md that a combat sim reads before every turn, and the
Aether Channeler entry in build_compendium.py that is the authoritative text
for the door.

Re-rendered the book so the Compendium stops printing the old range. That
sweeps in the rest of the generated PDFs and docx sources, which had drifted
from their builders, and re-merges the three character sheets into the
Compendium, picking up Lilly's four-page rebuild.

Co-Authored-By: Claude Opus 5 <noreply@anthropic.com>
</commit_message>
<xml_diff>
--- a/compendium/custom_compendium.docx
+++ b/compendium/custom_compendium.docx
@@ -5155,7 +5155,7 @@
           <w:color w:val="222222"/>
           <w:sz w:val="21"/>
         </w:rPr>
-        <w:t>Three masterworks of deep gnome artifice, forged for Lilly Glimmergear in the year apart. Three masterworks, one choice. Each door of Lilly's year apart leads to one of these treasures: stay and build the portal (the Sentinel), go home to Glimmerspire and Poots (the Storm Cell), or give the year to mote research (the Awakened Sphere). And on every road she carries Boomstick, Poots's parting work: a Level 7 Artillerist does not walk into the rifts without her sidearm. Boomstick takes the dagger's watch on every road, so the Frostbite Shard retires to her belt, unattuned, a keepsake and one day a gift. The attunement ledger runs light: the Sphere's road holds two of three (Dynamo, Sphere); the Sentinel's road just one (the guardian itself, the Dynamo rebuilt inside it); the Storm Cell's road two (Dynamo, the Cell). Room to grow on every path.</w:t>
+        <w:t>One weapon and one mastery, forged for Lilly Glimmergear in the year apart. Wherever her road leads, Poots's parting work finds her: Boomstick, the sidearm no Level 7 Artillerist walks into the rifts without. On top of the gun, the year teaches her a single mastery of three: stay and build the portal (Sentinel Protocol), go home to Glimmerspire and Poots (Stormgunner), or give the year to mote research (Aether Channeler). The mastery is hers, learned into hand and mind, not an item on her belt, so her attunements stay free for the Pocket Dynamo and whatever the rifts yield. The Frostbite Shard retires to her belt, a keepsake and one day a gift.</w:t>
       </w:r>
     </w:p>
     <w:p>
@@ -5291,7 +5291,7 @@
           <w:color w:val="222222"/>
           <w:sz w:val="18"/>
         </w:rPr>
-        <w:t>Weapon (Repeating Pistol), Rare</w:t>
+        <w:t>Weapon (Repeating Pistol), Very Rare</w:t>
       </w:r>
     </w:p>
     <w:p>
@@ -5386,7 +5386,7 @@
           <w:color w:val="A0522D"/>
           <w:sz w:val="26"/>
         </w:rPr>
-        <w:t>Boomstick, Stormcharged (the Storm Cell)</w:t>
+        <w:t>Stormgunner (the Glimmerspire Road)</w:t>
       </w:r>
     </w:p>
     <w:p>
@@ -5477,7 +5477,7 @@
           <w:color w:val="222222"/>
           <w:sz w:val="21"/>
         </w:rPr>
-        <w:t>On this road Lilly goes home to Glimmerspire, and the masters open the deep workshops for Poots's brightest student. What she brings back is the Storm Cell: a humming capacitor drum fitted to Boomstick's frame, charged each night with bottled lightning, Gearhaven's own element.</w:t>
+        <w:t>On this road Lilly goes home to Glimmerspire, and the masters open the deep workshops for Poots's brightest student. What she brings back is not a device but a way of shooting: Boomstick becomes an extension of her own hand, stormcharged.</w:t>
       </w:r>
     </w:p>
     <w:p>
@@ -5497,7 +5497,7 @@
           <w:color w:val="8B2020"/>
           <w:sz w:val="22"/>
         </w:rPr>
-        <w:t>The Storm Cell</w:t>
+        <w:t>Stormgunner</w:t>
       </w:r>
     </w:p>
     <w:p>
@@ -5517,7 +5517,7 @@
           <w:color w:val="222222"/>
           <w:sz w:val="18"/>
         </w:rPr>
-        <w:t>Wondrous Item (Boomstick augmentation), Rare (Requires Attunement by Lilly)</w:t>
+        <w:t>Path Feat (chosen in the year apart; requires Boomstick)</w:t>
       </w:r>
     </w:p>
     <w:p>
@@ -5537,7 +5537,7 @@
           <w:color w:val="222222"/>
           <w:sz w:val="18"/>
         </w:rPr>
-        <w:t>Wand of the War Mage.</w:t>
+        <w:t>War-Trained.</w:t>
       </w:r>
       <w:r>
         <w:rPr>
@@ -5547,7 +5547,7 @@
           <w:color w:val="222222"/>
           <w:sz w:val="18"/>
         </w:rPr>
-        <w:t xml:space="preserve"> While holding Boomstick, you gain a +2 bonus to spell attack rolls, and you ignore Half Cover when making a spell attack. Your Eldritch Cannon also gains a +2 bonus to its attack rolls.</w:t>
+        <w:t xml:space="preserve"> You have Advantage on Constitution saving throws you make to maintain Concentration, and you can perform the Somatic components of your Artificer spells even when you have Boomstick or a Shield in one or both hands.</w:t>
       </w:r>
     </w:p>
     <w:p>
@@ -5577,7 +5577,7 @@
           <w:color w:val="222222"/>
           <w:sz w:val="18"/>
         </w:rPr>
-        <w:t xml:space="preserve"> The drum never stops humming. Whenever you hit a creature with Boomstick, the shot crackles: the target takes an extra 1d6 Lightning damage, and lightning arcs from it to up to two other creatures of your choice within 15 feet of it. Each arced creature must make a Dexterity saving throw against your spell save DC, taking 2d6 Lightning damage on a failed save, or half as much damage on a successful one.</w:t>
+        <w:t xml:space="preserve"> When you hit a creature with Boomstick, that creature takes an extra 1d6 Lightning damage, and the lightning arcs from it to up to two other creatures of your choice within 15 feet of it. Each arced creature makes a Dexterity saving throw against your spell save DC, taking 2d6 Lightning damage on a failed save or half as much damage on a successful one.</w:t>
       </w:r>
     </w:p>
     <w:p>
@@ -5597,7 +5597,7 @@
           <w:color w:val="222222"/>
           <w:sz w:val="18"/>
         </w:rPr>
-        <w:t>Charged Rounds.</w:t>
+        <w:t>Counter-Bolt (twice per Long Rest).</w:t>
       </w:r>
       <w:r>
         <w:rPr>
@@ -5607,7 +5607,7 @@
           <w:color w:val="222222"/>
           <w:sz w:val="18"/>
         </w:rPr>
-        <w:t xml:space="preserve"> The Storm Cell holds two Thunder Wave Rounds and two Counter-Bolts, and you regain all expended rounds when you finish a Long Rest. If a round requires a saving throw, the DC equals your spell save DC.</w:t>
+        <w:t xml:space="preserve"> When a creature you can see within 60 feet of you makes an attack roll against one of your allies, you can take a Reaction to fire Boomstick into the attack. The triggering attack roll has Disadvantage, and you make one attack with Boomstick against the attacker; on a hit, the target takes an extra 1d10 Lightning damage.</w:t>
       </w:r>
     </w:p>
     <w:p>
@@ -5627,7 +5627,7 @@
           <w:color w:val="222222"/>
           <w:sz w:val="18"/>
         </w:rPr>
-        <w:t>Thunder Wave Round.</w:t>
+        <w:t>Overloaded Shot (twice per Long Rest).</w:t>
       </w:r>
       <w:r>
         <w:rPr>
@@ -5637,7 +5637,7 @@
           <w:color w:val="222222"/>
           <w:sz w:val="18"/>
         </w:rPr>
-        <w:t xml:space="preserve"> When you hit a creature with Boomstick, you can expend one Thunder Wave Round to overload the shot: the target takes an extra 1d10 Lightning damage and must succeed on a Constitution saving throw or have the Stunned condition until the end of your next turn.</w:t>
+        <w:t xml:space="preserve"> When you hit a creature with Boomstick, you can overload the shot to deal an extra 1d10 Lightning damage; the target must succeed on a Constitution saving throw against your spell save DC or have the Stunned condition until the end of your next turn.</w:t>
       </w:r>
     </w:p>
     <w:p>
@@ -5652,72 +5652,12 @@
       <w:r>
         <w:rPr>
           <w:rFonts w:ascii="Georgia" w:hAnsi="Georgia" w:cs="Georgia"/>
-          <w:b/>
-          <w:i w:val="0"/>
-          <w:color w:val="222222"/>
-          <w:sz w:val="18"/>
-        </w:rPr>
-        <w:t>Counter-Bolt.</w:t>
-      </w:r>
-      <w:r>
-        <w:rPr>
-          <w:rFonts w:ascii="Georgia" w:hAnsi="Georgia" w:cs="Georgia"/>
-          <w:b w:val="0"/>
-          <w:i w:val="0"/>
-          <w:color w:val="222222"/>
-          <w:sz w:val="18"/>
-        </w:rPr>
-        <w:t xml:space="preserve"> When a creature you can see within 60 feet makes an attack roll against one of your allies, you can take a Reaction and expend one Counter-Bolt to fire into the attack: the triggering attack roll has Disadvantage, and you make one Boomstick attack against the creature. On a hit, it takes an extra 1d10 Lightning damage.</w:t>
-      </w:r>
-    </w:p>
-    <w:p>
-      <w:pPr>
-        <w:pBdr>
-          <w:left w:val="single" w:sz="18" w:space="12" w:color="8B2020"/>
-        </w:pBdr>
-        <w:shd w:val="clear" w:color="auto" w:fill="FCF6F6"/>
-        <w:spacing w:before="30" w:after="70"/>
-        <w:ind w:left="340" w:right="340"/>
-      </w:pPr>
-      <w:r>
-        <w:rPr>
-          <w:rFonts w:ascii="Georgia" w:hAnsi="Georgia" w:cs="Georgia"/>
-          <w:b/>
-          <w:i w:val="0"/>
-          <w:color w:val="222222"/>
-          <w:sz w:val="18"/>
-        </w:rPr>
-        <w:t>Made to Channel.</w:t>
-      </w:r>
-      <w:r>
-        <w:rPr>
-          <w:rFonts w:ascii="Georgia" w:hAnsi="Georgia" w:cs="Georgia"/>
-          <w:b w:val="0"/>
-          <w:i w:val="0"/>
-          <w:color w:val="222222"/>
-          <w:sz w:val="18"/>
-        </w:rPr>
-        <w:t xml:space="preserve"> When you cast True Strike using Boomstick, the attack uses your Intelligence and counts as a spell attack, gaining the Storm Cell's +2 bonus to spell attack rolls and ignoring Half Cover. On a hit, the attack deals Boomstick's Thunder damage plus the spell's Radiant damage.</w:t>
-      </w:r>
-    </w:p>
-    <w:p>
-      <w:pPr>
-        <w:pBdr>
-          <w:left w:val="single" w:sz="18" w:space="12" w:color="8B2020"/>
-        </w:pBdr>
-        <w:shd w:val="clear" w:color="auto" w:fill="FCF6F6"/>
-        <w:spacing w:before="30" w:after="70"/>
-        <w:ind w:left="340" w:right="340"/>
-      </w:pPr>
-      <w:r>
-        <w:rPr>
-          <w:rFonts w:ascii="Georgia" w:hAnsi="Georgia" w:cs="Georgia"/>
           <w:b w:val="0"/>
           <w:i/>
           <w:color w:val="222222"/>
           <w:sz w:val="18"/>
         </w:rPr>
-        <w:t>Fitted by the masters of Glimmerstone, in the workshop where Boomstick was born.</w:t>
+        <w:t>A way of shooting learned in the workshops of Glimmerstone.</w:t>
       </w:r>
     </w:p>
     <w:p>
@@ -5733,7 +5673,7 @@
           <w:color w:val="A0522D"/>
           <w:sz w:val="26"/>
         </w:rPr>
-        <w:t>The Awakened Essence Sphere</w:t>
+        <w:t>Aether Channeler (the Mote-Research Road)</w:t>
       </w:r>
     </w:p>
     <w:p>
@@ -5814,7 +5754,7 @@
           <w:color w:val="222222"/>
           <w:sz w:val="21"/>
         </w:rPr>
-        <w:t>The Sphere has spent the whole journey quietly pulling loose motes from the air. Now awakened, it holds a swirling jumble of collected aether that powers it from the start, and as the party clears each elemental rift and installs its pure Mote, the Sphere learns that plane's mighty discharge. The Sphere is honest about its bargain: at Session 8 it grants Aether Ward alone (twice per Short Rest), and every one of its five discharges sleeps behind a rift still to be won. What it builds toward is a toolbox of five distinct answers on a strict budget (a firestorm, a lull that stills a warband, a wind at every ally's back, the ground turned weapon, and a shadow's hungry pull), each the size of a spell Lilly has no slot to cast, two of them burning for a full minute while her hands stay free for the cannon. The Sphere bridges the gap between an Artificer and a full caster; it never erases it.</w:t>
+        <w:t>Lilly gives the year to the Sphere, and the Sphere gives it back. It has spent the whole journey quietly pulling loose motes from the air; now she learns to spend what it has gathered. It begins with Aether Ward alone, and as the party clears each elemental rift and installs its pure Mote, the Sphere learns that plane's mighty discharge: five distinct answers on a strict budget, each the size of a spell she has no slot to cast, two of them burning for a full minute while her hands stay free for the cannon.</w:t>
       </w:r>
     </w:p>
     <w:p>
@@ -5834,7 +5774,7 @@
           <w:color w:val="8B2020"/>
           <w:sz w:val="22"/>
         </w:rPr>
-        <w:t>The Awakened Essence Sphere</w:t>
+        <w:t>Aether Channeler</w:t>
       </w:r>
     </w:p>
     <w:p>
@@ -5854,7 +5794,7 @@
           <w:color w:val="222222"/>
           <w:sz w:val="18"/>
         </w:rPr>
-        <w:t>Wondrous Item, Rare (Requires Attunement by Lilly)</w:t>
+        <w:t>Path Feat (chosen in the year apart)</w:t>
       </w:r>
     </w:p>
     <w:p>
@@ -5884,7 +5824,7 @@
           <w:color w:val="222222"/>
           <w:sz w:val="18"/>
         </w:rPr>
-        <w:t xml:space="preserve"> The Sphere's powers share a pool of 2 uses, and you regain all expended uses when you finish a Short Rest. The Sphere starts with the Aether Ward power, and it gains one Elemental Discharge each time a rift's Mote is installed in it. If one of the Sphere's powers requires a saving throw, the DC equals your spell save DC.</w:t>
+        <w:t xml:space="preserve"> You awaken the Essence Sphere you carry. Its powers share a pool of 2 uses, and you regain all expended uses when you finish a Short Rest. You start with the Aether Ward power, and you gain one Elemental Discharge each time a rift's Mote is installed in the Sphere (Ignis, Unda, Aer, Terra, Umbra). If a power requires a saving throw, the DC equals your spell save DC.</w:t>
       </w:r>
     </w:p>
     <w:p>
@@ -5904,7 +5844,7 @@
           <w:color w:val="222222"/>
           <w:sz w:val="18"/>
         </w:rPr>
-        <w:t>Aether Ward (Base Power).</w:t>
+        <w:t>Aether Ward.</w:t>
       </w:r>
       <w:r>
         <w:rPr>
@@ -5914,7 +5854,7 @@
           <w:color w:val="222222"/>
           <w:sz w:val="18"/>
         </w:rPr>
-        <w:t xml:space="preserve"> As a Magic action, you can expend 1 use to release the gathered motes as a protective shell. You and each ally within 15 feet of you gain a number of Temporary Hit Points equal to 2d8 plus your Intelligence modifier.</w:t>
+        <w:t xml:space="preserve"> As a Magic action, expend 1 use to release the gathered motes as a protective shell: you and each ally within 30 feet of you gain Temporary Hit Points equal to 2d8 plus your Intelligence modifier.</w:t>
       </w:r>
     </w:p>
     <w:p>
@@ -5944,7 +5884,7 @@
           <w:color w:val="222222"/>
           <w:sz w:val="18"/>
         </w:rPr>
-        <w:t xml:space="preserve"> A discharge that lasts for 1 minute is sustained by the Sphere and doesn't require Concentration. The Sphere can sustain only one lingering discharge at a time; if you activate a lingering discharge while another is active, the earlier one ends. You can end a lingering discharge early (no action required).</w:t>
+        <w:t xml:space="preserve"> A discharge that lasts 1 minute is sustained by the Sphere and doesn't require Concentration. The Sphere sustains only one lingering discharge at a time; activating another ends the first, and you can end one early (no action required).</w:t>
       </w:r>
     </w:p>
     <w:p>
@@ -5964,7 +5904,7 @@
           <w:color w:val="222222"/>
           <w:sz w:val="18"/>
         </w:rPr>
-        <w:t>Rift Tracker.</w:t>
+        <w:t>Fire / Ignis, Cinderstorm.</w:t>
       </w:r>
       <w:r>
         <w:rPr>
@@ -5974,12 +5914,11 @@
           <w:color w:val="222222"/>
           <w:sz w:val="18"/>
         </w:rPr>
-        <w:t xml:space="preserve"> When a rift's Mote is installed in the Sphere, record it: Ignis, Unda, Aer, Terra, Umbra.</w:t>
+        <w:t xml:space="preserve"> As a Magic action, expend 1 use to unleash a firestorm in a 40-foot-radius Sphere centered on a point within 120 feet of yourself. Each creature there makes a Dexterity saving throw, taking 8d6 Fire damage on a failed save or half as much on a success. Until the start of your next turn the area is Difficult Terrain, and a creature that enters it for the first time on a turn or starts its turn there takes 2d6 Fire damage.</w:t>
       </w:r>
     </w:p>
     <w:p>
       <w:pPr>
-        <w:keepNext/>
         <w:pBdr>
           <w:left w:val="single" w:sz="18" w:space="12" w:color="8B2020"/>
         </w:pBdr>
@@ -5991,10 +5930,21 @@
         <w:rPr>
           <w:rFonts w:ascii="Georgia" w:hAnsi="Georgia" w:cs="Georgia"/>
           <w:b/>
-          <w:color w:val="8B2020"/>
-          <w:sz w:val="22"/>
-        </w:rPr>
-        <w:t>Elemental Discharges</w:t>
+          <w:i w:val="0"/>
+          <w:color w:val="222222"/>
+          <w:sz w:val="18"/>
+        </w:rPr>
+        <w:t>Water / Unda, the Drowning Lull.</w:t>
+      </w:r>
+      <w:r>
+        <w:rPr>
+          <w:rFonts w:ascii="Georgia" w:hAnsi="Georgia" w:cs="Georgia"/>
+          <w:b w:val="0"/>
+          <w:i w:val="0"/>
+          <w:color w:val="222222"/>
+          <w:sz w:val="18"/>
+        </w:rPr>
+        <w:t xml:space="preserve"> As a Magic action, expend 1 use to fill a 20-foot-radius Sphere within 120 feet with the shimmer of deep water. Each creature there must succeed on a Wisdom saving throw or have the Incapacitated condition and a Speed of 0 for 1 minute, standing entranced. It ends early for a creature that takes damage or is shaken awake by an ally's action within 5 feet.</w:t>
       </w:r>
     </w:p>
     <w:p>
@@ -6009,12 +5959,22 @@
       <w:r>
         <w:rPr>
           <w:rFonts w:ascii="Georgia" w:hAnsi="Georgia" w:cs="Georgia"/>
-          <w:b w:val="0"/>
-          <w:i/>
+          <w:b/>
+          <w:i w:val="0"/>
           <w:color w:val="222222"/>
           <w:sz w:val="18"/>
         </w:rPr>
-        <w:t>Each unlocks when its rift is cleared and its Mote installed. The menu grows as the campaign goes.</w:t>
+        <w:t>Air / Aer, Tailwind.</w:t>
+      </w:r>
+      <w:r>
+        <w:rPr>
+          <w:rFonts w:ascii="Georgia" w:hAnsi="Georgia" w:cs="Georgia"/>
+          <w:b w:val="0"/>
+          <w:i w:val="0"/>
+          <w:color w:val="222222"/>
+          <w:sz w:val="18"/>
+        </w:rPr>
+        <w:t xml:space="preserve"> As a Magic action, expend 1 use to send a following wind about your allies. For 1 minute, you and any number of allies within 30 feet of you gain a +2 bonus to attack rolls and saving throws, and your Speeds increase by 10 feet.</w:t>
       </w:r>
     </w:p>
     <w:p>
@@ -6034,7 +5994,7 @@
           <w:color w:val="222222"/>
           <w:sz w:val="18"/>
         </w:rPr>
-        <w:t>Fire / Ignis, Cinderstorm (LOCKED).</w:t>
+        <w:t>Earth / Terra, Tectonic Slam.</w:t>
       </w:r>
       <w:r>
         <w:rPr>
@@ -6044,7 +6004,7 @@
           <w:color w:val="222222"/>
           <w:sz w:val="18"/>
         </w:rPr>
-        <w:t xml:space="preserve"> As a Magic action, you can expend 1 use to unleash a firestorm that fills a 40-foot-radius Sphere centered on a point within 120 feet of yourself. Each creature in the Sphere must make a Dexterity saving throw, taking 8d6 Fire damage on a failed save or half as much damage on a successful one. Until the start of your next turn, the area burns: it is Difficult Terrain, and any creature that enters the area or starts its turn there takes 2d6 Fire damage.</w:t>
+        <w:t xml:space="preserve"> As a Magic action, expend 1 use to erupt the ground in a 20-foot-radius Sphere within 120 feet. Each creature there must succeed on a Dexterity saving throw or take 7d8 Force damage and have the Prone condition. Until the start of your next turn the raised stone is Difficult Terrain, a creature takes 5 Piercing damage for every 5 feet it moves there, and you and your allies have Half Cover while in the area.</w:t>
       </w:r>
     </w:p>
     <w:p>
@@ -6064,7 +6024,7 @@
           <w:color w:val="222222"/>
           <w:sz w:val="18"/>
         </w:rPr>
-        <w:t>Water / Unda, the Drowning Lull (LOCKED).</w:t>
+        <w:t>Shadow / Umbra, Soul Siphon.</w:t>
       </w:r>
       <w:r>
         <w:rPr>
@@ -6074,97 +6034,7 @@
           <w:color w:val="222222"/>
           <w:sz w:val="18"/>
         </w:rPr>
-        <w:t xml:space="preserve"> As a Magic action, you can expend 1 use to fill a 20-foot-radius Sphere centered on a point within 120 feet of yourself with the sound and shimmer of deep water. Each creature in the Sphere must succeed on a Wisdom saving throw or have the Incapacitated condition and a Speed of 0 as it stands entranced, staring into deep water only it can see. The lull lasts for 1 minute. It ends early for a creature that takes damage or if another creature within 5 feet of it takes an action to shake it awake.</w:t>
-      </w:r>
-    </w:p>
-    <w:p>
-      <w:pPr>
-        <w:pBdr>
-          <w:left w:val="single" w:sz="18" w:space="12" w:color="8B2020"/>
-        </w:pBdr>
-        <w:shd w:val="clear" w:color="auto" w:fill="FCF6F6"/>
-        <w:spacing w:before="30" w:after="70"/>
-        <w:ind w:left="340" w:right="340"/>
-      </w:pPr>
-      <w:r>
-        <w:rPr>
-          <w:rFonts w:ascii="Georgia" w:hAnsi="Georgia" w:cs="Georgia"/>
-          <w:b/>
-          <w:i w:val="0"/>
-          <w:color w:val="222222"/>
-          <w:sz w:val="18"/>
-        </w:rPr>
-        <w:t>Air / Aer, Tailwind (LOCKED).</w:t>
-      </w:r>
-      <w:r>
-        <w:rPr>
-          <w:rFonts w:ascii="Georgia" w:hAnsi="Georgia" w:cs="Georgia"/>
-          <w:b w:val="0"/>
-          <w:i w:val="0"/>
-          <w:color w:val="222222"/>
-          <w:sz w:val="18"/>
-        </w:rPr>
-        <w:t xml:space="preserve"> As a Magic action, you can expend 1 use to send a following wind about your allies. For 1 minute, you and any number of allies within 30 feet of you gain a +2 bonus to attack rolls and saving throws, and your Speeds increase by 10 feet.</w:t>
-      </w:r>
-    </w:p>
-    <w:p>
-      <w:pPr>
-        <w:pBdr>
-          <w:left w:val="single" w:sz="18" w:space="12" w:color="8B2020"/>
-        </w:pBdr>
-        <w:shd w:val="clear" w:color="auto" w:fill="FCF6F6"/>
-        <w:spacing w:before="30" w:after="70"/>
-        <w:ind w:left="340" w:right="340"/>
-      </w:pPr>
-      <w:r>
-        <w:rPr>
-          <w:rFonts w:ascii="Georgia" w:hAnsi="Georgia" w:cs="Georgia"/>
-          <w:b/>
-          <w:i w:val="0"/>
-          <w:color w:val="222222"/>
-          <w:sz w:val="18"/>
-        </w:rPr>
-        <w:t>Earth / Terra, Tectonic Slam (LOCKED).</w:t>
-      </w:r>
-      <w:r>
-        <w:rPr>
-          <w:rFonts w:ascii="Georgia" w:hAnsi="Georgia" w:cs="Georgia"/>
-          <w:b w:val="0"/>
-          <w:i w:val="0"/>
-          <w:color w:val="222222"/>
-          <w:sz w:val="18"/>
-        </w:rPr>
-        <w:t xml:space="preserve"> As a Magic action, you can expend 1 use to make the ground erupt in a 20-foot-radius Sphere centered on a point within 120 feet of yourself. Each creature in the Sphere must succeed on a Dexterity saving throw or take 7d8 Force damage and have the Prone condition. Until the start of your next turn, the raised stone makes the area Difficult Terrain, a creature takes 5 Piercing damage for every 5 feet it moves in the area, and you and your allies have Half Cover while in the area.</w:t>
-      </w:r>
-    </w:p>
-    <w:p>
-      <w:pPr>
-        <w:pBdr>
-          <w:left w:val="single" w:sz="18" w:space="12" w:color="8B2020"/>
-        </w:pBdr>
-        <w:shd w:val="clear" w:color="auto" w:fill="FCF6F6"/>
-        <w:spacing w:before="30" w:after="70"/>
-        <w:ind w:left="340" w:right="340"/>
-      </w:pPr>
-      <w:r>
-        <w:rPr>
-          <w:rFonts w:ascii="Georgia" w:hAnsi="Georgia" w:cs="Georgia"/>
-          <w:b/>
-          <w:i w:val="0"/>
-          <w:color w:val="222222"/>
-          <w:sz w:val="18"/>
-        </w:rPr>
-        <w:t>Shadow / Umbra, Soul Siphon (LOCKED).</w:t>
-      </w:r>
-      <w:r>
-        <w:rPr>
-          <w:rFonts w:ascii="Georgia" w:hAnsi="Georgia" w:cs="Georgia"/>
-          <w:b w:val="0"/>
-          <w:i w:val="0"/>
-          <w:color w:val="222222"/>
-          <w:sz w:val="18"/>
-        </w:rPr>
-        <w:t xml:space="preserve"> As a Magic action, you can expend 1 use to target one creature within 60 feet of yourself. The target must make a Constitution saving throw, taking 8d6 Necrotic damage on a failed save or half as much damage on a successful one. You, or one ally within 30 feet of you, regains a number of Hit Points equal to half the Necrotic damage dealt.</w:t>
+        <w:t xml:space="preserve"> As a Magic action, expend 1 use to target one creature within 60 feet. It makes a Constitution saving throw, taking 8d6 Necrotic damage on a failed save or half as much on a success. You, or an ally within 30 feet of you, regains Hit Points equal to half the Necrotic damage dealt.</w:t>
       </w:r>
     </w:p>
     <w:p>
@@ -6179,7 +6049,7 @@
           <w:color w:val="A0522D"/>
           <w:sz w:val="26"/>
         </w:rPr>
-        <w:t>The Sentinel</w:t>
+        <w:t>Sentinel Protocol (the Portal Road)</w:t>
       </w:r>
     </w:p>
     <w:p>
@@ -6200,6 +6070,21 @@
           <w:sz w:val="21"/>
         </w:rPr>
         <w:t>“An upgraded Eldritch Cannon, rebuilt at the bench into a faithful guardian.”</w:t>
+      </w:r>
+    </w:p>
+    <w:p>
+      <w:pPr>
+        <w:spacing w:after="80"/>
+      </w:pPr>
+      <w:r>
+        <w:rPr>
+          <w:rFonts w:ascii="Georgia" w:hAnsi="Georgia" w:cs="Georgia"/>
+          <w:b w:val="0"/>
+          <w:i w:val="0"/>
+          <w:color w:val="222222"/>
+          <w:sz w:val="21"/>
+        </w:rPr>
+        <w:t>On this road Lilly stays in Gearhaven and builds beside Vane, and her Eldritch Cannon grows up. It walks on its own, blasts or shields on her command, and never makes her choose just one mode again.</w:t>
       </w:r>
     </w:p>
     <w:p>
@@ -6282,7 +6167,7 @@
           <w:color w:val="222222"/>
           <w:sz w:val="17"/>
         </w:rPr>
-        <w:t>Medium Construct (the Pocket Dynamo, rebuilt; Requires Attunement by Lilly)</w:t>
+        <w:t>Medium Construct (your Eldritch Cannon, rebuilt; granted by the Sentinel Protocol feat)</w:t>
       </w:r>
     </w:p>
     <w:p>
@@ -6662,7 +6547,7 @@
           <w:color w:val="222222"/>
           <w:sz w:val="18"/>
         </w:rPr>
-        <w:t xml:space="preserve">Duration. </w:t>
+        <w:t xml:space="preserve">Rebuilt Cannon. </w:t>
       </w:r>
       <w:r>
         <w:rPr>
@@ -6672,7 +6557,7 @@
           <w:color w:val="222222"/>
           <w:sz w:val="18"/>
         </w:rPr>
-        <w:t>None. The Sentinel remains until it drops to 0 Hit Points or until you dismiss it (no action required). As a Bonus Action, you can deploy or recall it.</w:t>
+        <w:t>The Sentinel is your Eldritch Cannon in a new form: when you would create your Eldritch Cannon, you can create the Sentinel instead. Anything that improves your cannon still applies to it, the Pocket Dynamo included, so you deploy or recall the Sentinel as a Bonus Action for no spell slot, it has no maximum duration, and its Force Blast and Electric Pulse gain the Dynamo's +2 damage. Casting Mending on the Sentinel restores 2d6 Hit Points; if it drops to 0 Hit Points, you can rebuild it by expending a level 1+ spell slot.</w:t>
       </w:r>
     </w:p>
     <w:p>
@@ -6703,36 +6588,6 @@
           <w:sz w:val="18"/>
         </w:rPr>
         <w:t>Add your Proficiency Bonus to any ability check or saving throw the Sentinel makes.</w:t>
-      </w:r>
-    </w:p>
-    <w:p>
-      <w:pPr>
-        <w:pBdr>
-          <w:left w:val="single" w:sz="18" w:space="12" w:color="8B2020"/>
-        </w:pBdr>
-        <w:shd w:val="clear" w:color="auto" w:fill="FCF6F6"/>
-        <w:spacing w:before="30" w:after="20"/>
-        <w:ind w:left="340" w:right="340"/>
-      </w:pPr>
-      <w:r>
-        <w:rPr>
-          <w:rFonts w:ascii="Georgia" w:hAnsi="Georgia" w:cs="Georgia"/>
-          <w:b/>
-          <w:i/>
-          <w:color w:val="222222"/>
-          <w:sz w:val="18"/>
-        </w:rPr>
-        <w:t xml:space="preserve">Rebuilt Dynamo. </w:t>
-      </w:r>
-      <w:r>
-        <w:rPr>
-          <w:rFonts w:ascii="Georgia" w:hAnsi="Georgia" w:cs="Georgia"/>
-          <w:b w:val="0"/>
-          <w:i w:val="0"/>
-          <w:color w:val="222222"/>
-          <w:sz w:val="18"/>
-        </w:rPr>
-        <w:t>The Sentinel replaces your Eldritch Cannon feature: while you are attuned to it, you deploy the Sentinel instead of a cannon, never both at once. Deploying the Sentinel doesn't expend a spell slot, and the Sentinel has no maximum duration. When the Mending spell is cast on the Sentinel, it regains 2d6 Hit Points. If the Sentinel has dropped to 0 Hit Points, you can rebuild it by expending a level 1+ spell slot.</w:t>
       </w:r>
     </w:p>
     <w:p>
@@ -6793,7 +6648,7 @@
           <w:color w:val="222222"/>
           <w:sz w:val="18"/>
         </w:rPr>
-        <w:t>As a Bonus Action, you can activate the Sentinel, and it then takes one of the following actions of your choice.</w:t>
+        <w:t>As a Bonus Action, you can activate the Sentinel; it moves up to 30 feet and takes one of the following actions of your choice.</w:t>
       </w:r>
     </w:p>
     <w:p>
@@ -6823,7 +6678,7 @@
           <w:color w:val="222222"/>
           <w:sz w:val="18"/>
         </w:rPr>
-        <w:t>Ranged Attack Roll: Bonus equals your spell attack modifier, range 120 ft. Hit: 2d8 + your Intelligence modifier Force damage.</w:t>
+        <w:t>Ranged Attack Roll: your spell attack modifier, range 120 ft. Hit: 2d8 + your Intelligence modifier Force damage (+2 from the Pocket Dynamo while attuned).</w:t>
       </w:r>
     </w:p>
     <w:p>
@@ -6853,7 +6708,7 @@
           <w:color w:val="222222"/>
           <w:sz w:val="18"/>
         </w:rPr>
-        <w:t>Dexterity Saving Throw: DC equals your spell save DC, each creature of your choice within 15 feet of the Sentinel. Failure: 2d8 + your Intelligence modifier Lightning damage, and the target can't take Reactions until the start of your next turn. Success: Half damage.</w:t>
+        <w:t>Dexterity Saving Throw: your spell save DC, each creature of your choice within 15 feet of the Sentinel. Failure: 2d8 + your Intelligence modifier Lightning damage (+2 from the Pocket Dynamo while attuned), and the target can't take Reactions until the start of your next turn. Success: Half damage.</w:t>
       </w:r>
     </w:p>
     <w:p>
@@ -6904,7 +6759,7 @@
           <w:color w:val="222222"/>
           <w:sz w:val="18"/>
         </w:rPr>
-        <w:t xml:space="preserve">Guardian Protocol (1/round). </w:t>
+        <w:t xml:space="preserve">Guardian Protocol (1/Round). </w:t>
       </w:r>
       <w:r>
         <w:rPr>
@@ -6944,7 +6799,7 @@
           <w:color w:val="222222"/>
           <w:sz w:val="21"/>
         </w:rPr>
-        <w:t xml:space="preserve"> The old cannon made Lilly choose a mode; the Sentinel walks on its own 30 feet, then blasts or pulses on her Bonus Action (her pick every time), and shields her friends as a Reaction in the same round. Her old kit lives on inside it: the Force Ballista became the Force Blast, the Storm mode became the Electric Pulse, and the Protector stands watch as Guardian Protocol. The Flamethrower was traded for lightning, Gearhaven's own element. Forged by the masters of Glimmerstone.</w:t>
+        <w:t xml:space="preserve"> The old cannon made Lilly choose a mode; the Sentinel walks on its own 30 feet, then blasts or pulses on her Bonus Action (her pick every time), and shields her friends as a Reaction in the same round. Her old kit lives on inside it: the Force Ballista became the Force Blast, the Storm mode became the Electric Pulse, and the Protector stands watch as Guardian Protocol. The Flamethrower was traded for lightning, Gearhaven's own element. Rebuilt at the bench in Gearhaven, from the masters' own designs.</w:t>
       </w:r>
     </w:p>
     <w:p>

</xml_diff>

<commit_message>
Render the awakened Reader of Omens text into the book
The previous commit changed build_compendium.py but the printed Compendium
still showed the old +1d4 Starseed. Cause: the_compendium.docx is assembled by
build_compendium_full.py, which runs after build_compendium.py in publish.py's
builder list, and I had run only the first one by hand. Running the full
pipeline picks up both.

Awakened Gifts, The Stronger Tide, the 1d8 Starseed note and the 30-ft Guiding
Light are all now in 10_The_Compendium.pdf.

Co-Authored-By: Claude Opus 5 <noreply@anthropic.com>
</commit_message>
<xml_diff>
--- a/compendium/custom_compendium.docx
+++ b/compendium/custom_compendium.docx
@@ -4781,7 +4781,67 @@
           <w:color w:val="222222"/>
           <w:sz w:val="18"/>
         </w:rPr>
-        <w:t xml:space="preserve"> When you take the Reaction granted by your Cosmic Omen feature, you can wait until after the d20 is rolled but before you know whether the roll succeeds or fails. You then choose whether to apply Weal (adding 1d6 to the roll) or Woe (subtracting 1d6 from it).</w:t>
+        <w:t xml:space="preserve"> When you take the Reaction granted by your Cosmic Omen feature, you can wait until after the d20 is rolled but before you know whether the roll succeeds or fails. You then choose whether to apply Weal or Woe.</w:t>
+      </w:r>
+    </w:p>
+    <w:p>
+      <w:pPr>
+        <w:pBdr>
+          <w:left w:val="single" w:sz="18" w:space="12" w:color="8B2020"/>
+        </w:pBdr>
+        <w:shd w:val="clear" w:color="auto" w:fill="FCF6F6"/>
+        <w:spacing w:before="30" w:after="70"/>
+        <w:ind w:left="340" w:right="340"/>
+      </w:pPr>
+      <w:r>
+        <w:rPr>
+          <w:rFonts w:ascii="Georgia" w:hAnsi="Georgia" w:cs="Georgia"/>
+          <w:b/>
+          <w:i w:val="0"/>
+          <w:color w:val="222222"/>
+          <w:sz w:val="18"/>
+        </w:rPr>
+        <w:t>The Stronger Tide.</w:t>
+      </w:r>
+      <w:r>
+        <w:rPr>
+          <w:rFonts w:ascii="Georgia" w:hAnsi="Georgia" w:cs="Georgia"/>
+          <w:b w:val="0"/>
+          <w:i w:val="0"/>
+          <w:color w:val="222222"/>
+          <w:sz w:val="18"/>
+        </w:rPr>
+        <w:t xml:space="preserve"> Your omens run deeper than an ordinary star-reader's. Weal now adds 1d6 + 2 to the roll, and Woe subtracts 1d6 + 2 from it.</w:t>
+      </w:r>
+    </w:p>
+    <w:p>
+      <w:pPr>
+        <w:pBdr>
+          <w:left w:val="single" w:sz="18" w:space="12" w:color="8B2020"/>
+        </w:pBdr>
+        <w:shd w:val="clear" w:color="auto" w:fill="FCF6F6"/>
+        <w:spacing w:before="30" w:after="70"/>
+        <w:ind w:left="340" w:right="340"/>
+      </w:pPr>
+      <w:r>
+        <w:rPr>
+          <w:rFonts w:ascii="Georgia" w:hAnsi="Georgia" w:cs="Georgia"/>
+          <w:b/>
+          <w:i w:val="0"/>
+          <w:color w:val="222222"/>
+          <w:sz w:val="18"/>
+        </w:rPr>
+        <w:t>Awakened Gifts.</w:t>
+      </w:r>
+      <w:r>
+        <w:rPr>
+          <w:rFonts w:ascii="Georgia" w:hAnsi="Georgia" w:cs="Georgia"/>
+          <w:b w:val="0"/>
+          <w:i w:val="0"/>
+          <w:color w:val="222222"/>
+          <w:sz w:val="18"/>
+        </w:rPr>
+        <w:t xml:space="preserve"> The road east wakes what you already carry. Your Staff of Waking Constellations becomes a +2 quarterstaff and its Starseed rises from 1d4 to 1d8; your Amulet of Guiding Light sheds its bonus to every ally within 30 feet of you rather than only to those standing in its light.</w:t>
       </w:r>
     </w:p>
     <w:p>

</xml_diff>

<commit_message>
Discharge rebalance: Cinderstorm's footprint, Tailwind's lane, Slam's save
Three DM-ruled trims (2026-08-18) after Lilly read as overperforming the
group. Cinderstorm drops 40-ft radius to 20-ft: at 40 it covered four times
Fireball's area for Fireball's damage. Tailwind loses the party-wide +2 to
attack rolls and saves (the strongest buff category in the game, with no
concentration and no target cap, on a road that already covers artillery and
temp HP) and becomes pure Air mobility: +10 Speed, Dash as a Bonus Action,
no Opportunity Attacks, which keeps buffing in Ursa's lane. Tectonic Slam
joins the family convention its siblings already used, half damage on a
successful save and Prone only on a failure, with dice trimmed 7d8 to 6d8 so
it gets more reliable without getting bigger. Session 8's read-off-the-sheet
note and Lilly's kit follow.

Co-Authored-By: Claude Fable 5 <noreply@anthropic.com>
</commit_message>
<xml_diff>
--- a/compendium/custom_compendium.docx
+++ b/compendium/custom_compendium.docx
@@ -307,6 +307,7 @@
           </w:tcPr>
           <w:p>
             <w:pPr>
+              <w:keepNext/>
               <w:jc w:val="center"/>
             </w:pPr>
             <w:r>
@@ -351,6 +352,7 @@
           </w:tcPr>
           <w:p>
             <w:pPr>
+              <w:keepNext/>
               <w:jc w:val="center"/>
             </w:pPr>
             <w:r>
@@ -395,6 +397,7 @@
           </w:tcPr>
           <w:p>
             <w:pPr>
+              <w:keepNext/>
               <w:jc w:val="center"/>
             </w:pPr>
             <w:r>
@@ -441,6 +444,7 @@
           </w:tcPr>
           <w:p>
             <w:pPr>
+              <w:ind w:left="160" w:right="160"/>
               <w:jc w:val="center"/>
             </w:pPr>
             <w:r>
@@ -460,6 +464,7 @@
           </w:tcPr>
           <w:p>
             <w:pPr>
+              <w:ind w:left="160" w:right="160"/>
               <w:jc w:val="center"/>
             </w:pPr>
             <w:r>
@@ -479,6 +484,7 @@
           </w:tcPr>
           <w:p>
             <w:pPr>
+              <w:ind w:left="160" w:right="160"/>
               <w:jc w:val="center"/>
             </w:pPr>
             <w:r>
@@ -590,7 +596,7 @@
     </w:p>
     <w:p>
       <w:pPr>
-        <w:spacing w:after="140"/>
+        <w:spacing w:after="240"/>
         <w:jc w:val="center"/>
       </w:pPr>
       <w:r>
@@ -2426,7 +2432,7 @@
     </w:p>
     <w:p>
       <w:pPr>
-        <w:spacing w:after="140"/>
+        <w:spacing w:after="240"/>
         <w:jc w:val="center"/>
       </w:pPr>
       <w:r>
@@ -2864,6 +2870,7 @@
           </w:tcPr>
           <w:p>
             <w:pPr>
+              <w:keepNext/>
               <w:jc w:val="center"/>
             </w:pPr>
             <w:r>
@@ -2908,6 +2915,7 @@
           </w:tcPr>
           <w:p>
             <w:pPr>
+              <w:keepNext/>
               <w:jc w:val="center"/>
             </w:pPr>
             <w:r>
@@ -2952,6 +2960,7 @@
           </w:tcPr>
           <w:p>
             <w:pPr>
+              <w:keepNext/>
               <w:jc w:val="center"/>
             </w:pPr>
             <w:r>
@@ -2998,6 +3007,7 @@
           </w:tcPr>
           <w:p>
             <w:pPr>
+              <w:ind w:left="160" w:right="160"/>
               <w:jc w:val="center"/>
             </w:pPr>
             <w:r>
@@ -3017,6 +3027,7 @@
           </w:tcPr>
           <w:p>
             <w:pPr>
+              <w:ind w:left="160" w:right="160"/>
               <w:jc w:val="center"/>
             </w:pPr>
             <w:r>
@@ -3036,6 +3047,7 @@
           </w:tcPr>
           <w:p>
             <w:pPr>
+              <w:ind w:left="160" w:right="160"/>
               <w:jc w:val="center"/>
             </w:pPr>
             <w:r>
@@ -4220,7 +4232,7 @@
     </w:p>
     <w:p>
       <w:pPr>
-        <w:spacing w:after="140"/>
+        <w:spacing w:after="240"/>
         <w:jc w:val="center"/>
       </w:pPr>
       <w:r>
@@ -4621,7 +4633,7 @@
     </w:p>
     <w:p>
       <w:pPr>
-        <w:spacing w:after="140"/>
+        <w:spacing w:after="240"/>
         <w:jc w:val="center"/>
       </w:pPr>
       <w:r>
@@ -5512,7 +5524,7 @@
     </w:p>
     <w:p>
       <w:pPr>
-        <w:spacing w:after="140"/>
+        <w:spacing w:after="240"/>
         <w:jc w:val="center"/>
       </w:pPr>
       <w:r>
@@ -5974,7 +5986,7 @@
           <w:color w:val="222222"/>
           <w:sz w:val="18"/>
         </w:rPr>
-        <w:t xml:space="preserve"> As a Magic action, expend 1 use to unleash a firestorm in a 40-foot-radius Sphere centered on a point within 120 feet of yourself. Each creature there makes a Dexterity saving throw, taking 8d6 Fire damage on a failed save or half as much on a success. Until the start of your next turn the area is Difficult Terrain, and a creature that enters it for the first time on a turn or starts its turn there takes 2d6 Fire damage.</w:t>
+        <w:t xml:space="preserve"> As a Magic action, expend 1 use to unleash a firestorm in a 20-foot-radius Sphere centered on a point within 120 feet of yourself. Each creature there makes a Dexterity saving throw, taking 8d6 Fire damage on a failed save or half as much on a success. Until the start of your next turn the area is Difficult Terrain, and a creature that enters it for the first time on a turn or starts its turn there takes 2d6 Fire damage.</w:t>
       </w:r>
     </w:p>
     <w:p>
@@ -6034,7 +6046,7 @@
           <w:color w:val="222222"/>
           <w:sz w:val="18"/>
         </w:rPr>
-        <w:t xml:space="preserve"> As a Magic action, expend 1 use to send a following wind about your allies. For 1 minute, you and any number of allies within 30 feet of you gain a +2 bonus to attack rolls and saving throws, and your Speeds increase by 10 feet.</w:t>
+        <w:t xml:space="preserve"> As a Magic action, expend 1 use to send a following wind about your allies. For 1 minute, you and each ally within 30 feet of you have their Speed increased by 10 feet, can take the Dash action as a Bonus Action, and don't provoke Opportunity Attacks.</w:t>
       </w:r>
     </w:p>
     <w:p>
@@ -6064,7 +6076,7 @@
           <w:color w:val="222222"/>
           <w:sz w:val="18"/>
         </w:rPr>
-        <w:t xml:space="preserve"> As a Magic action, expend 1 use to erupt the ground in a 20-foot-radius Sphere within 120 feet. Each creature there must succeed on a Dexterity saving throw or take 7d8 Force damage and have the Prone condition. Until the start of your next turn the raised stone is Difficult Terrain, a creature takes 5 Piercing damage for every 5 feet it moves there, and you and your allies have Half Cover while in the area.</w:t>
+        <w:t xml:space="preserve"> As a Magic action, expend 1 use to erupt the ground in a 20-foot-radius Sphere within 120 feet. Each creature there makes a Dexterity saving throw, taking 27 (6d8) Force damage and gaining the Prone condition on a failed save, or half as much damage and no Prone on a successful one. Until the start of your next turn the raised stone is Difficult Terrain, a creature takes 5 Piercing damage for every 5 feet it moves there, and you and your allies have Half Cover while in the area.</w:t>
       </w:r>
     </w:p>
     <w:p>
@@ -7135,7 +7147,7 @@
     </w:p>
     <w:p>
       <w:pPr>
-        <w:spacing w:after="140"/>
+        <w:spacing w:after="240"/>
         <w:jc w:val="center"/>
       </w:pPr>
       <w:r>

</xml_diff>

<commit_message>
Boomstick was not a gift: Lilly and Poots built it together
Canon already carried the DM ruling; the documents had not caught up and
still framed the gun as a parcel arriving postmarked Glimmerspire. Session 8
now shows the making inside Lilly's own tale, right after the unsatisfying
conversation: eleven evenings at the kitchen-table forge, Poots teaching and
correcting and finally just watching, a week lost to an argument about the
drum spring, and the line that ended the year, "Now you do not need me to
make you anything, ever again." The Compendium section is retitled Built at
Her Mother's Bench and its opening rewritten to match, the volume's own
intro no longer calls it a parting gift, and her sheet and kit both say she
built it.

Co-Authored-By: Claude Fable 5 <noreply@anthropic.com>
</commit_message>
<xml_diff>
--- a/compendium/custom_compendium.docx
+++ b/compendium/custom_compendium.docx
@@ -5227,7 +5227,7 @@
           <w:color w:val="222222"/>
           <w:sz w:val="21"/>
         </w:rPr>
-        <w:t>One weapon and one mastery, forged for Lilly Glimmergear in the year apart. Wherever her road leads, Poots's parting work finds her: Boomstick, the sidearm no Level 7 Artillerist walks into the rifts without. On top of the gun, the year teaches her a single mastery of three: stay and build the portal (Sentinel Protocol), go home to Glimmerspire and Poots (Stormgunner), or give the year to mote research (Aether Channeler). The mastery is hers, learned into hand and mind, not an item on her belt, so her attunements stay free for the Pocket Dynamo and whatever the rifts yield. The Frostbite Shard retires to her belt, a keepsake and one day a gift.</w:t>
+        <w:t>One weapon and one mastery, forged for Lilly Glimmergear in the year apart. Wherever her road leads she carries the work of her own hands: Boomstick, built at her mother's bench, the sidearm no Level 7 Artillerist walks into the rifts without. On top of the gun, the year teaches her a single mastery of three: stay and build the portal (Sentinel Protocol), go home to Glimmerspire and Poots (Stormgunner), or give the year to mote research (Aether Channeler). The mastery is hers, learned into hand and mind, not an item on her belt, so her attunements stay free for the Pocket Dynamo and whatever the rifts yield. The Frostbite Shard retires to her belt, a keepsake and one day a gift.</w:t>
       </w:r>
     </w:p>
     <w:p>
@@ -5242,7 +5242,7 @@
           <w:color w:val="A0522D"/>
           <w:sz w:val="26"/>
         </w:rPr>
-        <w:t>Boomstick, Poots's Parting Work</w:t>
+        <w:t>Boomstick, Built at Her Mother's Bench</w:t>
       </w:r>
     </w:p>
     <w:p>
@@ -5323,7 +5323,7 @@
           <w:color w:val="222222"/>
           <w:sz w:val="21"/>
         </w:rPr>
-        <w:t>Whichever road Lilly walks, a parcel finds her, wrapped in waxed paper and string, postmarked Glimmerspire. Boomstick becomes her spellcasting focus and her designated Arcane Firearm (an artificer designates only one). With her shield in the other hand, her hands are exactly full: pistol, shield, and nothing wasted. Its clockwork drum conjures its own rounds, so Lilly will never want for ammunition again.</w:t>
+        <w:t>Nobody gave Lilly this gun. She built it in Deepforge Hollow over eleven evenings at her mother's kitchen-table forge, with Poots teaching and correcting and finally just watching, and the two of them argued about the drum spring for a week. Her hands are on every part of it. Boomstick becomes her spellcasting focus and her designated Arcane Firearm (an artificer designates only one). With her shield in the other hand, her hands are exactly full: pistol, shield, and nothing wasted. Its clockwork drum conjures its own rounds, so Lilly will never want for ammunition again.</w:t>
       </w:r>
     </w:p>
     <w:p>

</xml_diff>